<commit_message>
docs: add comprehensive LCC (Leaf Color Combination & Leaf Color Chart) feasibility section to docx and markdown guides
</commit_message>
<xml_diff>
--- a/AgriVision_Plant_Disease_Detection_Guide.docx
+++ b/AgriVision_Plant_Disease_Detection_Guide.docx
@@ -23,9 +23,9 @@
         <w:rPr>
           <w:i/>
           <w:color w:val="2E7D32"/>
-          <w:sz w:val="24"/>
+          <w:sz w:val="23"/>
         </w:rPr>
-        <w:t>Deep Learning Vision Architecture, 3 Crop Specifications, All Hyperparameters &amp; Code Instructions</w:t>
+        <w:t>Deep Learning Vision Architecture, 3 Crop Specifications, Parameters, LCC Analysis &amp; Code Instructions</w:t>
       </w:r>
     </w:p>
     <w:p>
@@ -72,7 +72,7 @@
             </w:r>
             <w:r>
               <w:rPr>
-                <w:sz w:val="20"/>
+                <w:sz w:val="19"/>
               </w:rPr>
               <w:t>• Model Type: Convolutional Neural Network (Transfer Learning with MobileNetV2 pre-trained on ImageNet).</w:t>
               <w:br/>
@@ -83,6 +83,8 @@
               <w:t>• Desktop / Web Engine: FastAPI full-stack portal with CLAHE contrast enhancement, Grad-CAM explainability, and LangGraph agent.</w:t>
               <w:br/>
               <w:t>• Guardrail Protection: Rejects human skin, non-plants, and blank backgrounds using YCbCr color spaces and Laplacian texture variance.</w:t>
+              <w:br/>
+              <w:t>• LCC (Leaf Color Combination) Analysis: Evaluated as a Two-Tier Hybrid: used for Damage Severity % and Nitrogen/Fertilizer guidance, while MobileNetV2 handles pathogen disease classification.</w:t>
             </w:r>
           </w:p>
         </w:tc>
@@ -133,7 +135,7 @@
               <w:rPr>
                 <w:b/>
                 <w:color w:val="FFFFFF"/>
-                <w:sz w:val="20"/>
+                <w:sz w:val="19"/>
               </w:rPr>
               <w:t>Library / Technology</w:t>
             </w:r>
@@ -155,7 +157,7 @@
               <w:rPr>
                 <w:b/>
                 <w:color w:val="FFFFFF"/>
-                <w:sz w:val="20"/>
+                <w:sz w:val="19"/>
               </w:rPr>
               <w:t>Category</w:t>
             </w:r>
@@ -177,7 +179,7 @@
               <w:rPr>
                 <w:b/>
                 <w:color w:val="FFFFFF"/>
-                <w:sz w:val="20"/>
+                <w:sz w:val="19"/>
               </w:rPr>
               <w:t>Exact Purpose in AgriVision</w:t>
             </w:r>
@@ -190,17 +192,17 @@
             <w:tcW w:type="dxa" w:w="3360"/>
             <w:shd w:fill="FFFFFF"/>
             <w:tcMar>
-              <w:top w:w="80" w:type="dxa"/>
-              <w:bottom w:w="80" w:type="dxa"/>
-              <w:left w:w="100" w:type="dxa"/>
-              <w:right w:w="100" w:type="dxa"/>
+              <w:top w:w="70" w:type="dxa"/>
+              <w:bottom w:w="70" w:type="dxa"/>
+              <w:left w:w="90" w:type="dxa"/>
+              <w:right w:w="90" w:type="dxa"/>
             </w:tcMar>
           </w:tcPr>
           <w:p>
             <w:r>
               <w:rPr>
                 <w:b/>
-                <w:sz w:val="19"/>
+                <w:sz w:val="18"/>
               </w:rPr>
               <w:t>TensorFlow &amp; Keras (v2.x)</w:t>
             </w:r>
@@ -211,16 +213,16 @@
             <w:tcW w:type="dxa" w:w="3360"/>
             <w:shd w:fill="FFFFFF"/>
             <w:tcMar>
-              <w:top w:w="80" w:type="dxa"/>
-              <w:bottom w:w="80" w:type="dxa"/>
-              <w:left w:w="100" w:type="dxa"/>
-              <w:right w:w="100" w:type="dxa"/>
+              <w:top w:w="70" w:type="dxa"/>
+              <w:bottom w:w="70" w:type="dxa"/>
+              <w:left w:w="90" w:type="dxa"/>
+              <w:right w:w="90" w:type="dxa"/>
             </w:tcMar>
           </w:tcPr>
           <w:p>
             <w:r>
               <w:rPr>
-                <w:sz w:val="19"/>
+                <w:sz w:val="18"/>
               </w:rPr>
               <w:t>Deep Learning Core</w:t>
             </w:r>
@@ -231,16 +233,16 @@
             <w:tcW w:type="dxa" w:w="3360"/>
             <w:shd w:fill="FFFFFF"/>
             <w:tcMar>
-              <w:top w:w="80" w:type="dxa"/>
-              <w:bottom w:w="80" w:type="dxa"/>
-              <w:left w:w="100" w:type="dxa"/>
-              <w:right w:w="100" w:type="dxa"/>
+              <w:top w:w="70" w:type="dxa"/>
+              <w:bottom w:w="70" w:type="dxa"/>
+              <w:left w:w="90" w:type="dxa"/>
+              <w:right w:w="90" w:type="dxa"/>
             </w:tcMar>
           </w:tcPr>
           <w:p>
             <w:r>
               <w:rPr>
-                <w:sz w:val="19"/>
+                <w:sz w:val="18"/>
               </w:rPr>
               <w:t>Constructs the MobileNetV2 CNN, trains the custom 15-class classification head, handles categorical cross-entropy loss, and exports .keras and .tflite formats.</w:t>
             </w:r>
@@ -253,17 +255,17 @@
             <w:tcW w:type="dxa" w:w="3360"/>
             <w:shd w:fill="F9FBF9"/>
             <w:tcMar>
-              <w:top w:w="80" w:type="dxa"/>
-              <w:bottom w:w="80" w:type="dxa"/>
-              <w:left w:w="100" w:type="dxa"/>
-              <w:right w:w="100" w:type="dxa"/>
+              <w:top w:w="70" w:type="dxa"/>
+              <w:bottom w:w="70" w:type="dxa"/>
+              <w:left w:w="90" w:type="dxa"/>
+              <w:right w:w="90" w:type="dxa"/>
             </w:tcMar>
           </w:tcPr>
           <w:p>
             <w:r>
               <w:rPr>
                 <w:b/>
-                <w:sz w:val="19"/>
+                <w:sz w:val="18"/>
               </w:rPr>
               <w:t>OpenCV (cv2)</w:t>
             </w:r>
@@ -274,16 +276,16 @@
             <w:tcW w:type="dxa" w:w="3360"/>
             <w:shd w:fill="F9FBF9"/>
             <w:tcMar>
-              <w:top w:w="80" w:type="dxa"/>
-              <w:bottom w:w="80" w:type="dxa"/>
-              <w:left w:w="100" w:type="dxa"/>
-              <w:right w:w="100" w:type="dxa"/>
+              <w:top w:w="70" w:type="dxa"/>
+              <w:bottom w:w="70" w:type="dxa"/>
+              <w:left w:w="90" w:type="dxa"/>
+              <w:right w:w="90" w:type="dxa"/>
             </w:tcMar>
           </w:tcPr>
           <w:p>
             <w:r>
               <w:rPr>
-                <w:sz w:val="19"/>
+                <w:sz w:val="18"/>
               </w:rPr>
               <w:t>Computer Vision</w:t>
             </w:r>
@@ -294,16 +296,16 @@
             <w:tcW w:type="dxa" w:w="3360"/>
             <w:shd w:fill="F9FBF9"/>
             <w:tcMar>
-              <w:top w:w="80" w:type="dxa"/>
-              <w:bottom w:w="80" w:type="dxa"/>
-              <w:left w:w="100" w:type="dxa"/>
-              <w:right w:w="100" w:type="dxa"/>
+              <w:top w:w="70" w:type="dxa"/>
+              <w:bottom w:w="70" w:type="dxa"/>
+              <w:left w:w="90" w:type="dxa"/>
+              <w:right w:w="90" w:type="dxa"/>
             </w:tcMar>
           </w:tcPr>
           <w:p>
             <w:r>
               <w:rPr>
-                <w:sz w:val="19"/>
+                <w:sz w:val="18"/>
               </w:rPr>
               <w:t>Applies CLAHE (Contrast Limited Adaptive Histogram Equalization) on LAB color space, calculates Laplacian edge variance, generates Grad-CAM heatmaps, and segments leaf area.</w:t>
             </w:r>
@@ -316,17 +318,17 @@
             <w:tcW w:type="dxa" w:w="3360"/>
             <w:shd w:fill="FFFFFF"/>
             <w:tcMar>
-              <w:top w:w="80" w:type="dxa"/>
-              <w:bottom w:w="80" w:type="dxa"/>
-              <w:left w:w="100" w:type="dxa"/>
-              <w:right w:w="100" w:type="dxa"/>
+              <w:top w:w="70" w:type="dxa"/>
+              <w:bottom w:w="70" w:type="dxa"/>
+              <w:left w:w="90" w:type="dxa"/>
+              <w:right w:w="90" w:type="dxa"/>
             </w:tcMar>
           </w:tcPr>
           <w:p>
             <w:r>
               <w:rPr>
                 <w:b/>
-                <w:sz w:val="19"/>
+                <w:sz w:val="18"/>
               </w:rPr>
               <w:t>Pillow (PIL)</w:t>
             </w:r>
@@ -337,16 +339,16 @@
             <w:tcW w:type="dxa" w:w="3360"/>
             <w:shd w:fill="FFFFFF"/>
             <w:tcMar>
-              <w:top w:w="80" w:type="dxa"/>
-              <w:bottom w:w="80" w:type="dxa"/>
-              <w:left w:w="100" w:type="dxa"/>
-              <w:right w:w="100" w:type="dxa"/>
+              <w:top w:w="70" w:type="dxa"/>
+              <w:bottom w:w="70" w:type="dxa"/>
+              <w:left w:w="90" w:type="dxa"/>
+              <w:right w:w="90" w:type="dxa"/>
             </w:tcMar>
           </w:tcPr>
           <w:p>
             <w:r>
               <w:rPr>
-                <w:sz w:val="19"/>
+                <w:sz w:val="18"/>
               </w:rPr>
               <w:t>Image Processing</w:t>
             </w:r>
@@ -357,16 +359,16 @@
             <w:tcW w:type="dxa" w:w="3360"/>
             <w:shd w:fill="FFFFFF"/>
             <w:tcMar>
-              <w:top w:w="80" w:type="dxa"/>
-              <w:bottom w:w="80" w:type="dxa"/>
-              <w:left w:w="100" w:type="dxa"/>
-              <w:right w:w="100" w:type="dxa"/>
+              <w:top w:w="70" w:type="dxa"/>
+              <w:bottom w:w="70" w:type="dxa"/>
+              <w:left w:w="90" w:type="dxa"/>
+              <w:right w:w="90" w:type="dxa"/>
             </w:tcMar>
           </w:tcPr>
           <w:p>
             <w:r>
               <w:rPr>
-                <w:sz w:val="19"/>
+                <w:sz w:val="18"/>
               </w:rPr>
               <w:t>Loads image files, ensures RGB 3-channel mode, performs Lanczos high-fidelity resizing to 224x224, and handles image buffer serialization.</w:t>
             </w:r>
@@ -379,17 +381,17 @@
             <w:tcW w:type="dxa" w:w="3360"/>
             <w:shd w:fill="F9FBF9"/>
             <w:tcMar>
-              <w:top w:w="80" w:type="dxa"/>
-              <w:bottom w:w="80" w:type="dxa"/>
-              <w:left w:w="100" w:type="dxa"/>
-              <w:right w:w="100" w:type="dxa"/>
+              <w:top w:w="70" w:type="dxa"/>
+              <w:bottom w:w="70" w:type="dxa"/>
+              <w:left w:w="90" w:type="dxa"/>
+              <w:right w:w="90" w:type="dxa"/>
             </w:tcMar>
           </w:tcPr>
           <w:p>
             <w:r>
               <w:rPr>
                 <w:b/>
-                <w:sz w:val="19"/>
+                <w:sz w:val="18"/>
               </w:rPr>
               <w:t>NumPy</w:t>
             </w:r>
@@ -400,16 +402,16 @@
             <w:tcW w:type="dxa" w:w="3360"/>
             <w:shd w:fill="F9FBF9"/>
             <w:tcMar>
-              <w:top w:w="80" w:type="dxa"/>
-              <w:bottom w:w="80" w:type="dxa"/>
-              <w:left w:w="100" w:type="dxa"/>
-              <w:right w:w="100" w:type="dxa"/>
+              <w:top w:w="70" w:type="dxa"/>
+              <w:bottom w:w="70" w:type="dxa"/>
+              <w:left w:w="90" w:type="dxa"/>
+              <w:right w:w="90" w:type="dxa"/>
             </w:tcMar>
           </w:tcPr>
           <w:p>
             <w:r>
               <w:rPr>
-                <w:sz w:val="19"/>
+                <w:sz w:val="18"/>
               </w:rPr>
               <w:t>Numerical Operations</w:t>
             </w:r>
@@ -420,16 +422,16 @@
             <w:tcW w:type="dxa" w:w="3360"/>
             <w:shd w:fill="F9FBF9"/>
             <w:tcMar>
-              <w:top w:w="80" w:type="dxa"/>
-              <w:bottom w:w="80" w:type="dxa"/>
-              <w:left w:w="100" w:type="dxa"/>
-              <w:right w:w="100" w:type="dxa"/>
+              <w:top w:w="70" w:type="dxa"/>
+              <w:bottom w:w="70" w:type="dxa"/>
+              <w:left w:w="90" w:type="dxa"/>
+              <w:right w:w="90" w:type="dxa"/>
             </w:tcMar>
           </w:tcPr>
           <w:p>
             <w:r>
               <w:rPr>
-                <w:sz w:val="19"/>
+                <w:sz w:val="18"/>
               </w:rPr>
               <w:t>Executes multidimensional tensor transformations, MobileNet normalization ([-1.0, 1.0]), GLI (Green Leaf Index) math, and Softmax probability sorting.</w:t>
             </w:r>
@@ -442,17 +444,17 @@
             <w:tcW w:type="dxa" w:w="3360"/>
             <w:shd w:fill="FFFFFF"/>
             <w:tcMar>
-              <w:top w:w="80" w:type="dxa"/>
-              <w:bottom w:w="80" w:type="dxa"/>
-              <w:left w:w="100" w:type="dxa"/>
-              <w:right w:w="100" w:type="dxa"/>
+              <w:top w:w="70" w:type="dxa"/>
+              <w:bottom w:w="70" w:type="dxa"/>
+              <w:left w:w="90" w:type="dxa"/>
+              <w:right w:w="90" w:type="dxa"/>
             </w:tcMar>
           </w:tcPr>
           <w:p>
             <w:r>
               <w:rPr>
                 <w:b/>
-                <w:sz w:val="19"/>
+                <w:sz w:val="18"/>
               </w:rPr>
               <w:t>FastAPI &amp; Uvicorn</w:t>
             </w:r>
@@ -463,16 +465,16 @@
             <w:tcW w:type="dxa" w:w="3360"/>
             <w:shd w:fill="FFFFFF"/>
             <w:tcMar>
-              <w:top w:w="80" w:type="dxa"/>
-              <w:bottom w:w="80" w:type="dxa"/>
-              <w:left w:w="100" w:type="dxa"/>
-              <w:right w:w="100" w:type="dxa"/>
+              <w:top w:w="70" w:type="dxa"/>
+              <w:bottom w:w="70" w:type="dxa"/>
+              <w:left w:w="90" w:type="dxa"/>
+              <w:right w:w="90" w:type="dxa"/>
             </w:tcMar>
           </w:tcPr>
           <w:p>
             <w:r>
               <w:rPr>
-                <w:sz w:val="19"/>
+                <w:sz w:val="18"/>
               </w:rPr>
               <w:t>Full-Stack Web Server</w:t>
             </w:r>
@@ -483,16 +485,16 @@
             <w:tcW w:type="dxa" w:w="3360"/>
             <w:shd w:fill="FFFFFF"/>
             <w:tcMar>
-              <w:top w:w="80" w:type="dxa"/>
-              <w:bottom w:w="80" w:type="dxa"/>
-              <w:left w:w="100" w:type="dxa"/>
-              <w:right w:w="100" w:type="dxa"/>
+              <w:top w:w="70" w:type="dxa"/>
+              <w:bottom w:w="70" w:type="dxa"/>
+              <w:left w:w="90" w:type="dxa"/>
+              <w:right w:w="90" w:type="dxa"/>
             </w:tcMar>
           </w:tcPr>
           <w:p>
             <w:r>
               <w:rPr>
-                <w:sz w:val="19"/>
+                <w:sz w:val="18"/>
               </w:rPr>
               <w:t>Asynchronous Python web server hosting the desktop UI at http://127.0.0.1:8000, multi-threaded inference APIs, and SQLite scan history.</w:t>
             </w:r>
@@ -505,17 +507,17 @@
             <w:tcW w:type="dxa" w:w="3360"/>
             <w:shd w:fill="F9FBF9"/>
             <w:tcMar>
-              <w:top w:w="80" w:type="dxa"/>
-              <w:bottom w:w="80" w:type="dxa"/>
-              <w:left w:w="100" w:type="dxa"/>
-              <w:right w:w="100" w:type="dxa"/>
+              <w:top w:w="70" w:type="dxa"/>
+              <w:bottom w:w="70" w:type="dxa"/>
+              <w:left w:w="90" w:type="dxa"/>
+              <w:right w:w="90" w:type="dxa"/>
             </w:tcMar>
           </w:tcPr>
           <w:p>
             <w:r>
               <w:rPr>
                 <w:b/>
-                <w:sz w:val="19"/>
+                <w:sz w:val="18"/>
               </w:rPr>
               <w:t>LangGraph &amp; Groq LLM</w:t>
             </w:r>
@@ -526,16 +528,16 @@
             <w:tcW w:type="dxa" w:w="3360"/>
             <w:shd w:fill="F9FBF9"/>
             <w:tcMar>
-              <w:top w:w="80" w:type="dxa"/>
-              <w:bottom w:w="80" w:type="dxa"/>
-              <w:left w:w="100" w:type="dxa"/>
-              <w:right w:w="100" w:type="dxa"/>
+              <w:top w:w="70" w:type="dxa"/>
+              <w:bottom w:w="70" w:type="dxa"/>
+              <w:left w:w="90" w:type="dxa"/>
+              <w:right w:w="90" w:type="dxa"/>
             </w:tcMar>
           </w:tcPr>
           <w:p>
             <w:r>
               <w:rPr>
-                <w:sz w:val="19"/>
+                <w:sz w:val="18"/>
               </w:rPr>
               <w:t>Agentic Agronomic AI</w:t>
             </w:r>
@@ -546,16 +548,16 @@
             <w:tcW w:type="dxa" w:w="3360"/>
             <w:shd w:fill="F9FBF9"/>
             <w:tcMar>
-              <w:top w:w="80" w:type="dxa"/>
-              <w:bottom w:w="80" w:type="dxa"/>
-              <w:left w:w="100" w:type="dxa"/>
-              <w:right w:w="100" w:type="dxa"/>
+              <w:top w:w="70" w:type="dxa"/>
+              <w:bottom w:w="70" w:type="dxa"/>
+              <w:left w:w="90" w:type="dxa"/>
+              <w:right w:w="90" w:type="dxa"/>
             </w:tcMar>
           </w:tcPr>
           <w:p>
             <w:r>
               <w:rPr>
-                <w:sz w:val="19"/>
+                <w:sz w:val="18"/>
               </w:rPr>
               <w:t>Autonomous multi-node reasoning graph that generates pesticide sprays, dosage warnings, and farmer advisories based on diagnosed disease and weather.</w:t>
             </w:r>
@@ -568,17 +570,17 @@
             <w:tcW w:type="dxa" w:w="3360"/>
             <w:shd w:fill="FFFFFF"/>
             <w:tcMar>
-              <w:top w:w="80" w:type="dxa"/>
-              <w:bottom w:w="80" w:type="dxa"/>
-              <w:left w:w="100" w:type="dxa"/>
-              <w:right w:w="100" w:type="dxa"/>
+              <w:top w:w="70" w:type="dxa"/>
+              <w:bottom w:w="70" w:type="dxa"/>
+              <w:left w:w="90" w:type="dxa"/>
+              <w:right w:w="90" w:type="dxa"/>
             </w:tcMar>
           </w:tcPr>
           <w:p>
             <w:r>
               <w:rPr>
                 <w:b/>
-                <w:sz w:val="19"/>
+                <w:sz w:val="18"/>
               </w:rPr>
               <w:t>FAISS &amp; Sentence-Transformers</w:t>
             </w:r>
@@ -589,16 +591,16 @@
             <w:tcW w:type="dxa" w:w="3360"/>
             <w:shd w:fill="FFFFFF"/>
             <w:tcMar>
-              <w:top w:w="80" w:type="dxa"/>
-              <w:bottom w:w="80" w:type="dxa"/>
-              <w:left w:w="100" w:type="dxa"/>
-              <w:right w:w="100" w:type="dxa"/>
+              <w:top w:w="70" w:type="dxa"/>
+              <w:bottom w:w="70" w:type="dxa"/>
+              <w:left w:w="90" w:type="dxa"/>
+              <w:right w:w="90" w:type="dxa"/>
             </w:tcMar>
           </w:tcPr>
           <w:p>
             <w:r>
               <w:rPr>
-                <w:sz w:val="19"/>
+                <w:sz w:val="18"/>
               </w:rPr>
               <w:t>RAG Vector DB</w:t>
             </w:r>
@@ -609,16 +611,16 @@
             <w:tcW w:type="dxa" w:w="3360"/>
             <w:shd w:fill="FFFFFF"/>
             <w:tcMar>
-              <w:top w:w="80" w:type="dxa"/>
-              <w:bottom w:w="80" w:type="dxa"/>
-              <w:left w:w="100" w:type="dxa"/>
-              <w:right w:w="100" w:type="dxa"/>
+              <w:top w:w="70" w:type="dxa"/>
+              <w:bottom w:w="70" w:type="dxa"/>
+              <w:left w:w="90" w:type="dxa"/>
+              <w:right w:w="90" w:type="dxa"/>
             </w:tcMar>
           </w:tcPr>
           <w:p>
             <w:r>
               <w:rPr>
-                <w:sz w:val="19"/>
+                <w:sz w:val="18"/>
               </w:rPr>
               <w:t>Offline semantic retrieval across agronomy research manuals and pesticide technical data sheets.</w:t>
             </w:r>
@@ -631,17 +633,17 @@
             <w:tcW w:type="dxa" w:w="3360"/>
             <w:shd w:fill="F9FBF9"/>
             <w:tcMar>
-              <w:top w:w="80" w:type="dxa"/>
-              <w:bottom w:w="80" w:type="dxa"/>
-              <w:left w:w="100" w:type="dxa"/>
-              <w:right w:w="100" w:type="dxa"/>
+              <w:top w:w="70" w:type="dxa"/>
+              <w:bottom w:w="70" w:type="dxa"/>
+              <w:left w:w="90" w:type="dxa"/>
+              <w:right w:w="90" w:type="dxa"/>
             </w:tcMar>
           </w:tcPr>
           <w:p>
             <w:r>
               <w:rPr>
                 <w:b/>
-                <w:sz w:val="19"/>
+                <w:sz w:val="18"/>
               </w:rPr>
               <w:t>tflite_flutter (Dart)</w:t>
             </w:r>
@@ -652,16 +654,16 @@
             <w:tcW w:type="dxa" w:w="3360"/>
             <w:shd w:fill="F9FBF9"/>
             <w:tcMar>
-              <w:top w:w="80" w:type="dxa"/>
-              <w:bottom w:w="80" w:type="dxa"/>
-              <w:left w:w="100" w:type="dxa"/>
-              <w:right w:w="100" w:type="dxa"/>
+              <w:top w:w="70" w:type="dxa"/>
+              <w:bottom w:w="70" w:type="dxa"/>
+              <w:left w:w="90" w:type="dxa"/>
+              <w:right w:w="90" w:type="dxa"/>
             </w:tcMar>
           </w:tcPr>
           <w:p>
             <w:r>
               <w:rPr>
-                <w:sz w:val="19"/>
+                <w:sz w:val="18"/>
               </w:rPr>
               <w:t>Mobile Edge AI</w:t>
             </w:r>
@@ -672,16 +674,16 @@
             <w:tcW w:type="dxa" w:w="3360"/>
             <w:shd w:fill="F9FBF9"/>
             <w:tcMar>
-              <w:top w:w="80" w:type="dxa"/>
-              <w:bottom w:w="80" w:type="dxa"/>
-              <w:left w:w="100" w:type="dxa"/>
-              <w:right w:w="100" w:type="dxa"/>
+              <w:top w:w="70" w:type="dxa"/>
+              <w:bottom w:w="70" w:type="dxa"/>
+              <w:left w:w="90" w:type="dxa"/>
+              <w:right w:w="90" w:type="dxa"/>
             </w:tcMar>
           </w:tcPr>
           <w:p>
             <w:r>
               <w:rPr>
-                <w:sz w:val="19"/>
+                <w:sz w:val="18"/>
               </w:rPr>
               <w:t>Runs the compiled 15-class model.tflite on mobile CPUs/NPUs inside Android APK with zero internet connection.</w:t>
             </w:r>
@@ -694,17 +696,17 @@
             <w:tcW w:type="dxa" w:w="3360"/>
             <w:shd w:fill="FFFFFF"/>
             <w:tcMar>
-              <w:top w:w="80" w:type="dxa"/>
-              <w:bottom w:w="80" w:type="dxa"/>
-              <w:left w:w="100" w:type="dxa"/>
-              <w:right w:w="100" w:type="dxa"/>
+              <w:top w:w="70" w:type="dxa"/>
+              <w:bottom w:w="70" w:type="dxa"/>
+              <w:left w:w="90" w:type="dxa"/>
+              <w:right w:w="90" w:type="dxa"/>
             </w:tcMar>
           </w:tcPr>
           <w:p>
             <w:r>
               <w:rPr>
                 <w:b/>
-                <w:sz w:val="19"/>
+                <w:sz w:val="18"/>
               </w:rPr>
               <w:t>image (Dart Package)</w:t>
             </w:r>
@@ -715,16 +717,16 @@
             <w:tcW w:type="dxa" w:w="3360"/>
             <w:shd w:fill="FFFFFF"/>
             <w:tcMar>
-              <w:top w:w="80" w:type="dxa"/>
-              <w:bottom w:w="80" w:type="dxa"/>
-              <w:left w:w="100" w:type="dxa"/>
-              <w:right w:w="100" w:type="dxa"/>
+              <w:top w:w="70" w:type="dxa"/>
+              <w:bottom w:w="70" w:type="dxa"/>
+              <w:left w:w="90" w:type="dxa"/>
+              <w:right w:w="90" w:type="dxa"/>
             </w:tcMar>
           </w:tcPr>
           <w:p>
             <w:r>
               <w:rPr>
-                <w:sz w:val="19"/>
+                <w:sz w:val="18"/>
               </w:rPr>
               <w:t>Mobile Image Manipulation</w:t>
             </w:r>
@@ -735,16 +737,16 @@
             <w:tcW w:type="dxa" w:w="3360"/>
             <w:shd w:fill="FFFFFF"/>
             <w:tcMar>
-              <w:top w:w="80" w:type="dxa"/>
-              <w:bottom w:w="80" w:type="dxa"/>
-              <w:left w:w="100" w:type="dxa"/>
-              <w:right w:w="100" w:type="dxa"/>
+              <w:top w:w="70" w:type="dxa"/>
+              <w:bottom w:w="70" w:type="dxa"/>
+              <w:left w:w="90" w:type="dxa"/>
+              <w:right w:w="90" w:type="dxa"/>
             </w:tcMar>
           </w:tcPr>
           <w:p>
             <w:r>
               <w:rPr>
-                <w:sz w:val="19"/>
+                <w:sz w:val="18"/>
               </w:rPr>
               <w:t>Pure Dart image decoding, pixel resizing, and RGB float32 normalization directly on smartphones.</w:t>
             </w:r>
@@ -774,7 +776,7 @@
         <w:spacing w:after="160"/>
       </w:pPr>
       <w:r>
-        <w:t>AgriVision Agent is trained on a rigorously curated subset of the PlantVillage dataset covering exactly 3 commercial crops. Below is the complete catalog of all 15 conditions, their pathogen types, primary symptoms, and standardized treatment protocols:</w:t>
+        <w:t>AgriVision Agent is trained on a curated subset of the PlantVillage dataset covering exactly 3 commercial crops. Below is the complete catalog of all 15 conditions, their pathogen types, primary symptoms, and standardized treatment protocols:</w:t>
       </w:r>
     </w:p>
     <w:tbl>
@@ -799,8 +801,8 @@
             <w:tcMar>
               <w:top w:w="100" w:type="dxa"/>
               <w:bottom w:w="100" w:type="dxa"/>
-              <w:left w:w="100" w:type="dxa"/>
-              <w:right w:w="100" w:type="dxa"/>
+              <w:left w:w="90" w:type="dxa"/>
+              <w:right w:w="90" w:type="dxa"/>
             </w:tcMar>
           </w:tcPr>
           <w:p>
@@ -808,7 +810,7 @@
               <w:rPr>
                 <w:b/>
                 <w:color w:val="FFFFFF"/>
-                <w:sz w:val="19"/>
+                <w:sz w:val="18"/>
               </w:rPr>
               <w:t>#</w:t>
             </w:r>
@@ -821,8 +823,8 @@
             <w:tcMar>
               <w:top w:w="100" w:type="dxa"/>
               <w:bottom w:w="100" w:type="dxa"/>
-              <w:left w:w="100" w:type="dxa"/>
-              <w:right w:w="100" w:type="dxa"/>
+              <w:left w:w="90" w:type="dxa"/>
+              <w:right w:w="90" w:type="dxa"/>
             </w:tcMar>
           </w:tcPr>
           <w:p>
@@ -830,7 +832,7 @@
               <w:rPr>
                 <w:b/>
                 <w:color w:val="FFFFFF"/>
-                <w:sz w:val="19"/>
+                <w:sz w:val="18"/>
               </w:rPr>
               <w:t>Crop &amp; Condition</w:t>
             </w:r>
@@ -843,8 +845,8 @@
             <w:tcMar>
               <w:top w:w="100" w:type="dxa"/>
               <w:bottom w:w="100" w:type="dxa"/>
-              <w:left w:w="100" w:type="dxa"/>
-              <w:right w:w="100" w:type="dxa"/>
+              <w:left w:w="90" w:type="dxa"/>
+              <w:right w:w="90" w:type="dxa"/>
             </w:tcMar>
           </w:tcPr>
           <w:p>
@@ -852,7 +854,7 @@
               <w:rPr>
                 <w:b/>
                 <w:color w:val="FFFFFF"/>
-                <w:sz w:val="19"/>
+                <w:sz w:val="18"/>
               </w:rPr>
               <w:t>Pathogen</w:t>
             </w:r>
@@ -865,8 +867,8 @@
             <w:tcMar>
               <w:top w:w="100" w:type="dxa"/>
               <w:bottom w:w="100" w:type="dxa"/>
-              <w:left w:w="100" w:type="dxa"/>
-              <w:right w:w="100" w:type="dxa"/>
+              <w:left w:w="90" w:type="dxa"/>
+              <w:right w:w="90" w:type="dxa"/>
             </w:tcMar>
           </w:tcPr>
           <w:p>
@@ -874,7 +876,7 @@
               <w:rPr>
                 <w:b/>
                 <w:color w:val="FFFFFF"/>
-                <w:sz w:val="19"/>
+                <w:sz w:val="18"/>
               </w:rPr>
               <w:t>Key Visual Symptoms</w:t>
             </w:r>
@@ -887,8 +889,8 @@
             <w:tcMar>
               <w:top w:w="100" w:type="dxa"/>
               <w:bottom w:w="100" w:type="dxa"/>
-              <w:left w:w="100" w:type="dxa"/>
-              <w:right w:w="100" w:type="dxa"/>
+              <w:left w:w="90" w:type="dxa"/>
+              <w:right w:w="90" w:type="dxa"/>
             </w:tcMar>
           </w:tcPr>
           <w:p>
@@ -896,7 +898,7 @@
               <w:rPr>
                 <w:b/>
                 <w:color w:val="FFFFFF"/>
-                <w:sz w:val="19"/>
+                <w:sz w:val="18"/>
               </w:rPr>
               <w:t>Recommended Chemical Treatment</w:t>
             </w:r>
@@ -909,8 +911,8 @@
             <w:tcMar>
               <w:top w:w="100" w:type="dxa"/>
               <w:bottom w:w="100" w:type="dxa"/>
-              <w:left w:w="100" w:type="dxa"/>
-              <w:right w:w="100" w:type="dxa"/>
+              <w:left w:w="90" w:type="dxa"/>
+              <w:right w:w="90" w:type="dxa"/>
             </w:tcMar>
           </w:tcPr>
           <w:p>
@@ -918,7 +920,7 @@
               <w:rPr>
                 <w:b/>
                 <w:color w:val="FFFFFF"/>
-                <w:sz w:val="19"/>
+                <w:sz w:val="18"/>
               </w:rPr>
               <w:t>Dosage &amp; PHI</w:t>
             </w:r>
@@ -931,10 +933,10 @@
             <w:tcW w:type="dxa" w:w="1680"/>
             <w:shd w:fill="FFFFFF"/>
             <w:tcMar>
-              <w:top w:w="70" w:type="dxa"/>
-              <w:bottom w:w="70" w:type="dxa"/>
-              <w:left w:w="80" w:type="dxa"/>
-              <w:right w:w="80" w:type="dxa"/>
+              <w:top w:w="60" w:type="dxa"/>
+              <w:bottom w:w="60" w:type="dxa"/>
+              <w:left w:w="70" w:type="dxa"/>
+              <w:right w:w="70" w:type="dxa"/>
             </w:tcMar>
           </w:tcPr>
           <w:p>
@@ -952,10 +954,10 @@
             <w:tcW w:type="dxa" w:w="1680"/>
             <w:shd w:fill="FFFFFF"/>
             <w:tcMar>
-              <w:top w:w="70" w:type="dxa"/>
-              <w:bottom w:w="70" w:type="dxa"/>
-              <w:left w:w="80" w:type="dxa"/>
-              <w:right w:w="80" w:type="dxa"/>
+              <w:top w:w="60" w:type="dxa"/>
+              <w:bottom w:w="60" w:type="dxa"/>
+              <w:left w:w="70" w:type="dxa"/>
+              <w:right w:w="70" w:type="dxa"/>
             </w:tcMar>
           </w:tcPr>
           <w:p>
@@ -975,10 +977,10 @@
             <w:tcW w:type="dxa" w:w="1680"/>
             <w:shd w:fill="FFFFFF"/>
             <w:tcMar>
-              <w:top w:w="70" w:type="dxa"/>
-              <w:bottom w:w="70" w:type="dxa"/>
-              <w:left w:w="80" w:type="dxa"/>
-              <w:right w:w="80" w:type="dxa"/>
+              <w:top w:w="60" w:type="dxa"/>
+              <w:bottom w:w="60" w:type="dxa"/>
+              <w:left w:w="70" w:type="dxa"/>
+              <w:right w:w="70" w:type="dxa"/>
             </w:tcMar>
           </w:tcPr>
           <w:p>
@@ -997,10 +999,10 @@
             <w:tcW w:type="dxa" w:w="1680"/>
             <w:shd w:fill="FFFFFF"/>
             <w:tcMar>
-              <w:top w:w="70" w:type="dxa"/>
-              <w:bottom w:w="70" w:type="dxa"/>
-              <w:left w:w="80" w:type="dxa"/>
-              <w:right w:w="80" w:type="dxa"/>
+              <w:top w:w="60" w:type="dxa"/>
+              <w:bottom w:w="60" w:type="dxa"/>
+              <w:left w:w="70" w:type="dxa"/>
+              <w:right w:w="70" w:type="dxa"/>
             </w:tcMar>
           </w:tcPr>
           <w:p>
@@ -1017,10 +1019,10 @@
             <w:tcW w:type="dxa" w:w="1680"/>
             <w:shd w:fill="FFFFFF"/>
             <w:tcMar>
-              <w:top w:w="70" w:type="dxa"/>
-              <w:bottom w:w="70" w:type="dxa"/>
-              <w:left w:w="80" w:type="dxa"/>
-              <w:right w:w="80" w:type="dxa"/>
+              <w:top w:w="60" w:type="dxa"/>
+              <w:bottom w:w="60" w:type="dxa"/>
+              <w:left w:w="70" w:type="dxa"/>
+              <w:right w:w="70" w:type="dxa"/>
             </w:tcMar>
           </w:tcPr>
           <w:p>
@@ -1037,10 +1039,10 @@
             <w:tcW w:type="dxa" w:w="1680"/>
             <w:shd w:fill="FFFFFF"/>
             <w:tcMar>
-              <w:top w:w="70" w:type="dxa"/>
-              <w:bottom w:w="70" w:type="dxa"/>
-              <w:left w:w="80" w:type="dxa"/>
-              <w:right w:w="80" w:type="dxa"/>
+              <w:top w:w="60" w:type="dxa"/>
+              <w:bottom w:w="60" w:type="dxa"/>
+              <w:left w:w="70" w:type="dxa"/>
+              <w:right w:w="70" w:type="dxa"/>
             </w:tcMar>
           </w:tcPr>
           <w:p>
@@ -1061,10 +1063,10 @@
             <w:tcW w:type="dxa" w:w="1680"/>
             <w:shd w:fill="F9FBF9"/>
             <w:tcMar>
-              <w:top w:w="70" w:type="dxa"/>
-              <w:bottom w:w="70" w:type="dxa"/>
-              <w:left w:w="80" w:type="dxa"/>
-              <w:right w:w="80" w:type="dxa"/>
+              <w:top w:w="60" w:type="dxa"/>
+              <w:bottom w:w="60" w:type="dxa"/>
+              <w:left w:w="70" w:type="dxa"/>
+              <w:right w:w="70" w:type="dxa"/>
             </w:tcMar>
           </w:tcPr>
           <w:p>
@@ -1082,10 +1084,10 @@
             <w:tcW w:type="dxa" w:w="1680"/>
             <w:shd w:fill="F9FBF9"/>
             <w:tcMar>
-              <w:top w:w="70" w:type="dxa"/>
-              <w:bottom w:w="70" w:type="dxa"/>
-              <w:left w:w="80" w:type="dxa"/>
-              <w:right w:w="80" w:type="dxa"/>
+              <w:top w:w="60" w:type="dxa"/>
+              <w:bottom w:w="60" w:type="dxa"/>
+              <w:left w:w="70" w:type="dxa"/>
+              <w:right w:w="70" w:type="dxa"/>
             </w:tcMar>
           </w:tcPr>
           <w:p>
@@ -1105,10 +1107,10 @@
             <w:tcW w:type="dxa" w:w="1680"/>
             <w:shd w:fill="F9FBF9"/>
             <w:tcMar>
-              <w:top w:w="70" w:type="dxa"/>
-              <w:bottom w:w="70" w:type="dxa"/>
-              <w:left w:w="80" w:type="dxa"/>
-              <w:right w:w="80" w:type="dxa"/>
+              <w:top w:w="60" w:type="dxa"/>
+              <w:bottom w:w="60" w:type="dxa"/>
+              <w:left w:w="70" w:type="dxa"/>
+              <w:right w:w="70" w:type="dxa"/>
             </w:tcMar>
           </w:tcPr>
           <w:p>
@@ -1125,10 +1127,10 @@
             <w:tcW w:type="dxa" w:w="1680"/>
             <w:shd w:fill="F9FBF9"/>
             <w:tcMar>
-              <w:top w:w="70" w:type="dxa"/>
-              <w:bottom w:w="70" w:type="dxa"/>
-              <w:left w:w="80" w:type="dxa"/>
-              <w:right w:w="80" w:type="dxa"/>
+              <w:top w:w="60" w:type="dxa"/>
+              <w:bottom w:w="60" w:type="dxa"/>
+              <w:left w:w="70" w:type="dxa"/>
+              <w:right w:w="70" w:type="dxa"/>
             </w:tcMar>
           </w:tcPr>
           <w:p>
@@ -1145,10 +1147,10 @@
             <w:tcW w:type="dxa" w:w="1680"/>
             <w:shd w:fill="F9FBF9"/>
             <w:tcMar>
-              <w:top w:w="70" w:type="dxa"/>
-              <w:bottom w:w="70" w:type="dxa"/>
-              <w:left w:w="80" w:type="dxa"/>
-              <w:right w:w="80" w:type="dxa"/>
+              <w:top w:w="60" w:type="dxa"/>
+              <w:bottom w:w="60" w:type="dxa"/>
+              <w:left w:w="70" w:type="dxa"/>
+              <w:right w:w="70" w:type="dxa"/>
             </w:tcMar>
           </w:tcPr>
           <w:p>
@@ -1165,10 +1167,10 @@
             <w:tcW w:type="dxa" w:w="1680"/>
             <w:shd w:fill="F9FBF9"/>
             <w:tcMar>
-              <w:top w:w="70" w:type="dxa"/>
-              <w:bottom w:w="70" w:type="dxa"/>
-              <w:left w:w="80" w:type="dxa"/>
-              <w:right w:w="80" w:type="dxa"/>
+              <w:top w:w="60" w:type="dxa"/>
+              <w:bottom w:w="60" w:type="dxa"/>
+              <w:left w:w="70" w:type="dxa"/>
+              <w:right w:w="70" w:type="dxa"/>
             </w:tcMar>
           </w:tcPr>
           <w:p>
@@ -1189,10 +1191,10 @@
             <w:tcW w:type="dxa" w:w="1680"/>
             <w:shd w:fill="FFFFFF"/>
             <w:tcMar>
-              <w:top w:w="70" w:type="dxa"/>
-              <w:bottom w:w="70" w:type="dxa"/>
-              <w:left w:w="80" w:type="dxa"/>
-              <w:right w:w="80" w:type="dxa"/>
+              <w:top w:w="60" w:type="dxa"/>
+              <w:bottom w:w="60" w:type="dxa"/>
+              <w:left w:w="70" w:type="dxa"/>
+              <w:right w:w="70" w:type="dxa"/>
             </w:tcMar>
           </w:tcPr>
           <w:p>
@@ -1210,10 +1212,10 @@
             <w:tcW w:type="dxa" w:w="1680"/>
             <w:shd w:fill="FFFFFF"/>
             <w:tcMar>
-              <w:top w:w="70" w:type="dxa"/>
-              <w:bottom w:w="70" w:type="dxa"/>
-              <w:left w:w="80" w:type="dxa"/>
-              <w:right w:w="80" w:type="dxa"/>
+              <w:top w:w="60" w:type="dxa"/>
+              <w:bottom w:w="60" w:type="dxa"/>
+              <w:left w:w="70" w:type="dxa"/>
+              <w:right w:w="70" w:type="dxa"/>
             </w:tcMar>
           </w:tcPr>
           <w:p>
@@ -1233,10 +1235,10 @@
             <w:tcW w:type="dxa" w:w="1680"/>
             <w:shd w:fill="FFFFFF"/>
             <w:tcMar>
-              <w:top w:w="70" w:type="dxa"/>
-              <w:bottom w:w="70" w:type="dxa"/>
-              <w:left w:w="80" w:type="dxa"/>
-              <w:right w:w="80" w:type="dxa"/>
+              <w:top w:w="60" w:type="dxa"/>
+              <w:bottom w:w="60" w:type="dxa"/>
+              <w:left w:w="70" w:type="dxa"/>
+              <w:right w:w="70" w:type="dxa"/>
             </w:tcMar>
           </w:tcPr>
           <w:p>
@@ -1255,10 +1257,10 @@
             <w:tcW w:type="dxa" w:w="1680"/>
             <w:shd w:fill="FFFFFF"/>
             <w:tcMar>
-              <w:top w:w="70" w:type="dxa"/>
-              <w:bottom w:w="70" w:type="dxa"/>
-              <w:left w:w="80" w:type="dxa"/>
-              <w:right w:w="80" w:type="dxa"/>
+              <w:top w:w="60" w:type="dxa"/>
+              <w:bottom w:w="60" w:type="dxa"/>
+              <w:left w:w="70" w:type="dxa"/>
+              <w:right w:w="70" w:type="dxa"/>
             </w:tcMar>
           </w:tcPr>
           <w:p>
@@ -1275,10 +1277,10 @@
             <w:tcW w:type="dxa" w:w="1680"/>
             <w:shd w:fill="FFFFFF"/>
             <w:tcMar>
-              <w:top w:w="70" w:type="dxa"/>
-              <w:bottom w:w="70" w:type="dxa"/>
-              <w:left w:w="80" w:type="dxa"/>
-              <w:right w:w="80" w:type="dxa"/>
+              <w:top w:w="60" w:type="dxa"/>
+              <w:bottom w:w="60" w:type="dxa"/>
+              <w:left w:w="70" w:type="dxa"/>
+              <w:right w:w="70" w:type="dxa"/>
             </w:tcMar>
           </w:tcPr>
           <w:p>
@@ -1295,10 +1297,10 @@
             <w:tcW w:type="dxa" w:w="1680"/>
             <w:shd w:fill="FFFFFF"/>
             <w:tcMar>
-              <w:top w:w="70" w:type="dxa"/>
-              <w:bottom w:w="70" w:type="dxa"/>
-              <w:left w:w="80" w:type="dxa"/>
-              <w:right w:w="80" w:type="dxa"/>
+              <w:top w:w="60" w:type="dxa"/>
+              <w:bottom w:w="60" w:type="dxa"/>
+              <w:left w:w="70" w:type="dxa"/>
+              <w:right w:w="70" w:type="dxa"/>
             </w:tcMar>
           </w:tcPr>
           <w:p>
@@ -1319,10 +1321,10 @@
             <w:tcW w:type="dxa" w:w="1680"/>
             <w:shd w:fill="F9FBF9"/>
             <w:tcMar>
-              <w:top w:w="70" w:type="dxa"/>
-              <w:bottom w:w="70" w:type="dxa"/>
-              <w:left w:w="80" w:type="dxa"/>
-              <w:right w:w="80" w:type="dxa"/>
+              <w:top w:w="60" w:type="dxa"/>
+              <w:bottom w:w="60" w:type="dxa"/>
+              <w:left w:w="70" w:type="dxa"/>
+              <w:right w:w="70" w:type="dxa"/>
             </w:tcMar>
           </w:tcPr>
           <w:p>
@@ -1340,10 +1342,10 @@
             <w:tcW w:type="dxa" w:w="1680"/>
             <w:shd w:fill="F9FBF9"/>
             <w:tcMar>
-              <w:top w:w="70" w:type="dxa"/>
-              <w:bottom w:w="70" w:type="dxa"/>
-              <w:left w:w="80" w:type="dxa"/>
-              <w:right w:w="80" w:type="dxa"/>
+              <w:top w:w="60" w:type="dxa"/>
+              <w:bottom w:w="60" w:type="dxa"/>
+              <w:left w:w="70" w:type="dxa"/>
+              <w:right w:w="70" w:type="dxa"/>
             </w:tcMar>
           </w:tcPr>
           <w:p>
@@ -1363,10 +1365,10 @@
             <w:tcW w:type="dxa" w:w="1680"/>
             <w:shd w:fill="F9FBF9"/>
             <w:tcMar>
-              <w:top w:w="70" w:type="dxa"/>
-              <w:bottom w:w="70" w:type="dxa"/>
-              <w:left w:w="80" w:type="dxa"/>
-              <w:right w:w="80" w:type="dxa"/>
+              <w:top w:w="60" w:type="dxa"/>
+              <w:bottom w:w="60" w:type="dxa"/>
+              <w:left w:w="70" w:type="dxa"/>
+              <w:right w:w="70" w:type="dxa"/>
             </w:tcMar>
           </w:tcPr>
           <w:p>
@@ -1383,10 +1385,10 @@
             <w:tcW w:type="dxa" w:w="1680"/>
             <w:shd w:fill="F9FBF9"/>
             <w:tcMar>
-              <w:top w:w="70" w:type="dxa"/>
-              <w:bottom w:w="70" w:type="dxa"/>
-              <w:left w:w="80" w:type="dxa"/>
-              <w:right w:w="80" w:type="dxa"/>
+              <w:top w:w="60" w:type="dxa"/>
+              <w:bottom w:w="60" w:type="dxa"/>
+              <w:left w:w="70" w:type="dxa"/>
+              <w:right w:w="70" w:type="dxa"/>
             </w:tcMar>
           </w:tcPr>
           <w:p>
@@ -1403,10 +1405,10 @@
             <w:tcW w:type="dxa" w:w="1680"/>
             <w:shd w:fill="F9FBF9"/>
             <w:tcMar>
-              <w:top w:w="70" w:type="dxa"/>
-              <w:bottom w:w="70" w:type="dxa"/>
-              <w:left w:w="80" w:type="dxa"/>
-              <w:right w:w="80" w:type="dxa"/>
+              <w:top w:w="60" w:type="dxa"/>
+              <w:bottom w:w="60" w:type="dxa"/>
+              <w:left w:w="70" w:type="dxa"/>
+              <w:right w:w="70" w:type="dxa"/>
             </w:tcMar>
           </w:tcPr>
           <w:p>
@@ -1423,10 +1425,10 @@
             <w:tcW w:type="dxa" w:w="1680"/>
             <w:shd w:fill="F9FBF9"/>
             <w:tcMar>
-              <w:top w:w="70" w:type="dxa"/>
-              <w:bottom w:w="70" w:type="dxa"/>
-              <w:left w:w="80" w:type="dxa"/>
-              <w:right w:w="80" w:type="dxa"/>
+              <w:top w:w="60" w:type="dxa"/>
+              <w:bottom w:w="60" w:type="dxa"/>
+              <w:left w:w="70" w:type="dxa"/>
+              <w:right w:w="70" w:type="dxa"/>
             </w:tcMar>
           </w:tcPr>
           <w:p>
@@ -1447,10 +1449,10 @@
             <w:tcW w:type="dxa" w:w="1680"/>
             <w:shd w:fill="FFFFFF"/>
             <w:tcMar>
-              <w:top w:w="70" w:type="dxa"/>
-              <w:bottom w:w="70" w:type="dxa"/>
-              <w:left w:w="80" w:type="dxa"/>
-              <w:right w:w="80" w:type="dxa"/>
+              <w:top w:w="60" w:type="dxa"/>
+              <w:bottom w:w="60" w:type="dxa"/>
+              <w:left w:w="70" w:type="dxa"/>
+              <w:right w:w="70" w:type="dxa"/>
             </w:tcMar>
           </w:tcPr>
           <w:p>
@@ -1468,10 +1470,10 @@
             <w:tcW w:type="dxa" w:w="1680"/>
             <w:shd w:fill="FFFFFF"/>
             <w:tcMar>
-              <w:top w:w="70" w:type="dxa"/>
-              <w:bottom w:w="70" w:type="dxa"/>
-              <w:left w:w="80" w:type="dxa"/>
-              <w:right w:w="80" w:type="dxa"/>
+              <w:top w:w="60" w:type="dxa"/>
+              <w:bottom w:w="60" w:type="dxa"/>
+              <w:left w:w="70" w:type="dxa"/>
+              <w:right w:w="70" w:type="dxa"/>
             </w:tcMar>
           </w:tcPr>
           <w:p>
@@ -1491,10 +1493,10 @@
             <w:tcW w:type="dxa" w:w="1680"/>
             <w:shd w:fill="FFFFFF"/>
             <w:tcMar>
-              <w:top w:w="70" w:type="dxa"/>
-              <w:bottom w:w="70" w:type="dxa"/>
-              <w:left w:w="80" w:type="dxa"/>
-              <w:right w:w="80" w:type="dxa"/>
+              <w:top w:w="60" w:type="dxa"/>
+              <w:bottom w:w="60" w:type="dxa"/>
+              <w:left w:w="70" w:type="dxa"/>
+              <w:right w:w="70" w:type="dxa"/>
             </w:tcMar>
           </w:tcPr>
           <w:p>
@@ -1513,10 +1515,10 @@
             <w:tcW w:type="dxa" w:w="1680"/>
             <w:shd w:fill="FFFFFF"/>
             <w:tcMar>
-              <w:top w:w="70" w:type="dxa"/>
-              <w:bottom w:w="70" w:type="dxa"/>
-              <w:left w:w="80" w:type="dxa"/>
-              <w:right w:w="80" w:type="dxa"/>
+              <w:top w:w="60" w:type="dxa"/>
+              <w:bottom w:w="60" w:type="dxa"/>
+              <w:left w:w="70" w:type="dxa"/>
+              <w:right w:w="70" w:type="dxa"/>
             </w:tcMar>
           </w:tcPr>
           <w:p>
@@ -1533,10 +1535,10 @@
             <w:tcW w:type="dxa" w:w="1680"/>
             <w:shd w:fill="FFFFFF"/>
             <w:tcMar>
-              <w:top w:w="70" w:type="dxa"/>
-              <w:bottom w:w="70" w:type="dxa"/>
-              <w:left w:w="80" w:type="dxa"/>
-              <w:right w:w="80" w:type="dxa"/>
+              <w:top w:w="60" w:type="dxa"/>
+              <w:bottom w:w="60" w:type="dxa"/>
+              <w:left w:w="70" w:type="dxa"/>
+              <w:right w:w="70" w:type="dxa"/>
             </w:tcMar>
           </w:tcPr>
           <w:p>
@@ -1553,10 +1555,10 @@
             <w:tcW w:type="dxa" w:w="1680"/>
             <w:shd w:fill="FFFFFF"/>
             <w:tcMar>
-              <w:top w:w="70" w:type="dxa"/>
-              <w:bottom w:w="70" w:type="dxa"/>
-              <w:left w:w="80" w:type="dxa"/>
-              <w:right w:w="80" w:type="dxa"/>
+              <w:top w:w="60" w:type="dxa"/>
+              <w:bottom w:w="60" w:type="dxa"/>
+              <w:left w:w="70" w:type="dxa"/>
+              <w:right w:w="70" w:type="dxa"/>
             </w:tcMar>
           </w:tcPr>
           <w:p>
@@ -1577,10 +1579,10 @@
             <w:tcW w:type="dxa" w:w="1680"/>
             <w:shd w:fill="F9FBF9"/>
             <w:tcMar>
-              <w:top w:w="70" w:type="dxa"/>
-              <w:bottom w:w="70" w:type="dxa"/>
-              <w:left w:w="80" w:type="dxa"/>
-              <w:right w:w="80" w:type="dxa"/>
+              <w:top w:w="60" w:type="dxa"/>
+              <w:bottom w:w="60" w:type="dxa"/>
+              <w:left w:w="70" w:type="dxa"/>
+              <w:right w:w="70" w:type="dxa"/>
             </w:tcMar>
           </w:tcPr>
           <w:p>
@@ -1598,10 +1600,10 @@
             <w:tcW w:type="dxa" w:w="1680"/>
             <w:shd w:fill="F9FBF9"/>
             <w:tcMar>
-              <w:top w:w="70" w:type="dxa"/>
-              <w:bottom w:w="70" w:type="dxa"/>
-              <w:left w:w="80" w:type="dxa"/>
-              <w:right w:w="80" w:type="dxa"/>
+              <w:top w:w="60" w:type="dxa"/>
+              <w:bottom w:w="60" w:type="dxa"/>
+              <w:left w:w="70" w:type="dxa"/>
+              <w:right w:w="70" w:type="dxa"/>
             </w:tcMar>
           </w:tcPr>
           <w:p>
@@ -1621,10 +1623,10 @@
             <w:tcW w:type="dxa" w:w="1680"/>
             <w:shd w:fill="F9FBF9"/>
             <w:tcMar>
-              <w:top w:w="70" w:type="dxa"/>
-              <w:bottom w:w="70" w:type="dxa"/>
-              <w:left w:w="80" w:type="dxa"/>
-              <w:right w:w="80" w:type="dxa"/>
+              <w:top w:w="60" w:type="dxa"/>
+              <w:bottom w:w="60" w:type="dxa"/>
+              <w:left w:w="70" w:type="dxa"/>
+              <w:right w:w="70" w:type="dxa"/>
             </w:tcMar>
           </w:tcPr>
           <w:p>
@@ -1643,10 +1645,10 @@
             <w:tcW w:type="dxa" w:w="1680"/>
             <w:shd w:fill="F9FBF9"/>
             <w:tcMar>
-              <w:top w:w="70" w:type="dxa"/>
-              <w:bottom w:w="70" w:type="dxa"/>
-              <w:left w:w="80" w:type="dxa"/>
-              <w:right w:w="80" w:type="dxa"/>
+              <w:top w:w="60" w:type="dxa"/>
+              <w:bottom w:w="60" w:type="dxa"/>
+              <w:left w:w="70" w:type="dxa"/>
+              <w:right w:w="70" w:type="dxa"/>
             </w:tcMar>
           </w:tcPr>
           <w:p>
@@ -1663,10 +1665,10 @@
             <w:tcW w:type="dxa" w:w="1680"/>
             <w:shd w:fill="F9FBF9"/>
             <w:tcMar>
-              <w:top w:w="70" w:type="dxa"/>
-              <w:bottom w:w="70" w:type="dxa"/>
-              <w:left w:w="80" w:type="dxa"/>
-              <w:right w:w="80" w:type="dxa"/>
+              <w:top w:w="60" w:type="dxa"/>
+              <w:bottom w:w="60" w:type="dxa"/>
+              <w:left w:w="70" w:type="dxa"/>
+              <w:right w:w="70" w:type="dxa"/>
             </w:tcMar>
           </w:tcPr>
           <w:p>
@@ -1683,10 +1685,10 @@
             <w:tcW w:type="dxa" w:w="1680"/>
             <w:shd w:fill="F9FBF9"/>
             <w:tcMar>
-              <w:top w:w="70" w:type="dxa"/>
-              <w:bottom w:w="70" w:type="dxa"/>
-              <w:left w:w="80" w:type="dxa"/>
-              <w:right w:w="80" w:type="dxa"/>
+              <w:top w:w="60" w:type="dxa"/>
+              <w:bottom w:w="60" w:type="dxa"/>
+              <w:left w:w="70" w:type="dxa"/>
+              <w:right w:w="70" w:type="dxa"/>
             </w:tcMar>
           </w:tcPr>
           <w:p>
@@ -1707,10 +1709,10 @@
             <w:tcW w:type="dxa" w:w="1680"/>
             <w:shd w:fill="FFFFFF"/>
             <w:tcMar>
-              <w:top w:w="70" w:type="dxa"/>
-              <w:bottom w:w="70" w:type="dxa"/>
-              <w:left w:w="80" w:type="dxa"/>
-              <w:right w:w="80" w:type="dxa"/>
+              <w:top w:w="60" w:type="dxa"/>
+              <w:bottom w:w="60" w:type="dxa"/>
+              <w:left w:w="70" w:type="dxa"/>
+              <w:right w:w="70" w:type="dxa"/>
             </w:tcMar>
           </w:tcPr>
           <w:p>
@@ -1728,10 +1730,10 @@
             <w:tcW w:type="dxa" w:w="1680"/>
             <w:shd w:fill="FFFFFF"/>
             <w:tcMar>
-              <w:top w:w="70" w:type="dxa"/>
-              <w:bottom w:w="70" w:type="dxa"/>
-              <w:left w:w="80" w:type="dxa"/>
-              <w:right w:w="80" w:type="dxa"/>
+              <w:top w:w="60" w:type="dxa"/>
+              <w:bottom w:w="60" w:type="dxa"/>
+              <w:left w:w="70" w:type="dxa"/>
+              <w:right w:w="70" w:type="dxa"/>
             </w:tcMar>
           </w:tcPr>
           <w:p>
@@ -1751,10 +1753,10 @@
             <w:tcW w:type="dxa" w:w="1680"/>
             <w:shd w:fill="FFFFFF"/>
             <w:tcMar>
-              <w:top w:w="70" w:type="dxa"/>
-              <w:bottom w:w="70" w:type="dxa"/>
-              <w:left w:w="80" w:type="dxa"/>
-              <w:right w:w="80" w:type="dxa"/>
+              <w:top w:w="60" w:type="dxa"/>
+              <w:bottom w:w="60" w:type="dxa"/>
+              <w:left w:w="70" w:type="dxa"/>
+              <w:right w:w="70" w:type="dxa"/>
             </w:tcMar>
           </w:tcPr>
           <w:p>
@@ -1773,10 +1775,10 @@
             <w:tcW w:type="dxa" w:w="1680"/>
             <w:shd w:fill="FFFFFF"/>
             <w:tcMar>
-              <w:top w:w="70" w:type="dxa"/>
-              <w:bottom w:w="70" w:type="dxa"/>
-              <w:left w:w="80" w:type="dxa"/>
-              <w:right w:w="80" w:type="dxa"/>
+              <w:top w:w="60" w:type="dxa"/>
+              <w:bottom w:w="60" w:type="dxa"/>
+              <w:left w:w="70" w:type="dxa"/>
+              <w:right w:w="70" w:type="dxa"/>
             </w:tcMar>
           </w:tcPr>
           <w:p>
@@ -1793,10 +1795,10 @@
             <w:tcW w:type="dxa" w:w="1680"/>
             <w:shd w:fill="FFFFFF"/>
             <w:tcMar>
-              <w:top w:w="70" w:type="dxa"/>
-              <w:bottom w:w="70" w:type="dxa"/>
-              <w:left w:w="80" w:type="dxa"/>
-              <w:right w:w="80" w:type="dxa"/>
+              <w:top w:w="60" w:type="dxa"/>
+              <w:bottom w:w="60" w:type="dxa"/>
+              <w:left w:w="70" w:type="dxa"/>
+              <w:right w:w="70" w:type="dxa"/>
             </w:tcMar>
           </w:tcPr>
           <w:p>
@@ -1813,10 +1815,10 @@
             <w:tcW w:type="dxa" w:w="1680"/>
             <w:shd w:fill="FFFFFF"/>
             <w:tcMar>
-              <w:top w:w="70" w:type="dxa"/>
-              <w:bottom w:w="70" w:type="dxa"/>
-              <w:left w:w="80" w:type="dxa"/>
-              <w:right w:w="80" w:type="dxa"/>
+              <w:top w:w="60" w:type="dxa"/>
+              <w:bottom w:w="60" w:type="dxa"/>
+              <w:left w:w="70" w:type="dxa"/>
+              <w:right w:w="70" w:type="dxa"/>
             </w:tcMar>
           </w:tcPr>
           <w:p>
@@ -1837,10 +1839,10 @@
             <w:tcW w:type="dxa" w:w="1680"/>
             <w:shd w:fill="F9FBF9"/>
             <w:tcMar>
-              <w:top w:w="70" w:type="dxa"/>
-              <w:bottom w:w="70" w:type="dxa"/>
-              <w:left w:w="80" w:type="dxa"/>
-              <w:right w:w="80" w:type="dxa"/>
+              <w:top w:w="60" w:type="dxa"/>
+              <w:bottom w:w="60" w:type="dxa"/>
+              <w:left w:w="70" w:type="dxa"/>
+              <w:right w:w="70" w:type="dxa"/>
             </w:tcMar>
           </w:tcPr>
           <w:p>
@@ -1858,10 +1860,10 @@
             <w:tcW w:type="dxa" w:w="1680"/>
             <w:shd w:fill="F9FBF9"/>
             <w:tcMar>
-              <w:top w:w="70" w:type="dxa"/>
-              <w:bottom w:w="70" w:type="dxa"/>
-              <w:left w:w="80" w:type="dxa"/>
-              <w:right w:w="80" w:type="dxa"/>
+              <w:top w:w="60" w:type="dxa"/>
+              <w:bottom w:w="60" w:type="dxa"/>
+              <w:left w:w="70" w:type="dxa"/>
+              <w:right w:w="70" w:type="dxa"/>
             </w:tcMar>
           </w:tcPr>
           <w:p>
@@ -1881,10 +1883,10 @@
             <w:tcW w:type="dxa" w:w="1680"/>
             <w:shd w:fill="F9FBF9"/>
             <w:tcMar>
-              <w:top w:w="70" w:type="dxa"/>
-              <w:bottom w:w="70" w:type="dxa"/>
-              <w:left w:w="80" w:type="dxa"/>
-              <w:right w:w="80" w:type="dxa"/>
+              <w:top w:w="60" w:type="dxa"/>
+              <w:bottom w:w="60" w:type="dxa"/>
+              <w:left w:w="70" w:type="dxa"/>
+              <w:right w:w="70" w:type="dxa"/>
             </w:tcMar>
           </w:tcPr>
           <w:p>
@@ -1901,10 +1903,10 @@
             <w:tcW w:type="dxa" w:w="1680"/>
             <w:shd w:fill="F9FBF9"/>
             <w:tcMar>
-              <w:top w:w="70" w:type="dxa"/>
-              <w:bottom w:w="70" w:type="dxa"/>
-              <w:left w:w="80" w:type="dxa"/>
-              <w:right w:w="80" w:type="dxa"/>
+              <w:top w:w="60" w:type="dxa"/>
+              <w:bottom w:w="60" w:type="dxa"/>
+              <w:left w:w="70" w:type="dxa"/>
+              <w:right w:w="70" w:type="dxa"/>
             </w:tcMar>
           </w:tcPr>
           <w:p>
@@ -1921,10 +1923,10 @@
             <w:tcW w:type="dxa" w:w="1680"/>
             <w:shd w:fill="F9FBF9"/>
             <w:tcMar>
-              <w:top w:w="70" w:type="dxa"/>
-              <w:bottom w:w="70" w:type="dxa"/>
-              <w:left w:w="80" w:type="dxa"/>
-              <w:right w:w="80" w:type="dxa"/>
+              <w:top w:w="60" w:type="dxa"/>
+              <w:bottom w:w="60" w:type="dxa"/>
+              <w:left w:w="70" w:type="dxa"/>
+              <w:right w:w="70" w:type="dxa"/>
             </w:tcMar>
           </w:tcPr>
           <w:p>
@@ -1941,10 +1943,10 @@
             <w:tcW w:type="dxa" w:w="1680"/>
             <w:shd w:fill="F9FBF9"/>
             <w:tcMar>
-              <w:top w:w="70" w:type="dxa"/>
-              <w:bottom w:w="70" w:type="dxa"/>
-              <w:left w:w="80" w:type="dxa"/>
-              <w:right w:w="80" w:type="dxa"/>
+              <w:top w:w="60" w:type="dxa"/>
+              <w:bottom w:w="60" w:type="dxa"/>
+              <w:left w:w="70" w:type="dxa"/>
+              <w:right w:w="70" w:type="dxa"/>
             </w:tcMar>
           </w:tcPr>
           <w:p>
@@ -1965,10 +1967,10 @@
             <w:tcW w:type="dxa" w:w="1680"/>
             <w:shd w:fill="FFFFFF"/>
             <w:tcMar>
-              <w:top w:w="70" w:type="dxa"/>
-              <w:bottom w:w="70" w:type="dxa"/>
-              <w:left w:w="80" w:type="dxa"/>
-              <w:right w:w="80" w:type="dxa"/>
+              <w:top w:w="60" w:type="dxa"/>
+              <w:bottom w:w="60" w:type="dxa"/>
+              <w:left w:w="70" w:type="dxa"/>
+              <w:right w:w="70" w:type="dxa"/>
             </w:tcMar>
           </w:tcPr>
           <w:p>
@@ -1986,10 +1988,10 @@
             <w:tcW w:type="dxa" w:w="1680"/>
             <w:shd w:fill="FFFFFF"/>
             <w:tcMar>
-              <w:top w:w="70" w:type="dxa"/>
-              <w:bottom w:w="70" w:type="dxa"/>
-              <w:left w:w="80" w:type="dxa"/>
-              <w:right w:w="80" w:type="dxa"/>
+              <w:top w:w="60" w:type="dxa"/>
+              <w:bottom w:w="60" w:type="dxa"/>
+              <w:left w:w="70" w:type="dxa"/>
+              <w:right w:w="70" w:type="dxa"/>
             </w:tcMar>
           </w:tcPr>
           <w:p>
@@ -2009,10 +2011,10 @@
             <w:tcW w:type="dxa" w:w="1680"/>
             <w:shd w:fill="FFFFFF"/>
             <w:tcMar>
-              <w:top w:w="70" w:type="dxa"/>
-              <w:bottom w:w="70" w:type="dxa"/>
-              <w:left w:w="80" w:type="dxa"/>
-              <w:right w:w="80" w:type="dxa"/>
+              <w:top w:w="60" w:type="dxa"/>
+              <w:bottom w:w="60" w:type="dxa"/>
+              <w:left w:w="70" w:type="dxa"/>
+              <w:right w:w="70" w:type="dxa"/>
             </w:tcMar>
           </w:tcPr>
           <w:p>
@@ -2031,10 +2033,10 @@
             <w:tcW w:type="dxa" w:w="1680"/>
             <w:shd w:fill="FFFFFF"/>
             <w:tcMar>
-              <w:top w:w="70" w:type="dxa"/>
-              <w:bottom w:w="70" w:type="dxa"/>
-              <w:left w:w="80" w:type="dxa"/>
-              <w:right w:w="80" w:type="dxa"/>
+              <w:top w:w="60" w:type="dxa"/>
+              <w:bottom w:w="60" w:type="dxa"/>
+              <w:left w:w="70" w:type="dxa"/>
+              <w:right w:w="70" w:type="dxa"/>
             </w:tcMar>
           </w:tcPr>
           <w:p>
@@ -2051,10 +2053,10 @@
             <w:tcW w:type="dxa" w:w="1680"/>
             <w:shd w:fill="FFFFFF"/>
             <w:tcMar>
-              <w:top w:w="70" w:type="dxa"/>
-              <w:bottom w:w="70" w:type="dxa"/>
-              <w:left w:w="80" w:type="dxa"/>
-              <w:right w:w="80" w:type="dxa"/>
+              <w:top w:w="60" w:type="dxa"/>
+              <w:bottom w:w="60" w:type="dxa"/>
+              <w:left w:w="70" w:type="dxa"/>
+              <w:right w:w="70" w:type="dxa"/>
             </w:tcMar>
           </w:tcPr>
           <w:p>
@@ -2071,10 +2073,10 @@
             <w:tcW w:type="dxa" w:w="1680"/>
             <w:shd w:fill="FFFFFF"/>
             <w:tcMar>
-              <w:top w:w="70" w:type="dxa"/>
-              <w:bottom w:w="70" w:type="dxa"/>
-              <w:left w:w="80" w:type="dxa"/>
-              <w:right w:w="80" w:type="dxa"/>
+              <w:top w:w="60" w:type="dxa"/>
+              <w:bottom w:w="60" w:type="dxa"/>
+              <w:left w:w="70" w:type="dxa"/>
+              <w:right w:w="70" w:type="dxa"/>
             </w:tcMar>
           </w:tcPr>
           <w:p>
@@ -2095,10 +2097,10 @@
             <w:tcW w:type="dxa" w:w="1680"/>
             <w:shd w:fill="F9FBF9"/>
             <w:tcMar>
-              <w:top w:w="70" w:type="dxa"/>
-              <w:bottom w:w="70" w:type="dxa"/>
-              <w:left w:w="80" w:type="dxa"/>
-              <w:right w:w="80" w:type="dxa"/>
+              <w:top w:w="60" w:type="dxa"/>
+              <w:bottom w:w="60" w:type="dxa"/>
+              <w:left w:w="70" w:type="dxa"/>
+              <w:right w:w="70" w:type="dxa"/>
             </w:tcMar>
           </w:tcPr>
           <w:p>
@@ -2116,10 +2118,10 @@
             <w:tcW w:type="dxa" w:w="1680"/>
             <w:shd w:fill="F9FBF9"/>
             <w:tcMar>
-              <w:top w:w="70" w:type="dxa"/>
-              <w:bottom w:w="70" w:type="dxa"/>
-              <w:left w:w="80" w:type="dxa"/>
-              <w:right w:w="80" w:type="dxa"/>
+              <w:top w:w="60" w:type="dxa"/>
+              <w:bottom w:w="60" w:type="dxa"/>
+              <w:left w:w="70" w:type="dxa"/>
+              <w:right w:w="70" w:type="dxa"/>
             </w:tcMar>
           </w:tcPr>
           <w:p>
@@ -2139,10 +2141,10 @@
             <w:tcW w:type="dxa" w:w="1680"/>
             <w:shd w:fill="F9FBF9"/>
             <w:tcMar>
-              <w:top w:w="70" w:type="dxa"/>
-              <w:bottom w:w="70" w:type="dxa"/>
-              <w:left w:w="80" w:type="dxa"/>
-              <w:right w:w="80" w:type="dxa"/>
+              <w:top w:w="60" w:type="dxa"/>
+              <w:bottom w:w="60" w:type="dxa"/>
+              <w:left w:w="70" w:type="dxa"/>
+              <w:right w:w="70" w:type="dxa"/>
             </w:tcMar>
           </w:tcPr>
           <w:p>
@@ -2161,10 +2163,10 @@
             <w:tcW w:type="dxa" w:w="1680"/>
             <w:shd w:fill="F9FBF9"/>
             <w:tcMar>
-              <w:top w:w="70" w:type="dxa"/>
-              <w:bottom w:w="70" w:type="dxa"/>
-              <w:left w:w="80" w:type="dxa"/>
-              <w:right w:w="80" w:type="dxa"/>
+              <w:top w:w="60" w:type="dxa"/>
+              <w:bottom w:w="60" w:type="dxa"/>
+              <w:left w:w="70" w:type="dxa"/>
+              <w:right w:w="70" w:type="dxa"/>
             </w:tcMar>
           </w:tcPr>
           <w:p>
@@ -2181,10 +2183,10 @@
             <w:tcW w:type="dxa" w:w="1680"/>
             <w:shd w:fill="F9FBF9"/>
             <w:tcMar>
-              <w:top w:w="70" w:type="dxa"/>
-              <w:bottom w:w="70" w:type="dxa"/>
-              <w:left w:w="80" w:type="dxa"/>
-              <w:right w:w="80" w:type="dxa"/>
+              <w:top w:w="60" w:type="dxa"/>
+              <w:bottom w:w="60" w:type="dxa"/>
+              <w:left w:w="70" w:type="dxa"/>
+              <w:right w:w="70" w:type="dxa"/>
             </w:tcMar>
           </w:tcPr>
           <w:p>
@@ -2201,10 +2203,10 @@
             <w:tcW w:type="dxa" w:w="1680"/>
             <w:shd w:fill="F9FBF9"/>
             <w:tcMar>
-              <w:top w:w="70" w:type="dxa"/>
-              <w:bottom w:w="70" w:type="dxa"/>
-              <w:left w:w="80" w:type="dxa"/>
-              <w:right w:w="80" w:type="dxa"/>
+              <w:top w:w="60" w:type="dxa"/>
+              <w:bottom w:w="60" w:type="dxa"/>
+              <w:left w:w="70" w:type="dxa"/>
+              <w:right w:w="70" w:type="dxa"/>
             </w:tcMar>
           </w:tcPr>
           <w:p>
@@ -2225,10 +2227,10 @@
             <w:tcW w:type="dxa" w:w="1680"/>
             <w:shd w:fill="FFFFFF"/>
             <w:tcMar>
-              <w:top w:w="70" w:type="dxa"/>
-              <w:bottom w:w="70" w:type="dxa"/>
-              <w:left w:w="80" w:type="dxa"/>
-              <w:right w:w="80" w:type="dxa"/>
+              <w:top w:w="60" w:type="dxa"/>
+              <w:bottom w:w="60" w:type="dxa"/>
+              <w:left w:w="70" w:type="dxa"/>
+              <w:right w:w="70" w:type="dxa"/>
             </w:tcMar>
           </w:tcPr>
           <w:p>
@@ -2246,10 +2248,10 @@
             <w:tcW w:type="dxa" w:w="1680"/>
             <w:shd w:fill="FFFFFF"/>
             <w:tcMar>
-              <w:top w:w="70" w:type="dxa"/>
-              <w:bottom w:w="70" w:type="dxa"/>
-              <w:left w:w="80" w:type="dxa"/>
-              <w:right w:w="80" w:type="dxa"/>
+              <w:top w:w="60" w:type="dxa"/>
+              <w:bottom w:w="60" w:type="dxa"/>
+              <w:left w:w="70" w:type="dxa"/>
+              <w:right w:w="70" w:type="dxa"/>
             </w:tcMar>
           </w:tcPr>
           <w:p>
@@ -2269,10 +2271,10 @@
             <w:tcW w:type="dxa" w:w="1680"/>
             <w:shd w:fill="FFFFFF"/>
             <w:tcMar>
-              <w:top w:w="70" w:type="dxa"/>
-              <w:bottom w:w="70" w:type="dxa"/>
-              <w:left w:w="80" w:type="dxa"/>
-              <w:right w:w="80" w:type="dxa"/>
+              <w:top w:w="60" w:type="dxa"/>
+              <w:bottom w:w="60" w:type="dxa"/>
+              <w:left w:w="70" w:type="dxa"/>
+              <w:right w:w="70" w:type="dxa"/>
             </w:tcMar>
           </w:tcPr>
           <w:p>
@@ -2291,10 +2293,10 @@
             <w:tcW w:type="dxa" w:w="1680"/>
             <w:shd w:fill="FFFFFF"/>
             <w:tcMar>
-              <w:top w:w="70" w:type="dxa"/>
-              <w:bottom w:w="70" w:type="dxa"/>
-              <w:left w:w="80" w:type="dxa"/>
-              <w:right w:w="80" w:type="dxa"/>
+              <w:top w:w="60" w:type="dxa"/>
+              <w:bottom w:w="60" w:type="dxa"/>
+              <w:left w:w="70" w:type="dxa"/>
+              <w:right w:w="70" w:type="dxa"/>
             </w:tcMar>
           </w:tcPr>
           <w:p>
@@ -2311,10 +2313,10 @@
             <w:tcW w:type="dxa" w:w="1680"/>
             <w:shd w:fill="FFFFFF"/>
             <w:tcMar>
-              <w:top w:w="70" w:type="dxa"/>
-              <w:bottom w:w="70" w:type="dxa"/>
-              <w:left w:w="80" w:type="dxa"/>
-              <w:right w:w="80" w:type="dxa"/>
+              <w:top w:w="60" w:type="dxa"/>
+              <w:bottom w:w="60" w:type="dxa"/>
+              <w:left w:w="70" w:type="dxa"/>
+              <w:right w:w="70" w:type="dxa"/>
             </w:tcMar>
           </w:tcPr>
           <w:p>
@@ -2331,10 +2333,10 @@
             <w:tcW w:type="dxa" w:w="1680"/>
             <w:shd w:fill="FFFFFF"/>
             <w:tcMar>
-              <w:top w:w="70" w:type="dxa"/>
-              <w:bottom w:w="70" w:type="dxa"/>
-              <w:left w:w="80" w:type="dxa"/>
-              <w:right w:w="80" w:type="dxa"/>
+              <w:top w:w="60" w:type="dxa"/>
+              <w:bottom w:w="60" w:type="dxa"/>
+              <w:left w:w="70" w:type="dxa"/>
+              <w:right w:w="70" w:type="dxa"/>
             </w:tcMar>
           </w:tcPr>
           <w:p>
@@ -2355,10 +2357,10 @@
             <w:tcW w:type="dxa" w:w="1680"/>
             <w:shd w:fill="F9FBF9"/>
             <w:tcMar>
-              <w:top w:w="70" w:type="dxa"/>
-              <w:bottom w:w="70" w:type="dxa"/>
-              <w:left w:w="80" w:type="dxa"/>
-              <w:right w:w="80" w:type="dxa"/>
+              <w:top w:w="60" w:type="dxa"/>
+              <w:bottom w:w="60" w:type="dxa"/>
+              <w:left w:w="70" w:type="dxa"/>
+              <w:right w:w="70" w:type="dxa"/>
             </w:tcMar>
           </w:tcPr>
           <w:p>
@@ -2376,10 +2378,10 @@
             <w:tcW w:type="dxa" w:w="1680"/>
             <w:shd w:fill="F9FBF9"/>
             <w:tcMar>
-              <w:top w:w="70" w:type="dxa"/>
-              <w:bottom w:w="70" w:type="dxa"/>
-              <w:left w:w="80" w:type="dxa"/>
-              <w:right w:w="80" w:type="dxa"/>
+              <w:top w:w="60" w:type="dxa"/>
+              <w:bottom w:w="60" w:type="dxa"/>
+              <w:left w:w="70" w:type="dxa"/>
+              <w:right w:w="70" w:type="dxa"/>
             </w:tcMar>
           </w:tcPr>
           <w:p>
@@ -2399,10 +2401,10 @@
             <w:tcW w:type="dxa" w:w="1680"/>
             <w:shd w:fill="F9FBF9"/>
             <w:tcMar>
-              <w:top w:w="70" w:type="dxa"/>
-              <w:bottom w:w="70" w:type="dxa"/>
-              <w:left w:w="80" w:type="dxa"/>
-              <w:right w:w="80" w:type="dxa"/>
+              <w:top w:w="60" w:type="dxa"/>
+              <w:bottom w:w="60" w:type="dxa"/>
+              <w:left w:w="70" w:type="dxa"/>
+              <w:right w:w="70" w:type="dxa"/>
             </w:tcMar>
           </w:tcPr>
           <w:p>
@@ -2421,10 +2423,10 @@
             <w:tcW w:type="dxa" w:w="1680"/>
             <w:shd w:fill="F9FBF9"/>
             <w:tcMar>
-              <w:top w:w="70" w:type="dxa"/>
-              <w:bottom w:w="70" w:type="dxa"/>
-              <w:left w:w="80" w:type="dxa"/>
-              <w:right w:w="80" w:type="dxa"/>
+              <w:top w:w="60" w:type="dxa"/>
+              <w:bottom w:w="60" w:type="dxa"/>
+              <w:left w:w="70" w:type="dxa"/>
+              <w:right w:w="70" w:type="dxa"/>
             </w:tcMar>
           </w:tcPr>
           <w:p>
@@ -2441,10 +2443,10 @@
             <w:tcW w:type="dxa" w:w="1680"/>
             <w:shd w:fill="F9FBF9"/>
             <w:tcMar>
-              <w:top w:w="70" w:type="dxa"/>
-              <w:bottom w:w="70" w:type="dxa"/>
-              <w:left w:w="80" w:type="dxa"/>
-              <w:right w:w="80" w:type="dxa"/>
+              <w:top w:w="60" w:type="dxa"/>
+              <w:bottom w:w="60" w:type="dxa"/>
+              <w:left w:w="70" w:type="dxa"/>
+              <w:right w:w="70" w:type="dxa"/>
             </w:tcMar>
           </w:tcPr>
           <w:p>
@@ -2461,10 +2463,10 @@
             <w:tcW w:type="dxa" w:w="1680"/>
             <w:shd w:fill="F9FBF9"/>
             <w:tcMar>
-              <w:top w:w="70" w:type="dxa"/>
-              <w:bottom w:w="70" w:type="dxa"/>
-              <w:left w:w="80" w:type="dxa"/>
-              <w:right w:w="80" w:type="dxa"/>
+              <w:top w:w="60" w:type="dxa"/>
+              <w:bottom w:w="60" w:type="dxa"/>
+              <w:left w:w="70" w:type="dxa"/>
+              <w:right w:w="70" w:type="dxa"/>
             </w:tcMar>
           </w:tcPr>
           <w:p>
@@ -2485,10 +2487,10 @@
             <w:tcW w:type="dxa" w:w="1680"/>
             <w:shd w:fill="FFFFFF"/>
             <w:tcMar>
-              <w:top w:w="70" w:type="dxa"/>
-              <w:bottom w:w="70" w:type="dxa"/>
-              <w:left w:w="80" w:type="dxa"/>
-              <w:right w:w="80" w:type="dxa"/>
+              <w:top w:w="60" w:type="dxa"/>
+              <w:bottom w:w="60" w:type="dxa"/>
+              <w:left w:w="70" w:type="dxa"/>
+              <w:right w:w="70" w:type="dxa"/>
             </w:tcMar>
           </w:tcPr>
           <w:p>
@@ -2506,10 +2508,10 @@
             <w:tcW w:type="dxa" w:w="1680"/>
             <w:shd w:fill="FFFFFF"/>
             <w:tcMar>
-              <w:top w:w="70" w:type="dxa"/>
-              <w:bottom w:w="70" w:type="dxa"/>
-              <w:left w:w="80" w:type="dxa"/>
-              <w:right w:w="80" w:type="dxa"/>
+              <w:top w:w="60" w:type="dxa"/>
+              <w:bottom w:w="60" w:type="dxa"/>
+              <w:left w:w="70" w:type="dxa"/>
+              <w:right w:w="70" w:type="dxa"/>
             </w:tcMar>
           </w:tcPr>
           <w:p>
@@ -2529,10 +2531,10 @@
             <w:tcW w:type="dxa" w:w="1680"/>
             <w:shd w:fill="FFFFFF"/>
             <w:tcMar>
-              <w:top w:w="70" w:type="dxa"/>
-              <w:bottom w:w="70" w:type="dxa"/>
-              <w:left w:w="80" w:type="dxa"/>
-              <w:right w:w="80" w:type="dxa"/>
+              <w:top w:w="60" w:type="dxa"/>
+              <w:bottom w:w="60" w:type="dxa"/>
+              <w:left w:w="70" w:type="dxa"/>
+              <w:right w:w="70" w:type="dxa"/>
             </w:tcMar>
           </w:tcPr>
           <w:p>
@@ -2551,10 +2553,10 @@
             <w:tcW w:type="dxa" w:w="1680"/>
             <w:shd w:fill="FFFFFF"/>
             <w:tcMar>
-              <w:top w:w="70" w:type="dxa"/>
-              <w:bottom w:w="70" w:type="dxa"/>
-              <w:left w:w="80" w:type="dxa"/>
-              <w:right w:w="80" w:type="dxa"/>
+              <w:top w:w="60" w:type="dxa"/>
+              <w:bottom w:w="60" w:type="dxa"/>
+              <w:left w:w="70" w:type="dxa"/>
+              <w:right w:w="70" w:type="dxa"/>
             </w:tcMar>
           </w:tcPr>
           <w:p>
@@ -2571,10 +2573,10 @@
             <w:tcW w:type="dxa" w:w="1680"/>
             <w:shd w:fill="FFFFFF"/>
             <w:tcMar>
-              <w:top w:w="70" w:type="dxa"/>
-              <w:bottom w:w="70" w:type="dxa"/>
-              <w:left w:w="80" w:type="dxa"/>
-              <w:right w:w="80" w:type="dxa"/>
+              <w:top w:w="60" w:type="dxa"/>
+              <w:bottom w:w="60" w:type="dxa"/>
+              <w:left w:w="70" w:type="dxa"/>
+              <w:right w:w="70" w:type="dxa"/>
             </w:tcMar>
           </w:tcPr>
           <w:p>
@@ -2591,10 +2593,10 @@
             <w:tcW w:type="dxa" w:w="1680"/>
             <w:shd w:fill="FFFFFF"/>
             <w:tcMar>
-              <w:top w:w="70" w:type="dxa"/>
-              <w:bottom w:w="70" w:type="dxa"/>
-              <w:left w:w="80" w:type="dxa"/>
-              <w:right w:w="80" w:type="dxa"/>
+              <w:top w:w="60" w:type="dxa"/>
+              <w:bottom w:w="60" w:type="dxa"/>
+              <w:left w:w="70" w:type="dxa"/>
+              <w:right w:w="70" w:type="dxa"/>
             </w:tcMar>
           </w:tcPr>
           <w:p>
@@ -2615,10 +2617,10 @@
             <w:tcW w:type="dxa" w:w="1680"/>
             <w:shd w:fill="F9FBF9"/>
             <w:tcMar>
-              <w:top w:w="70" w:type="dxa"/>
-              <w:bottom w:w="70" w:type="dxa"/>
-              <w:left w:w="80" w:type="dxa"/>
-              <w:right w:w="80" w:type="dxa"/>
+              <w:top w:w="60" w:type="dxa"/>
+              <w:bottom w:w="60" w:type="dxa"/>
+              <w:left w:w="70" w:type="dxa"/>
+              <w:right w:w="70" w:type="dxa"/>
             </w:tcMar>
           </w:tcPr>
           <w:p>
@@ -2636,10 +2638,10 @@
             <w:tcW w:type="dxa" w:w="1680"/>
             <w:shd w:fill="F9FBF9"/>
             <w:tcMar>
-              <w:top w:w="70" w:type="dxa"/>
-              <w:bottom w:w="70" w:type="dxa"/>
-              <w:left w:w="80" w:type="dxa"/>
-              <w:right w:w="80" w:type="dxa"/>
+              <w:top w:w="60" w:type="dxa"/>
+              <w:bottom w:w="60" w:type="dxa"/>
+              <w:left w:w="70" w:type="dxa"/>
+              <w:right w:w="70" w:type="dxa"/>
             </w:tcMar>
           </w:tcPr>
           <w:p>
@@ -2659,10 +2661,10 @@
             <w:tcW w:type="dxa" w:w="1680"/>
             <w:shd w:fill="F9FBF9"/>
             <w:tcMar>
-              <w:top w:w="70" w:type="dxa"/>
-              <w:bottom w:w="70" w:type="dxa"/>
-              <w:left w:w="80" w:type="dxa"/>
-              <w:right w:w="80" w:type="dxa"/>
+              <w:top w:w="60" w:type="dxa"/>
+              <w:bottom w:w="60" w:type="dxa"/>
+              <w:left w:w="70" w:type="dxa"/>
+              <w:right w:w="70" w:type="dxa"/>
             </w:tcMar>
           </w:tcPr>
           <w:p>
@@ -2681,10 +2683,10 @@
             <w:tcW w:type="dxa" w:w="1680"/>
             <w:shd w:fill="F9FBF9"/>
             <w:tcMar>
-              <w:top w:w="70" w:type="dxa"/>
-              <w:bottom w:w="70" w:type="dxa"/>
-              <w:left w:w="80" w:type="dxa"/>
-              <w:right w:w="80" w:type="dxa"/>
+              <w:top w:w="60" w:type="dxa"/>
+              <w:bottom w:w="60" w:type="dxa"/>
+              <w:left w:w="70" w:type="dxa"/>
+              <w:right w:w="70" w:type="dxa"/>
             </w:tcMar>
           </w:tcPr>
           <w:p>
@@ -2701,10 +2703,10 @@
             <w:tcW w:type="dxa" w:w="1680"/>
             <w:shd w:fill="F9FBF9"/>
             <w:tcMar>
-              <w:top w:w="70" w:type="dxa"/>
-              <w:bottom w:w="70" w:type="dxa"/>
-              <w:left w:w="80" w:type="dxa"/>
-              <w:right w:w="80" w:type="dxa"/>
+              <w:top w:w="60" w:type="dxa"/>
+              <w:bottom w:w="60" w:type="dxa"/>
+              <w:left w:w="70" w:type="dxa"/>
+              <w:right w:w="70" w:type="dxa"/>
             </w:tcMar>
           </w:tcPr>
           <w:p>
@@ -2721,10 +2723,10 @@
             <w:tcW w:type="dxa" w:w="1680"/>
             <w:shd w:fill="F9FBF9"/>
             <w:tcMar>
-              <w:top w:w="70" w:type="dxa"/>
-              <w:bottom w:w="70" w:type="dxa"/>
-              <w:left w:w="80" w:type="dxa"/>
-              <w:right w:w="80" w:type="dxa"/>
+              <w:top w:w="60" w:type="dxa"/>
+              <w:bottom w:w="60" w:type="dxa"/>
+              <w:left w:w="70" w:type="dxa"/>
+              <w:right w:w="70" w:type="dxa"/>
             </w:tcMar>
           </w:tcPr>
           <w:p>
@@ -2745,10 +2747,10 @@
             <w:tcW w:type="dxa" w:w="1680"/>
             <w:shd w:fill="FFFFFF"/>
             <w:tcMar>
-              <w:top w:w="70" w:type="dxa"/>
-              <w:bottom w:w="70" w:type="dxa"/>
-              <w:left w:w="80" w:type="dxa"/>
-              <w:right w:w="80" w:type="dxa"/>
+              <w:top w:w="60" w:type="dxa"/>
+              <w:bottom w:w="60" w:type="dxa"/>
+              <w:left w:w="70" w:type="dxa"/>
+              <w:right w:w="70" w:type="dxa"/>
             </w:tcMar>
           </w:tcPr>
           <w:p>
@@ -2766,10 +2768,10 @@
             <w:tcW w:type="dxa" w:w="1680"/>
             <w:shd w:fill="FFFFFF"/>
             <w:tcMar>
-              <w:top w:w="70" w:type="dxa"/>
-              <w:bottom w:w="70" w:type="dxa"/>
-              <w:left w:w="80" w:type="dxa"/>
-              <w:right w:w="80" w:type="dxa"/>
+              <w:top w:w="60" w:type="dxa"/>
+              <w:bottom w:w="60" w:type="dxa"/>
+              <w:left w:w="70" w:type="dxa"/>
+              <w:right w:w="70" w:type="dxa"/>
             </w:tcMar>
           </w:tcPr>
           <w:p>
@@ -2789,10 +2791,10 @@
             <w:tcW w:type="dxa" w:w="1680"/>
             <w:shd w:fill="FFFFFF"/>
             <w:tcMar>
-              <w:top w:w="70" w:type="dxa"/>
-              <w:bottom w:w="70" w:type="dxa"/>
-              <w:left w:w="80" w:type="dxa"/>
-              <w:right w:w="80" w:type="dxa"/>
+              <w:top w:w="60" w:type="dxa"/>
+              <w:bottom w:w="60" w:type="dxa"/>
+              <w:left w:w="70" w:type="dxa"/>
+              <w:right w:w="70" w:type="dxa"/>
             </w:tcMar>
           </w:tcPr>
           <w:p>
@@ -2811,10 +2813,10 @@
             <w:tcW w:type="dxa" w:w="1680"/>
             <w:shd w:fill="FFFFFF"/>
             <w:tcMar>
-              <w:top w:w="70" w:type="dxa"/>
-              <w:bottom w:w="70" w:type="dxa"/>
-              <w:left w:w="80" w:type="dxa"/>
-              <w:right w:w="80" w:type="dxa"/>
+              <w:top w:w="60" w:type="dxa"/>
+              <w:bottom w:w="60" w:type="dxa"/>
+              <w:left w:w="70" w:type="dxa"/>
+              <w:right w:w="70" w:type="dxa"/>
             </w:tcMar>
           </w:tcPr>
           <w:p>
@@ -2831,10 +2833,10 @@
             <w:tcW w:type="dxa" w:w="1680"/>
             <w:shd w:fill="FFFFFF"/>
             <w:tcMar>
-              <w:top w:w="70" w:type="dxa"/>
-              <w:bottom w:w="70" w:type="dxa"/>
-              <w:left w:w="80" w:type="dxa"/>
-              <w:right w:w="80" w:type="dxa"/>
+              <w:top w:w="60" w:type="dxa"/>
+              <w:bottom w:w="60" w:type="dxa"/>
+              <w:left w:w="70" w:type="dxa"/>
+              <w:right w:w="70" w:type="dxa"/>
             </w:tcMar>
           </w:tcPr>
           <w:p>
@@ -2851,10 +2853,10 @@
             <w:tcW w:type="dxa" w:w="1680"/>
             <w:shd w:fill="FFFFFF"/>
             <w:tcMar>
-              <w:top w:w="70" w:type="dxa"/>
-              <w:bottom w:w="70" w:type="dxa"/>
-              <w:left w:w="80" w:type="dxa"/>
-              <w:right w:w="80" w:type="dxa"/>
+              <w:top w:w="60" w:type="dxa"/>
+              <w:bottom w:w="60" w:type="dxa"/>
+              <w:left w:w="70" w:type="dxa"/>
+              <w:right w:w="70" w:type="dxa"/>
             </w:tcMar>
           </w:tcPr>
           <w:p>
@@ -2915,8 +2917,8 @@
             <w:tcMar>
               <w:top w:w="100" w:type="dxa"/>
               <w:bottom w:w="100" w:type="dxa"/>
-              <w:left w:w="100" w:type="dxa"/>
-              <w:right w:w="100" w:type="dxa"/>
+              <w:left w:w="90" w:type="dxa"/>
+              <w:right w:w="90" w:type="dxa"/>
             </w:tcMar>
           </w:tcPr>
           <w:p>
@@ -2924,7 +2926,7 @@
               <w:rPr>
                 <w:b/>
                 <w:color w:val="FFFFFF"/>
-                <w:sz w:val="19"/>
+                <w:sz w:val="18"/>
               </w:rPr>
               <w:t>Pipeline Stage</w:t>
             </w:r>
@@ -2937,8 +2939,8 @@
             <w:tcMar>
               <w:top w:w="100" w:type="dxa"/>
               <w:bottom w:w="100" w:type="dxa"/>
-              <w:left w:w="100" w:type="dxa"/>
-              <w:right w:w="100" w:type="dxa"/>
+              <w:left w:w="90" w:type="dxa"/>
+              <w:right w:w="90" w:type="dxa"/>
             </w:tcMar>
           </w:tcPr>
           <w:p>
@@ -2946,7 +2948,7 @@
               <w:rPr>
                 <w:b/>
                 <w:color w:val="FFFFFF"/>
-                <w:sz w:val="19"/>
+                <w:sz w:val="18"/>
               </w:rPr>
               <w:t>Parameter Name</w:t>
             </w:r>
@@ -2959,8 +2961,8 @@
             <w:tcMar>
               <w:top w:w="100" w:type="dxa"/>
               <w:bottom w:w="100" w:type="dxa"/>
-              <w:left w:w="100" w:type="dxa"/>
-              <w:right w:w="100" w:type="dxa"/>
+              <w:left w:w="90" w:type="dxa"/>
+              <w:right w:w="90" w:type="dxa"/>
             </w:tcMar>
           </w:tcPr>
           <w:p>
@@ -2968,7 +2970,7 @@
               <w:rPr>
                 <w:b/>
                 <w:color w:val="FFFFFF"/>
-                <w:sz w:val="19"/>
+                <w:sz w:val="18"/>
               </w:rPr>
               <w:t>Exact Value</w:t>
             </w:r>
@@ -2981,8 +2983,8 @@
             <w:tcMar>
               <w:top w:w="100" w:type="dxa"/>
               <w:bottom w:w="100" w:type="dxa"/>
-              <w:left w:w="100" w:type="dxa"/>
-              <w:right w:w="100" w:type="dxa"/>
+              <w:left w:w="90" w:type="dxa"/>
+              <w:right w:w="90" w:type="dxa"/>
             </w:tcMar>
           </w:tcPr>
           <w:p>
@@ -2990,7 +2992,7 @@
               <w:rPr>
                 <w:b/>
                 <w:color w:val="FFFFFF"/>
-                <w:sz w:val="19"/>
+                <w:sz w:val="18"/>
               </w:rPr>
               <w:t>Agronomic / Algorithmic Significance</w:t>
             </w:r>
@@ -3003,10 +3005,10 @@
             <w:tcW w:type="dxa" w:w="2520"/>
             <w:shd w:fill="FFFFFF"/>
             <w:tcMar>
-              <w:top w:w="70" w:type="dxa"/>
-              <w:bottom w:w="70" w:type="dxa"/>
-              <w:left w:w="80" w:type="dxa"/>
-              <w:right w:w="80" w:type="dxa"/>
+              <w:top w:w="60" w:type="dxa"/>
+              <w:bottom w:w="60" w:type="dxa"/>
+              <w:left w:w="70" w:type="dxa"/>
+              <w:right w:w="70" w:type="dxa"/>
             </w:tcMar>
           </w:tcPr>
           <w:p>
@@ -3024,10 +3026,10 @@
             <w:tcW w:type="dxa" w:w="2520"/>
             <w:shd w:fill="FFFFFF"/>
             <w:tcMar>
-              <w:top w:w="70" w:type="dxa"/>
-              <w:bottom w:w="70" w:type="dxa"/>
-              <w:left w:w="80" w:type="dxa"/>
-              <w:right w:w="80" w:type="dxa"/>
+              <w:top w:w="60" w:type="dxa"/>
+              <w:bottom w:w="60" w:type="dxa"/>
+              <w:left w:w="70" w:type="dxa"/>
+              <w:right w:w="70" w:type="dxa"/>
             </w:tcMar>
           </w:tcPr>
           <w:p>
@@ -3045,10 +3047,10 @@
             <w:tcW w:type="dxa" w:w="2520"/>
             <w:shd w:fill="FFFFFF"/>
             <w:tcMar>
-              <w:top w:w="70" w:type="dxa"/>
-              <w:bottom w:w="70" w:type="dxa"/>
-              <w:left w:w="80" w:type="dxa"/>
-              <w:right w:w="80" w:type="dxa"/>
+              <w:top w:w="60" w:type="dxa"/>
+              <w:bottom w:w="60" w:type="dxa"/>
+              <w:left w:w="70" w:type="dxa"/>
+              <w:right w:w="70" w:type="dxa"/>
             </w:tcMar>
           </w:tcPr>
           <w:p>
@@ -3065,10 +3067,10 @@
             <w:tcW w:type="dxa" w:w="2520"/>
             <w:shd w:fill="FFFFFF"/>
             <w:tcMar>
-              <w:top w:w="70" w:type="dxa"/>
-              <w:bottom w:w="70" w:type="dxa"/>
-              <w:left w:w="80" w:type="dxa"/>
-              <w:right w:w="80" w:type="dxa"/>
+              <w:top w:w="60" w:type="dxa"/>
+              <w:bottom w:w="60" w:type="dxa"/>
+              <w:left w:w="70" w:type="dxa"/>
+              <w:right w:w="70" w:type="dxa"/>
             </w:tcMar>
           </w:tcPr>
           <w:p>
@@ -3087,10 +3089,10 @@
             <w:tcW w:type="dxa" w:w="2520"/>
             <w:shd w:fill="F9FBF9"/>
             <w:tcMar>
-              <w:top w:w="70" w:type="dxa"/>
-              <w:bottom w:w="70" w:type="dxa"/>
-              <w:left w:w="80" w:type="dxa"/>
-              <w:right w:w="80" w:type="dxa"/>
+              <w:top w:w="60" w:type="dxa"/>
+              <w:bottom w:w="60" w:type="dxa"/>
+              <w:left w:w="70" w:type="dxa"/>
+              <w:right w:w="70" w:type="dxa"/>
             </w:tcMar>
           </w:tcPr>
           <w:p>
@@ -3108,10 +3110,10 @@
             <w:tcW w:type="dxa" w:w="2520"/>
             <w:shd w:fill="F9FBF9"/>
             <w:tcMar>
-              <w:top w:w="70" w:type="dxa"/>
-              <w:bottom w:w="70" w:type="dxa"/>
-              <w:left w:w="80" w:type="dxa"/>
-              <w:right w:w="80" w:type="dxa"/>
+              <w:top w:w="60" w:type="dxa"/>
+              <w:bottom w:w="60" w:type="dxa"/>
+              <w:left w:w="70" w:type="dxa"/>
+              <w:right w:w="70" w:type="dxa"/>
             </w:tcMar>
           </w:tcPr>
           <w:p>
@@ -3129,10 +3131,10 @@
             <w:tcW w:type="dxa" w:w="2520"/>
             <w:shd w:fill="F9FBF9"/>
             <w:tcMar>
-              <w:top w:w="70" w:type="dxa"/>
-              <w:bottom w:w="70" w:type="dxa"/>
-              <w:left w:w="80" w:type="dxa"/>
-              <w:right w:w="80" w:type="dxa"/>
+              <w:top w:w="60" w:type="dxa"/>
+              <w:bottom w:w="60" w:type="dxa"/>
+              <w:left w:w="70" w:type="dxa"/>
+              <w:right w:w="70" w:type="dxa"/>
             </w:tcMar>
           </w:tcPr>
           <w:p>
@@ -3149,10 +3151,10 @@
             <w:tcW w:type="dxa" w:w="2520"/>
             <w:shd w:fill="F9FBF9"/>
             <w:tcMar>
-              <w:top w:w="70" w:type="dxa"/>
-              <w:bottom w:w="70" w:type="dxa"/>
-              <w:left w:w="80" w:type="dxa"/>
-              <w:right w:w="80" w:type="dxa"/>
+              <w:top w:w="60" w:type="dxa"/>
+              <w:bottom w:w="60" w:type="dxa"/>
+              <w:left w:w="70" w:type="dxa"/>
+              <w:right w:w="70" w:type="dxa"/>
             </w:tcMar>
           </w:tcPr>
           <w:p>
@@ -3171,10 +3173,10 @@
             <w:tcW w:type="dxa" w:w="2520"/>
             <w:shd w:fill="FFFFFF"/>
             <w:tcMar>
-              <w:top w:w="70" w:type="dxa"/>
-              <w:bottom w:w="70" w:type="dxa"/>
-              <w:left w:w="80" w:type="dxa"/>
-              <w:right w:w="80" w:type="dxa"/>
+              <w:top w:w="60" w:type="dxa"/>
+              <w:bottom w:w="60" w:type="dxa"/>
+              <w:left w:w="70" w:type="dxa"/>
+              <w:right w:w="70" w:type="dxa"/>
             </w:tcMar>
           </w:tcPr>
           <w:p>
@@ -3192,10 +3194,10 @@
             <w:tcW w:type="dxa" w:w="2520"/>
             <w:shd w:fill="FFFFFF"/>
             <w:tcMar>
-              <w:top w:w="70" w:type="dxa"/>
-              <w:bottom w:w="70" w:type="dxa"/>
-              <w:left w:w="80" w:type="dxa"/>
-              <w:right w:w="80" w:type="dxa"/>
+              <w:top w:w="60" w:type="dxa"/>
+              <w:bottom w:w="60" w:type="dxa"/>
+              <w:left w:w="70" w:type="dxa"/>
+              <w:right w:w="70" w:type="dxa"/>
             </w:tcMar>
           </w:tcPr>
           <w:p>
@@ -3213,10 +3215,10 @@
             <w:tcW w:type="dxa" w:w="2520"/>
             <w:shd w:fill="FFFFFF"/>
             <w:tcMar>
-              <w:top w:w="70" w:type="dxa"/>
-              <w:bottom w:w="70" w:type="dxa"/>
-              <w:left w:w="80" w:type="dxa"/>
-              <w:right w:w="80" w:type="dxa"/>
+              <w:top w:w="60" w:type="dxa"/>
+              <w:bottom w:w="60" w:type="dxa"/>
+              <w:left w:w="70" w:type="dxa"/>
+              <w:right w:w="70" w:type="dxa"/>
             </w:tcMar>
           </w:tcPr>
           <w:p>
@@ -3233,10 +3235,10 @@
             <w:tcW w:type="dxa" w:w="2520"/>
             <w:shd w:fill="FFFFFF"/>
             <w:tcMar>
-              <w:top w:w="70" w:type="dxa"/>
-              <w:bottom w:w="70" w:type="dxa"/>
-              <w:left w:w="80" w:type="dxa"/>
-              <w:right w:w="80" w:type="dxa"/>
+              <w:top w:w="60" w:type="dxa"/>
+              <w:bottom w:w="60" w:type="dxa"/>
+              <w:left w:w="70" w:type="dxa"/>
+              <w:right w:w="70" w:type="dxa"/>
             </w:tcMar>
           </w:tcPr>
           <w:p>
@@ -3255,10 +3257,10 @@
             <w:tcW w:type="dxa" w:w="2520"/>
             <w:shd w:fill="F9FBF9"/>
             <w:tcMar>
-              <w:top w:w="70" w:type="dxa"/>
-              <w:bottom w:w="70" w:type="dxa"/>
-              <w:left w:w="80" w:type="dxa"/>
-              <w:right w:w="80" w:type="dxa"/>
+              <w:top w:w="60" w:type="dxa"/>
+              <w:bottom w:w="60" w:type="dxa"/>
+              <w:left w:w="70" w:type="dxa"/>
+              <w:right w:w="70" w:type="dxa"/>
             </w:tcMar>
           </w:tcPr>
           <w:p>
@@ -3276,10 +3278,10 @@
             <w:tcW w:type="dxa" w:w="2520"/>
             <w:shd w:fill="F9FBF9"/>
             <w:tcMar>
-              <w:top w:w="70" w:type="dxa"/>
-              <w:bottom w:w="70" w:type="dxa"/>
-              <w:left w:w="80" w:type="dxa"/>
-              <w:right w:w="80" w:type="dxa"/>
+              <w:top w:w="60" w:type="dxa"/>
+              <w:bottom w:w="60" w:type="dxa"/>
+              <w:left w:w="70" w:type="dxa"/>
+              <w:right w:w="70" w:type="dxa"/>
             </w:tcMar>
           </w:tcPr>
           <w:p>
@@ -3297,10 +3299,10 @@
             <w:tcW w:type="dxa" w:w="2520"/>
             <w:shd w:fill="F9FBF9"/>
             <w:tcMar>
-              <w:top w:w="70" w:type="dxa"/>
-              <w:bottom w:w="70" w:type="dxa"/>
-              <w:left w:w="80" w:type="dxa"/>
-              <w:right w:w="80" w:type="dxa"/>
+              <w:top w:w="60" w:type="dxa"/>
+              <w:bottom w:w="60" w:type="dxa"/>
+              <w:left w:w="70" w:type="dxa"/>
+              <w:right w:w="70" w:type="dxa"/>
             </w:tcMar>
           </w:tcPr>
           <w:p>
@@ -3317,10 +3319,10 @@
             <w:tcW w:type="dxa" w:w="2520"/>
             <w:shd w:fill="F9FBF9"/>
             <w:tcMar>
-              <w:top w:w="70" w:type="dxa"/>
-              <w:bottom w:w="70" w:type="dxa"/>
-              <w:left w:w="80" w:type="dxa"/>
-              <w:right w:w="80" w:type="dxa"/>
+              <w:top w:w="60" w:type="dxa"/>
+              <w:bottom w:w="60" w:type="dxa"/>
+              <w:left w:w="70" w:type="dxa"/>
+              <w:right w:w="70" w:type="dxa"/>
             </w:tcMar>
           </w:tcPr>
           <w:p>
@@ -3339,10 +3341,10 @@
             <w:tcW w:type="dxa" w:w="2520"/>
             <w:shd w:fill="FFFFFF"/>
             <w:tcMar>
-              <w:top w:w="70" w:type="dxa"/>
-              <w:bottom w:w="70" w:type="dxa"/>
-              <w:left w:w="80" w:type="dxa"/>
-              <w:right w:w="80" w:type="dxa"/>
+              <w:top w:w="60" w:type="dxa"/>
+              <w:bottom w:w="60" w:type="dxa"/>
+              <w:left w:w="70" w:type="dxa"/>
+              <w:right w:w="70" w:type="dxa"/>
             </w:tcMar>
           </w:tcPr>
           <w:p>
@@ -3360,10 +3362,10 @@
             <w:tcW w:type="dxa" w:w="2520"/>
             <w:shd w:fill="FFFFFF"/>
             <w:tcMar>
-              <w:top w:w="70" w:type="dxa"/>
-              <w:bottom w:w="70" w:type="dxa"/>
-              <w:left w:w="80" w:type="dxa"/>
-              <w:right w:w="80" w:type="dxa"/>
+              <w:top w:w="60" w:type="dxa"/>
+              <w:bottom w:w="60" w:type="dxa"/>
+              <w:left w:w="70" w:type="dxa"/>
+              <w:right w:w="70" w:type="dxa"/>
             </w:tcMar>
           </w:tcPr>
           <w:p>
@@ -3381,10 +3383,10 @@
             <w:tcW w:type="dxa" w:w="2520"/>
             <w:shd w:fill="FFFFFF"/>
             <w:tcMar>
-              <w:top w:w="70" w:type="dxa"/>
-              <w:bottom w:w="70" w:type="dxa"/>
-              <w:left w:w="80" w:type="dxa"/>
-              <w:right w:w="80" w:type="dxa"/>
+              <w:top w:w="60" w:type="dxa"/>
+              <w:bottom w:w="60" w:type="dxa"/>
+              <w:left w:w="70" w:type="dxa"/>
+              <w:right w:w="70" w:type="dxa"/>
             </w:tcMar>
           </w:tcPr>
           <w:p>
@@ -3401,10 +3403,10 @@
             <w:tcW w:type="dxa" w:w="2520"/>
             <w:shd w:fill="FFFFFF"/>
             <w:tcMar>
-              <w:top w:w="70" w:type="dxa"/>
-              <w:bottom w:w="70" w:type="dxa"/>
-              <w:left w:w="80" w:type="dxa"/>
-              <w:right w:w="80" w:type="dxa"/>
+              <w:top w:w="60" w:type="dxa"/>
+              <w:bottom w:w="60" w:type="dxa"/>
+              <w:left w:w="70" w:type="dxa"/>
+              <w:right w:w="70" w:type="dxa"/>
             </w:tcMar>
           </w:tcPr>
           <w:p>
@@ -3423,10 +3425,10 @@
             <w:tcW w:type="dxa" w:w="2520"/>
             <w:shd w:fill="F9FBF9"/>
             <w:tcMar>
-              <w:top w:w="70" w:type="dxa"/>
-              <w:bottom w:w="70" w:type="dxa"/>
-              <w:left w:w="80" w:type="dxa"/>
-              <w:right w:w="80" w:type="dxa"/>
+              <w:top w:w="60" w:type="dxa"/>
+              <w:bottom w:w="60" w:type="dxa"/>
+              <w:left w:w="70" w:type="dxa"/>
+              <w:right w:w="70" w:type="dxa"/>
             </w:tcMar>
           </w:tcPr>
           <w:p>
@@ -3444,10 +3446,10 @@
             <w:tcW w:type="dxa" w:w="2520"/>
             <w:shd w:fill="F9FBF9"/>
             <w:tcMar>
-              <w:top w:w="70" w:type="dxa"/>
-              <w:bottom w:w="70" w:type="dxa"/>
-              <w:left w:w="80" w:type="dxa"/>
-              <w:right w:w="80" w:type="dxa"/>
+              <w:top w:w="60" w:type="dxa"/>
+              <w:bottom w:w="60" w:type="dxa"/>
+              <w:left w:w="70" w:type="dxa"/>
+              <w:right w:w="70" w:type="dxa"/>
             </w:tcMar>
           </w:tcPr>
           <w:p>
@@ -3465,10 +3467,10 @@
             <w:tcW w:type="dxa" w:w="2520"/>
             <w:shd w:fill="F9FBF9"/>
             <w:tcMar>
-              <w:top w:w="70" w:type="dxa"/>
-              <w:bottom w:w="70" w:type="dxa"/>
-              <w:left w:w="80" w:type="dxa"/>
-              <w:right w:w="80" w:type="dxa"/>
+              <w:top w:w="60" w:type="dxa"/>
+              <w:bottom w:w="60" w:type="dxa"/>
+              <w:left w:w="70" w:type="dxa"/>
+              <w:right w:w="70" w:type="dxa"/>
             </w:tcMar>
           </w:tcPr>
           <w:p>
@@ -3485,10 +3487,10 @@
             <w:tcW w:type="dxa" w:w="2520"/>
             <w:shd w:fill="F9FBF9"/>
             <w:tcMar>
-              <w:top w:w="70" w:type="dxa"/>
-              <w:bottom w:w="70" w:type="dxa"/>
-              <w:left w:w="80" w:type="dxa"/>
-              <w:right w:w="80" w:type="dxa"/>
+              <w:top w:w="60" w:type="dxa"/>
+              <w:bottom w:w="60" w:type="dxa"/>
+              <w:left w:w="70" w:type="dxa"/>
+              <w:right w:w="70" w:type="dxa"/>
             </w:tcMar>
           </w:tcPr>
           <w:p>
@@ -3507,10 +3509,10 @@
             <w:tcW w:type="dxa" w:w="2520"/>
             <w:shd w:fill="FFFFFF"/>
             <w:tcMar>
-              <w:top w:w="70" w:type="dxa"/>
-              <w:bottom w:w="70" w:type="dxa"/>
-              <w:left w:w="80" w:type="dxa"/>
-              <w:right w:w="80" w:type="dxa"/>
+              <w:top w:w="60" w:type="dxa"/>
+              <w:bottom w:w="60" w:type="dxa"/>
+              <w:left w:w="70" w:type="dxa"/>
+              <w:right w:w="70" w:type="dxa"/>
             </w:tcMar>
           </w:tcPr>
           <w:p>
@@ -3528,10 +3530,10 @@
             <w:tcW w:type="dxa" w:w="2520"/>
             <w:shd w:fill="FFFFFF"/>
             <w:tcMar>
-              <w:top w:w="70" w:type="dxa"/>
-              <w:bottom w:w="70" w:type="dxa"/>
-              <w:left w:w="80" w:type="dxa"/>
-              <w:right w:w="80" w:type="dxa"/>
+              <w:top w:w="60" w:type="dxa"/>
+              <w:bottom w:w="60" w:type="dxa"/>
+              <w:left w:w="70" w:type="dxa"/>
+              <w:right w:w="70" w:type="dxa"/>
             </w:tcMar>
           </w:tcPr>
           <w:p>
@@ -3549,10 +3551,10 @@
             <w:tcW w:type="dxa" w:w="2520"/>
             <w:shd w:fill="FFFFFF"/>
             <w:tcMar>
-              <w:top w:w="70" w:type="dxa"/>
-              <w:bottom w:w="70" w:type="dxa"/>
-              <w:left w:w="80" w:type="dxa"/>
-              <w:right w:w="80" w:type="dxa"/>
+              <w:top w:w="60" w:type="dxa"/>
+              <w:bottom w:w="60" w:type="dxa"/>
+              <w:left w:w="70" w:type="dxa"/>
+              <w:right w:w="70" w:type="dxa"/>
             </w:tcMar>
           </w:tcPr>
           <w:p>
@@ -3569,10 +3571,10 @@
             <w:tcW w:type="dxa" w:w="2520"/>
             <w:shd w:fill="FFFFFF"/>
             <w:tcMar>
-              <w:top w:w="70" w:type="dxa"/>
-              <w:bottom w:w="70" w:type="dxa"/>
-              <w:left w:w="80" w:type="dxa"/>
-              <w:right w:w="80" w:type="dxa"/>
+              <w:top w:w="60" w:type="dxa"/>
+              <w:bottom w:w="60" w:type="dxa"/>
+              <w:left w:w="70" w:type="dxa"/>
+              <w:right w:w="70" w:type="dxa"/>
             </w:tcMar>
           </w:tcPr>
           <w:p>
@@ -3591,10 +3593,10 @@
             <w:tcW w:type="dxa" w:w="2520"/>
             <w:shd w:fill="F9FBF9"/>
             <w:tcMar>
-              <w:top w:w="70" w:type="dxa"/>
-              <w:bottom w:w="70" w:type="dxa"/>
-              <w:left w:w="80" w:type="dxa"/>
-              <w:right w:w="80" w:type="dxa"/>
+              <w:top w:w="60" w:type="dxa"/>
+              <w:bottom w:w="60" w:type="dxa"/>
+              <w:left w:w="70" w:type="dxa"/>
+              <w:right w:w="70" w:type="dxa"/>
             </w:tcMar>
           </w:tcPr>
           <w:p>
@@ -3612,10 +3614,10 @@
             <w:tcW w:type="dxa" w:w="2520"/>
             <w:shd w:fill="F9FBF9"/>
             <w:tcMar>
-              <w:top w:w="70" w:type="dxa"/>
-              <w:bottom w:w="70" w:type="dxa"/>
-              <w:left w:w="80" w:type="dxa"/>
-              <w:right w:w="80" w:type="dxa"/>
+              <w:top w:w="60" w:type="dxa"/>
+              <w:bottom w:w="60" w:type="dxa"/>
+              <w:left w:w="70" w:type="dxa"/>
+              <w:right w:w="70" w:type="dxa"/>
             </w:tcMar>
           </w:tcPr>
           <w:p>
@@ -3633,10 +3635,10 @@
             <w:tcW w:type="dxa" w:w="2520"/>
             <w:shd w:fill="F9FBF9"/>
             <w:tcMar>
-              <w:top w:w="70" w:type="dxa"/>
-              <w:bottom w:w="70" w:type="dxa"/>
-              <w:left w:w="80" w:type="dxa"/>
-              <w:right w:w="80" w:type="dxa"/>
+              <w:top w:w="60" w:type="dxa"/>
+              <w:bottom w:w="60" w:type="dxa"/>
+              <w:left w:w="70" w:type="dxa"/>
+              <w:right w:w="70" w:type="dxa"/>
             </w:tcMar>
           </w:tcPr>
           <w:p>
@@ -3653,10 +3655,10 @@
             <w:tcW w:type="dxa" w:w="2520"/>
             <w:shd w:fill="F9FBF9"/>
             <w:tcMar>
-              <w:top w:w="70" w:type="dxa"/>
-              <w:bottom w:w="70" w:type="dxa"/>
-              <w:left w:w="80" w:type="dxa"/>
-              <w:right w:w="80" w:type="dxa"/>
+              <w:top w:w="60" w:type="dxa"/>
+              <w:bottom w:w="60" w:type="dxa"/>
+              <w:left w:w="70" w:type="dxa"/>
+              <w:right w:w="70" w:type="dxa"/>
             </w:tcMar>
           </w:tcPr>
           <w:p>
@@ -3675,10 +3677,10 @@
             <w:tcW w:type="dxa" w:w="2520"/>
             <w:shd w:fill="FFFFFF"/>
             <w:tcMar>
-              <w:top w:w="70" w:type="dxa"/>
-              <w:bottom w:w="70" w:type="dxa"/>
-              <w:left w:w="80" w:type="dxa"/>
-              <w:right w:w="80" w:type="dxa"/>
+              <w:top w:w="60" w:type="dxa"/>
+              <w:bottom w:w="60" w:type="dxa"/>
+              <w:left w:w="70" w:type="dxa"/>
+              <w:right w:w="70" w:type="dxa"/>
             </w:tcMar>
           </w:tcPr>
           <w:p>
@@ -3696,10 +3698,10 @@
             <w:tcW w:type="dxa" w:w="2520"/>
             <w:shd w:fill="FFFFFF"/>
             <w:tcMar>
-              <w:top w:w="70" w:type="dxa"/>
-              <w:bottom w:w="70" w:type="dxa"/>
-              <w:left w:w="80" w:type="dxa"/>
-              <w:right w:w="80" w:type="dxa"/>
+              <w:top w:w="60" w:type="dxa"/>
+              <w:bottom w:w="60" w:type="dxa"/>
+              <w:left w:w="70" w:type="dxa"/>
+              <w:right w:w="70" w:type="dxa"/>
             </w:tcMar>
           </w:tcPr>
           <w:p>
@@ -3717,10 +3719,10 @@
             <w:tcW w:type="dxa" w:w="2520"/>
             <w:shd w:fill="FFFFFF"/>
             <w:tcMar>
-              <w:top w:w="70" w:type="dxa"/>
-              <w:bottom w:w="70" w:type="dxa"/>
-              <w:left w:w="80" w:type="dxa"/>
-              <w:right w:w="80" w:type="dxa"/>
+              <w:top w:w="60" w:type="dxa"/>
+              <w:bottom w:w="60" w:type="dxa"/>
+              <w:left w:w="70" w:type="dxa"/>
+              <w:right w:w="70" w:type="dxa"/>
             </w:tcMar>
           </w:tcPr>
           <w:p>
@@ -3737,10 +3739,10 @@
             <w:tcW w:type="dxa" w:w="2520"/>
             <w:shd w:fill="FFFFFF"/>
             <w:tcMar>
-              <w:top w:w="70" w:type="dxa"/>
-              <w:bottom w:w="70" w:type="dxa"/>
-              <w:left w:w="80" w:type="dxa"/>
-              <w:right w:w="80" w:type="dxa"/>
+              <w:top w:w="60" w:type="dxa"/>
+              <w:bottom w:w="60" w:type="dxa"/>
+              <w:left w:w="70" w:type="dxa"/>
+              <w:right w:w="70" w:type="dxa"/>
             </w:tcMar>
           </w:tcPr>
           <w:p>
@@ -3759,10 +3761,10 @@
             <w:tcW w:type="dxa" w:w="2520"/>
             <w:shd w:fill="F9FBF9"/>
             <w:tcMar>
-              <w:top w:w="70" w:type="dxa"/>
-              <w:bottom w:w="70" w:type="dxa"/>
-              <w:left w:w="80" w:type="dxa"/>
-              <w:right w:w="80" w:type="dxa"/>
+              <w:top w:w="60" w:type="dxa"/>
+              <w:bottom w:w="60" w:type="dxa"/>
+              <w:left w:w="70" w:type="dxa"/>
+              <w:right w:w="70" w:type="dxa"/>
             </w:tcMar>
           </w:tcPr>
           <w:p>
@@ -3780,10 +3782,10 @@
             <w:tcW w:type="dxa" w:w="2520"/>
             <w:shd w:fill="F9FBF9"/>
             <w:tcMar>
-              <w:top w:w="70" w:type="dxa"/>
-              <w:bottom w:w="70" w:type="dxa"/>
-              <w:left w:w="80" w:type="dxa"/>
-              <w:right w:w="80" w:type="dxa"/>
+              <w:top w:w="60" w:type="dxa"/>
+              <w:bottom w:w="60" w:type="dxa"/>
+              <w:left w:w="70" w:type="dxa"/>
+              <w:right w:w="70" w:type="dxa"/>
             </w:tcMar>
           </w:tcPr>
           <w:p>
@@ -3801,10 +3803,10 @@
             <w:tcW w:type="dxa" w:w="2520"/>
             <w:shd w:fill="F9FBF9"/>
             <w:tcMar>
-              <w:top w:w="70" w:type="dxa"/>
-              <w:bottom w:w="70" w:type="dxa"/>
-              <w:left w:w="80" w:type="dxa"/>
-              <w:right w:w="80" w:type="dxa"/>
+              <w:top w:w="60" w:type="dxa"/>
+              <w:bottom w:w="60" w:type="dxa"/>
+              <w:left w:w="70" w:type="dxa"/>
+              <w:right w:w="70" w:type="dxa"/>
             </w:tcMar>
           </w:tcPr>
           <w:p>
@@ -3821,10 +3823,10 @@
             <w:tcW w:type="dxa" w:w="2520"/>
             <w:shd w:fill="F9FBF9"/>
             <w:tcMar>
-              <w:top w:w="70" w:type="dxa"/>
-              <w:bottom w:w="70" w:type="dxa"/>
-              <w:left w:w="80" w:type="dxa"/>
-              <w:right w:w="80" w:type="dxa"/>
+              <w:top w:w="60" w:type="dxa"/>
+              <w:bottom w:w="60" w:type="dxa"/>
+              <w:left w:w="70" w:type="dxa"/>
+              <w:right w:w="70" w:type="dxa"/>
             </w:tcMar>
           </w:tcPr>
           <w:p>
@@ -3843,10 +3845,10 @@
             <w:tcW w:type="dxa" w:w="2520"/>
             <w:shd w:fill="FFFFFF"/>
             <w:tcMar>
-              <w:top w:w="70" w:type="dxa"/>
-              <w:bottom w:w="70" w:type="dxa"/>
-              <w:left w:w="80" w:type="dxa"/>
-              <w:right w:w="80" w:type="dxa"/>
+              <w:top w:w="60" w:type="dxa"/>
+              <w:bottom w:w="60" w:type="dxa"/>
+              <w:left w:w="70" w:type="dxa"/>
+              <w:right w:w="70" w:type="dxa"/>
             </w:tcMar>
           </w:tcPr>
           <w:p>
@@ -3864,10 +3866,10 @@
             <w:tcW w:type="dxa" w:w="2520"/>
             <w:shd w:fill="FFFFFF"/>
             <w:tcMar>
-              <w:top w:w="70" w:type="dxa"/>
-              <w:bottom w:w="70" w:type="dxa"/>
-              <w:left w:w="80" w:type="dxa"/>
-              <w:right w:w="80" w:type="dxa"/>
+              <w:top w:w="60" w:type="dxa"/>
+              <w:bottom w:w="60" w:type="dxa"/>
+              <w:left w:w="70" w:type="dxa"/>
+              <w:right w:w="70" w:type="dxa"/>
             </w:tcMar>
           </w:tcPr>
           <w:p>
@@ -3885,10 +3887,10 @@
             <w:tcW w:type="dxa" w:w="2520"/>
             <w:shd w:fill="FFFFFF"/>
             <w:tcMar>
-              <w:top w:w="70" w:type="dxa"/>
-              <w:bottom w:w="70" w:type="dxa"/>
-              <w:left w:w="80" w:type="dxa"/>
-              <w:right w:w="80" w:type="dxa"/>
+              <w:top w:w="60" w:type="dxa"/>
+              <w:bottom w:w="60" w:type="dxa"/>
+              <w:left w:w="70" w:type="dxa"/>
+              <w:right w:w="70" w:type="dxa"/>
             </w:tcMar>
           </w:tcPr>
           <w:p>
@@ -3905,10 +3907,10 @@
             <w:tcW w:type="dxa" w:w="2520"/>
             <w:shd w:fill="FFFFFF"/>
             <w:tcMar>
-              <w:top w:w="70" w:type="dxa"/>
-              <w:bottom w:w="70" w:type="dxa"/>
-              <w:left w:w="80" w:type="dxa"/>
-              <w:right w:w="80" w:type="dxa"/>
+              <w:top w:w="60" w:type="dxa"/>
+              <w:bottom w:w="60" w:type="dxa"/>
+              <w:left w:w="70" w:type="dxa"/>
+              <w:right w:w="70" w:type="dxa"/>
             </w:tcMar>
           </w:tcPr>
           <w:p>
@@ -3927,10 +3929,10 @@
             <w:tcW w:type="dxa" w:w="2520"/>
             <w:shd w:fill="F9FBF9"/>
             <w:tcMar>
-              <w:top w:w="70" w:type="dxa"/>
-              <w:bottom w:w="70" w:type="dxa"/>
-              <w:left w:w="80" w:type="dxa"/>
-              <w:right w:w="80" w:type="dxa"/>
+              <w:top w:w="60" w:type="dxa"/>
+              <w:bottom w:w="60" w:type="dxa"/>
+              <w:left w:w="70" w:type="dxa"/>
+              <w:right w:w="70" w:type="dxa"/>
             </w:tcMar>
           </w:tcPr>
           <w:p>
@@ -3948,10 +3950,10 @@
             <w:tcW w:type="dxa" w:w="2520"/>
             <w:shd w:fill="F9FBF9"/>
             <w:tcMar>
-              <w:top w:w="70" w:type="dxa"/>
-              <w:bottom w:w="70" w:type="dxa"/>
-              <w:left w:w="80" w:type="dxa"/>
-              <w:right w:w="80" w:type="dxa"/>
+              <w:top w:w="60" w:type="dxa"/>
+              <w:bottom w:w="60" w:type="dxa"/>
+              <w:left w:w="70" w:type="dxa"/>
+              <w:right w:w="70" w:type="dxa"/>
             </w:tcMar>
           </w:tcPr>
           <w:p>
@@ -3969,10 +3971,10 @@
             <w:tcW w:type="dxa" w:w="2520"/>
             <w:shd w:fill="F9FBF9"/>
             <w:tcMar>
-              <w:top w:w="70" w:type="dxa"/>
-              <w:bottom w:w="70" w:type="dxa"/>
-              <w:left w:w="80" w:type="dxa"/>
-              <w:right w:w="80" w:type="dxa"/>
+              <w:top w:w="60" w:type="dxa"/>
+              <w:bottom w:w="60" w:type="dxa"/>
+              <w:left w:w="70" w:type="dxa"/>
+              <w:right w:w="70" w:type="dxa"/>
             </w:tcMar>
           </w:tcPr>
           <w:p>
@@ -3989,10 +3991,10 @@
             <w:tcW w:type="dxa" w:w="2520"/>
             <w:shd w:fill="F9FBF9"/>
             <w:tcMar>
-              <w:top w:w="70" w:type="dxa"/>
-              <w:bottom w:w="70" w:type="dxa"/>
-              <w:left w:w="80" w:type="dxa"/>
-              <w:right w:w="80" w:type="dxa"/>
+              <w:top w:w="60" w:type="dxa"/>
+              <w:bottom w:w="60" w:type="dxa"/>
+              <w:left w:w="70" w:type="dxa"/>
+              <w:right w:w="70" w:type="dxa"/>
             </w:tcMar>
           </w:tcPr>
           <w:p>
@@ -4011,10 +4013,10 @@
             <w:tcW w:type="dxa" w:w="2520"/>
             <w:shd w:fill="FFFFFF"/>
             <w:tcMar>
-              <w:top w:w="70" w:type="dxa"/>
-              <w:bottom w:w="70" w:type="dxa"/>
-              <w:left w:w="80" w:type="dxa"/>
-              <w:right w:w="80" w:type="dxa"/>
+              <w:top w:w="60" w:type="dxa"/>
+              <w:bottom w:w="60" w:type="dxa"/>
+              <w:left w:w="70" w:type="dxa"/>
+              <w:right w:w="70" w:type="dxa"/>
             </w:tcMar>
           </w:tcPr>
           <w:p>
@@ -4032,10 +4034,10 @@
             <w:tcW w:type="dxa" w:w="2520"/>
             <w:shd w:fill="FFFFFF"/>
             <w:tcMar>
-              <w:top w:w="70" w:type="dxa"/>
-              <w:bottom w:w="70" w:type="dxa"/>
-              <w:left w:w="80" w:type="dxa"/>
-              <w:right w:w="80" w:type="dxa"/>
+              <w:top w:w="60" w:type="dxa"/>
+              <w:bottom w:w="60" w:type="dxa"/>
+              <w:left w:w="70" w:type="dxa"/>
+              <w:right w:w="70" w:type="dxa"/>
             </w:tcMar>
           </w:tcPr>
           <w:p>
@@ -4053,10 +4055,10 @@
             <w:tcW w:type="dxa" w:w="2520"/>
             <w:shd w:fill="FFFFFF"/>
             <w:tcMar>
-              <w:top w:w="70" w:type="dxa"/>
-              <w:bottom w:w="70" w:type="dxa"/>
-              <w:left w:w="80" w:type="dxa"/>
-              <w:right w:w="80" w:type="dxa"/>
+              <w:top w:w="60" w:type="dxa"/>
+              <w:bottom w:w="60" w:type="dxa"/>
+              <w:left w:w="70" w:type="dxa"/>
+              <w:right w:w="70" w:type="dxa"/>
             </w:tcMar>
           </w:tcPr>
           <w:p>
@@ -4073,10 +4075,10 @@
             <w:tcW w:type="dxa" w:w="2520"/>
             <w:shd w:fill="FFFFFF"/>
             <w:tcMar>
-              <w:top w:w="70" w:type="dxa"/>
-              <w:bottom w:w="70" w:type="dxa"/>
-              <w:left w:w="80" w:type="dxa"/>
-              <w:right w:w="80" w:type="dxa"/>
+              <w:top w:w="60" w:type="dxa"/>
+              <w:bottom w:w="60" w:type="dxa"/>
+              <w:left w:w="70" w:type="dxa"/>
+              <w:right w:w="70" w:type="dxa"/>
             </w:tcMar>
           </w:tcPr>
           <w:p>
@@ -4095,10 +4097,10 @@
             <w:tcW w:type="dxa" w:w="2520"/>
             <w:shd w:fill="F9FBF9"/>
             <w:tcMar>
-              <w:top w:w="70" w:type="dxa"/>
-              <w:bottom w:w="70" w:type="dxa"/>
-              <w:left w:w="80" w:type="dxa"/>
-              <w:right w:w="80" w:type="dxa"/>
+              <w:top w:w="60" w:type="dxa"/>
+              <w:bottom w:w="60" w:type="dxa"/>
+              <w:left w:w="70" w:type="dxa"/>
+              <w:right w:w="70" w:type="dxa"/>
             </w:tcMar>
           </w:tcPr>
           <w:p>
@@ -4116,10 +4118,10 @@
             <w:tcW w:type="dxa" w:w="2520"/>
             <w:shd w:fill="F9FBF9"/>
             <w:tcMar>
-              <w:top w:w="70" w:type="dxa"/>
-              <w:bottom w:w="70" w:type="dxa"/>
-              <w:left w:w="80" w:type="dxa"/>
-              <w:right w:w="80" w:type="dxa"/>
+              <w:top w:w="60" w:type="dxa"/>
+              <w:bottom w:w="60" w:type="dxa"/>
+              <w:left w:w="70" w:type="dxa"/>
+              <w:right w:w="70" w:type="dxa"/>
             </w:tcMar>
           </w:tcPr>
           <w:p>
@@ -4137,10 +4139,10 @@
             <w:tcW w:type="dxa" w:w="2520"/>
             <w:shd w:fill="F9FBF9"/>
             <w:tcMar>
-              <w:top w:w="70" w:type="dxa"/>
-              <w:bottom w:w="70" w:type="dxa"/>
-              <w:left w:w="80" w:type="dxa"/>
-              <w:right w:w="80" w:type="dxa"/>
+              <w:top w:w="60" w:type="dxa"/>
+              <w:bottom w:w="60" w:type="dxa"/>
+              <w:left w:w="70" w:type="dxa"/>
+              <w:right w:w="70" w:type="dxa"/>
             </w:tcMar>
           </w:tcPr>
           <w:p>
@@ -4157,10 +4159,10 @@
             <w:tcW w:type="dxa" w:w="2520"/>
             <w:shd w:fill="F9FBF9"/>
             <w:tcMar>
-              <w:top w:w="70" w:type="dxa"/>
-              <w:bottom w:w="70" w:type="dxa"/>
-              <w:left w:w="80" w:type="dxa"/>
-              <w:right w:w="80" w:type="dxa"/>
+              <w:top w:w="60" w:type="dxa"/>
+              <w:bottom w:w="60" w:type="dxa"/>
+              <w:left w:w="70" w:type="dxa"/>
+              <w:right w:w="70" w:type="dxa"/>
             </w:tcMar>
           </w:tcPr>
           <w:p>
@@ -4179,10 +4181,10 @@
             <w:tcW w:type="dxa" w:w="2520"/>
             <w:shd w:fill="FFFFFF"/>
             <w:tcMar>
-              <w:top w:w="70" w:type="dxa"/>
-              <w:bottom w:w="70" w:type="dxa"/>
-              <w:left w:w="80" w:type="dxa"/>
-              <w:right w:w="80" w:type="dxa"/>
+              <w:top w:w="60" w:type="dxa"/>
+              <w:bottom w:w="60" w:type="dxa"/>
+              <w:left w:w="70" w:type="dxa"/>
+              <w:right w:w="70" w:type="dxa"/>
             </w:tcMar>
           </w:tcPr>
           <w:p>
@@ -4200,10 +4202,10 @@
             <w:tcW w:type="dxa" w:w="2520"/>
             <w:shd w:fill="FFFFFF"/>
             <w:tcMar>
-              <w:top w:w="70" w:type="dxa"/>
-              <w:bottom w:w="70" w:type="dxa"/>
-              <w:left w:w="80" w:type="dxa"/>
-              <w:right w:w="80" w:type="dxa"/>
+              <w:top w:w="60" w:type="dxa"/>
+              <w:bottom w:w="60" w:type="dxa"/>
+              <w:left w:w="70" w:type="dxa"/>
+              <w:right w:w="70" w:type="dxa"/>
             </w:tcMar>
           </w:tcPr>
           <w:p>
@@ -4221,10 +4223,10 @@
             <w:tcW w:type="dxa" w:w="2520"/>
             <w:shd w:fill="FFFFFF"/>
             <w:tcMar>
-              <w:top w:w="70" w:type="dxa"/>
-              <w:bottom w:w="70" w:type="dxa"/>
-              <w:left w:w="80" w:type="dxa"/>
-              <w:right w:w="80" w:type="dxa"/>
+              <w:top w:w="60" w:type="dxa"/>
+              <w:bottom w:w="60" w:type="dxa"/>
+              <w:left w:w="70" w:type="dxa"/>
+              <w:right w:w="70" w:type="dxa"/>
             </w:tcMar>
           </w:tcPr>
           <w:p>
@@ -4241,10 +4243,10 @@
             <w:tcW w:type="dxa" w:w="2520"/>
             <w:shd w:fill="FFFFFF"/>
             <w:tcMar>
-              <w:top w:w="70" w:type="dxa"/>
-              <w:bottom w:w="70" w:type="dxa"/>
-              <w:left w:w="80" w:type="dxa"/>
-              <w:right w:w="80" w:type="dxa"/>
+              <w:top w:w="60" w:type="dxa"/>
+              <w:bottom w:w="60" w:type="dxa"/>
+              <w:left w:w="70" w:type="dxa"/>
+              <w:right w:w="70" w:type="dxa"/>
             </w:tcMar>
           </w:tcPr>
           <w:p>
@@ -4263,10 +4265,10 @@
             <w:tcW w:type="dxa" w:w="2520"/>
             <w:shd w:fill="F9FBF9"/>
             <w:tcMar>
-              <w:top w:w="70" w:type="dxa"/>
-              <w:bottom w:w="70" w:type="dxa"/>
-              <w:left w:w="80" w:type="dxa"/>
-              <w:right w:w="80" w:type="dxa"/>
+              <w:top w:w="60" w:type="dxa"/>
+              <w:bottom w:w="60" w:type="dxa"/>
+              <w:left w:w="70" w:type="dxa"/>
+              <w:right w:w="70" w:type="dxa"/>
             </w:tcMar>
           </w:tcPr>
           <w:p>
@@ -4284,10 +4286,10 @@
             <w:tcW w:type="dxa" w:w="2520"/>
             <w:shd w:fill="F9FBF9"/>
             <w:tcMar>
-              <w:top w:w="70" w:type="dxa"/>
-              <w:bottom w:w="70" w:type="dxa"/>
-              <w:left w:w="80" w:type="dxa"/>
-              <w:right w:w="80" w:type="dxa"/>
+              <w:top w:w="60" w:type="dxa"/>
+              <w:bottom w:w="60" w:type="dxa"/>
+              <w:left w:w="70" w:type="dxa"/>
+              <w:right w:w="70" w:type="dxa"/>
             </w:tcMar>
           </w:tcPr>
           <w:p>
@@ -4305,10 +4307,10 @@
             <w:tcW w:type="dxa" w:w="2520"/>
             <w:shd w:fill="F9FBF9"/>
             <w:tcMar>
-              <w:top w:w="70" w:type="dxa"/>
-              <w:bottom w:w="70" w:type="dxa"/>
-              <w:left w:w="80" w:type="dxa"/>
-              <w:right w:w="80" w:type="dxa"/>
+              <w:top w:w="60" w:type="dxa"/>
+              <w:bottom w:w="60" w:type="dxa"/>
+              <w:left w:w="70" w:type="dxa"/>
+              <w:right w:w="70" w:type="dxa"/>
             </w:tcMar>
           </w:tcPr>
           <w:p>
@@ -4325,10 +4327,10 @@
             <w:tcW w:type="dxa" w:w="2520"/>
             <w:shd w:fill="F9FBF9"/>
             <w:tcMar>
-              <w:top w:w="70" w:type="dxa"/>
-              <w:bottom w:w="70" w:type="dxa"/>
-              <w:left w:w="80" w:type="dxa"/>
-              <w:right w:w="80" w:type="dxa"/>
+              <w:top w:w="60" w:type="dxa"/>
+              <w:bottom w:w="60" w:type="dxa"/>
+              <w:left w:w="70" w:type="dxa"/>
+              <w:right w:w="70" w:type="dxa"/>
             </w:tcMar>
           </w:tcPr>
           <w:p>
@@ -4347,10 +4349,10 @@
             <w:tcW w:type="dxa" w:w="2520"/>
             <w:shd w:fill="FFFFFF"/>
             <w:tcMar>
-              <w:top w:w="70" w:type="dxa"/>
-              <w:bottom w:w="70" w:type="dxa"/>
-              <w:left w:w="80" w:type="dxa"/>
-              <w:right w:w="80" w:type="dxa"/>
+              <w:top w:w="60" w:type="dxa"/>
+              <w:bottom w:w="60" w:type="dxa"/>
+              <w:left w:w="70" w:type="dxa"/>
+              <w:right w:w="70" w:type="dxa"/>
             </w:tcMar>
           </w:tcPr>
           <w:p>
@@ -4368,10 +4370,10 @@
             <w:tcW w:type="dxa" w:w="2520"/>
             <w:shd w:fill="FFFFFF"/>
             <w:tcMar>
-              <w:top w:w="70" w:type="dxa"/>
-              <w:bottom w:w="70" w:type="dxa"/>
-              <w:left w:w="80" w:type="dxa"/>
-              <w:right w:w="80" w:type="dxa"/>
+              <w:top w:w="60" w:type="dxa"/>
+              <w:bottom w:w="60" w:type="dxa"/>
+              <w:left w:w="70" w:type="dxa"/>
+              <w:right w:w="70" w:type="dxa"/>
             </w:tcMar>
           </w:tcPr>
           <w:p>
@@ -4389,10 +4391,10 @@
             <w:tcW w:type="dxa" w:w="2520"/>
             <w:shd w:fill="FFFFFF"/>
             <w:tcMar>
-              <w:top w:w="70" w:type="dxa"/>
-              <w:bottom w:w="70" w:type="dxa"/>
-              <w:left w:w="80" w:type="dxa"/>
-              <w:right w:w="80" w:type="dxa"/>
+              <w:top w:w="60" w:type="dxa"/>
+              <w:bottom w:w="60" w:type="dxa"/>
+              <w:left w:w="70" w:type="dxa"/>
+              <w:right w:w="70" w:type="dxa"/>
             </w:tcMar>
           </w:tcPr>
           <w:p>
@@ -4409,10 +4411,10 @@
             <w:tcW w:type="dxa" w:w="2520"/>
             <w:shd w:fill="FFFFFF"/>
             <w:tcMar>
-              <w:top w:w="70" w:type="dxa"/>
-              <w:bottom w:w="70" w:type="dxa"/>
-              <w:left w:w="80" w:type="dxa"/>
-              <w:right w:w="80" w:type="dxa"/>
+              <w:top w:w="60" w:type="dxa"/>
+              <w:bottom w:w="60" w:type="dxa"/>
+              <w:left w:w="70" w:type="dxa"/>
+              <w:right w:w="70" w:type="dxa"/>
             </w:tcMar>
           </w:tcPr>
           <w:p>
@@ -4431,10 +4433,10 @@
             <w:tcW w:type="dxa" w:w="2520"/>
             <w:shd w:fill="F9FBF9"/>
             <w:tcMar>
-              <w:top w:w="70" w:type="dxa"/>
-              <w:bottom w:w="70" w:type="dxa"/>
-              <w:left w:w="80" w:type="dxa"/>
-              <w:right w:w="80" w:type="dxa"/>
+              <w:top w:w="60" w:type="dxa"/>
+              <w:bottom w:w="60" w:type="dxa"/>
+              <w:left w:w="70" w:type="dxa"/>
+              <w:right w:w="70" w:type="dxa"/>
             </w:tcMar>
           </w:tcPr>
           <w:p>
@@ -4452,10 +4454,10 @@
             <w:tcW w:type="dxa" w:w="2520"/>
             <w:shd w:fill="F9FBF9"/>
             <w:tcMar>
-              <w:top w:w="70" w:type="dxa"/>
-              <w:bottom w:w="70" w:type="dxa"/>
-              <w:left w:w="80" w:type="dxa"/>
-              <w:right w:w="80" w:type="dxa"/>
+              <w:top w:w="60" w:type="dxa"/>
+              <w:bottom w:w="60" w:type="dxa"/>
+              <w:left w:w="70" w:type="dxa"/>
+              <w:right w:w="70" w:type="dxa"/>
             </w:tcMar>
           </w:tcPr>
           <w:p>
@@ -4473,10 +4475,10 @@
             <w:tcW w:type="dxa" w:w="2520"/>
             <w:shd w:fill="F9FBF9"/>
             <w:tcMar>
-              <w:top w:w="70" w:type="dxa"/>
-              <w:bottom w:w="70" w:type="dxa"/>
-              <w:left w:w="80" w:type="dxa"/>
-              <w:right w:w="80" w:type="dxa"/>
+              <w:top w:w="60" w:type="dxa"/>
+              <w:bottom w:w="60" w:type="dxa"/>
+              <w:left w:w="70" w:type="dxa"/>
+              <w:right w:w="70" w:type="dxa"/>
             </w:tcMar>
           </w:tcPr>
           <w:p>
@@ -4493,10 +4495,10 @@
             <w:tcW w:type="dxa" w:w="2520"/>
             <w:shd w:fill="F9FBF9"/>
             <w:tcMar>
-              <w:top w:w="70" w:type="dxa"/>
-              <w:bottom w:w="70" w:type="dxa"/>
-              <w:left w:w="80" w:type="dxa"/>
-              <w:right w:w="80" w:type="dxa"/>
+              <w:top w:w="60" w:type="dxa"/>
+              <w:bottom w:w="60" w:type="dxa"/>
+              <w:left w:w="70" w:type="dxa"/>
+              <w:right w:w="70" w:type="dxa"/>
             </w:tcMar>
           </w:tcPr>
           <w:p>
@@ -4515,10 +4517,10 @@
             <w:tcW w:type="dxa" w:w="2520"/>
             <w:shd w:fill="FFFFFF"/>
             <w:tcMar>
-              <w:top w:w="70" w:type="dxa"/>
-              <w:bottom w:w="70" w:type="dxa"/>
-              <w:left w:w="80" w:type="dxa"/>
-              <w:right w:w="80" w:type="dxa"/>
+              <w:top w:w="60" w:type="dxa"/>
+              <w:bottom w:w="60" w:type="dxa"/>
+              <w:left w:w="70" w:type="dxa"/>
+              <w:right w:w="70" w:type="dxa"/>
             </w:tcMar>
           </w:tcPr>
           <w:p>
@@ -4536,10 +4538,10 @@
             <w:tcW w:type="dxa" w:w="2520"/>
             <w:shd w:fill="FFFFFF"/>
             <w:tcMar>
-              <w:top w:w="70" w:type="dxa"/>
-              <w:bottom w:w="70" w:type="dxa"/>
-              <w:left w:w="80" w:type="dxa"/>
-              <w:right w:w="80" w:type="dxa"/>
+              <w:top w:w="60" w:type="dxa"/>
+              <w:bottom w:w="60" w:type="dxa"/>
+              <w:left w:w="70" w:type="dxa"/>
+              <w:right w:w="70" w:type="dxa"/>
             </w:tcMar>
           </w:tcPr>
           <w:p>
@@ -4557,10 +4559,10 @@
             <w:tcW w:type="dxa" w:w="2520"/>
             <w:shd w:fill="FFFFFF"/>
             <w:tcMar>
-              <w:top w:w="70" w:type="dxa"/>
-              <w:bottom w:w="70" w:type="dxa"/>
-              <w:left w:w="80" w:type="dxa"/>
-              <w:right w:w="80" w:type="dxa"/>
+              <w:top w:w="60" w:type="dxa"/>
+              <w:bottom w:w="60" w:type="dxa"/>
+              <w:left w:w="70" w:type="dxa"/>
+              <w:right w:w="70" w:type="dxa"/>
             </w:tcMar>
           </w:tcPr>
           <w:p>
@@ -4577,10 +4579,10 @@
             <w:tcW w:type="dxa" w:w="2520"/>
             <w:shd w:fill="FFFFFF"/>
             <w:tcMar>
-              <w:top w:w="70" w:type="dxa"/>
-              <w:bottom w:w="70" w:type="dxa"/>
-              <w:left w:w="80" w:type="dxa"/>
-              <w:right w:w="80" w:type="dxa"/>
+              <w:top w:w="60" w:type="dxa"/>
+              <w:bottom w:w="60" w:type="dxa"/>
+              <w:left w:w="70" w:type="dxa"/>
+              <w:right w:w="70" w:type="dxa"/>
             </w:tcMar>
           </w:tcPr>
           <w:p>
@@ -4599,10 +4601,10 @@
             <w:tcW w:type="dxa" w:w="2520"/>
             <w:shd w:fill="F9FBF9"/>
             <w:tcMar>
-              <w:top w:w="70" w:type="dxa"/>
-              <w:bottom w:w="70" w:type="dxa"/>
-              <w:left w:w="80" w:type="dxa"/>
-              <w:right w:w="80" w:type="dxa"/>
+              <w:top w:w="60" w:type="dxa"/>
+              <w:bottom w:w="60" w:type="dxa"/>
+              <w:left w:w="70" w:type="dxa"/>
+              <w:right w:w="70" w:type="dxa"/>
             </w:tcMar>
           </w:tcPr>
           <w:p>
@@ -4620,10 +4622,10 @@
             <w:tcW w:type="dxa" w:w="2520"/>
             <w:shd w:fill="F9FBF9"/>
             <w:tcMar>
-              <w:top w:w="70" w:type="dxa"/>
-              <w:bottom w:w="70" w:type="dxa"/>
-              <w:left w:w="80" w:type="dxa"/>
-              <w:right w:w="80" w:type="dxa"/>
+              <w:top w:w="60" w:type="dxa"/>
+              <w:bottom w:w="60" w:type="dxa"/>
+              <w:left w:w="70" w:type="dxa"/>
+              <w:right w:w="70" w:type="dxa"/>
             </w:tcMar>
           </w:tcPr>
           <w:p>
@@ -4641,10 +4643,10 @@
             <w:tcW w:type="dxa" w:w="2520"/>
             <w:shd w:fill="F9FBF9"/>
             <w:tcMar>
-              <w:top w:w="70" w:type="dxa"/>
-              <w:bottom w:w="70" w:type="dxa"/>
-              <w:left w:w="80" w:type="dxa"/>
-              <w:right w:w="80" w:type="dxa"/>
+              <w:top w:w="60" w:type="dxa"/>
+              <w:bottom w:w="60" w:type="dxa"/>
+              <w:left w:w="70" w:type="dxa"/>
+              <w:right w:w="70" w:type="dxa"/>
             </w:tcMar>
           </w:tcPr>
           <w:p>
@@ -4661,10 +4663,10 @@
             <w:tcW w:type="dxa" w:w="2520"/>
             <w:shd w:fill="F9FBF9"/>
             <w:tcMar>
-              <w:top w:w="70" w:type="dxa"/>
-              <w:bottom w:w="70" w:type="dxa"/>
-              <w:left w:w="80" w:type="dxa"/>
-              <w:right w:w="80" w:type="dxa"/>
+              <w:top w:w="60" w:type="dxa"/>
+              <w:bottom w:w="60" w:type="dxa"/>
+              <w:left w:w="70" w:type="dxa"/>
+              <w:right w:w="70" w:type="dxa"/>
             </w:tcMar>
           </w:tcPr>
           <w:p>
@@ -4683,10 +4685,10 @@
             <w:tcW w:type="dxa" w:w="2520"/>
             <w:shd w:fill="FFFFFF"/>
             <w:tcMar>
-              <w:top w:w="70" w:type="dxa"/>
-              <w:bottom w:w="70" w:type="dxa"/>
-              <w:left w:w="80" w:type="dxa"/>
-              <w:right w:w="80" w:type="dxa"/>
+              <w:top w:w="60" w:type="dxa"/>
+              <w:bottom w:w="60" w:type="dxa"/>
+              <w:left w:w="70" w:type="dxa"/>
+              <w:right w:w="70" w:type="dxa"/>
             </w:tcMar>
           </w:tcPr>
           <w:p>
@@ -4704,10 +4706,10 @@
             <w:tcW w:type="dxa" w:w="2520"/>
             <w:shd w:fill="FFFFFF"/>
             <w:tcMar>
-              <w:top w:w="70" w:type="dxa"/>
-              <w:bottom w:w="70" w:type="dxa"/>
-              <w:left w:w="80" w:type="dxa"/>
-              <w:right w:w="80" w:type="dxa"/>
+              <w:top w:w="60" w:type="dxa"/>
+              <w:bottom w:w="60" w:type="dxa"/>
+              <w:left w:w="70" w:type="dxa"/>
+              <w:right w:w="70" w:type="dxa"/>
             </w:tcMar>
           </w:tcPr>
           <w:p>
@@ -4725,10 +4727,10 @@
             <w:tcW w:type="dxa" w:w="2520"/>
             <w:shd w:fill="FFFFFF"/>
             <w:tcMar>
-              <w:top w:w="70" w:type="dxa"/>
-              <w:bottom w:w="70" w:type="dxa"/>
-              <w:left w:w="80" w:type="dxa"/>
-              <w:right w:w="80" w:type="dxa"/>
+              <w:top w:w="60" w:type="dxa"/>
+              <w:bottom w:w="60" w:type="dxa"/>
+              <w:left w:w="70" w:type="dxa"/>
+              <w:right w:w="70" w:type="dxa"/>
             </w:tcMar>
           </w:tcPr>
           <w:p>
@@ -4745,10 +4747,10 @@
             <w:tcW w:type="dxa" w:w="2520"/>
             <w:shd w:fill="FFFFFF"/>
             <w:tcMar>
-              <w:top w:w="70" w:type="dxa"/>
-              <w:bottom w:w="70" w:type="dxa"/>
-              <w:left w:w="80" w:type="dxa"/>
-              <w:right w:w="80" w:type="dxa"/>
+              <w:top w:w="60" w:type="dxa"/>
+              <w:bottom w:w="60" w:type="dxa"/>
+              <w:left w:w="70" w:type="dxa"/>
+              <w:right w:w="70" w:type="dxa"/>
             </w:tcMar>
           </w:tcPr>
           <w:p>
@@ -4767,10 +4769,10 @@
             <w:tcW w:type="dxa" w:w="2520"/>
             <w:shd w:fill="F9FBF9"/>
             <w:tcMar>
-              <w:top w:w="70" w:type="dxa"/>
-              <w:bottom w:w="70" w:type="dxa"/>
-              <w:left w:w="80" w:type="dxa"/>
-              <w:right w:w="80" w:type="dxa"/>
+              <w:top w:w="60" w:type="dxa"/>
+              <w:bottom w:w="60" w:type="dxa"/>
+              <w:left w:w="70" w:type="dxa"/>
+              <w:right w:w="70" w:type="dxa"/>
             </w:tcMar>
           </w:tcPr>
           <w:p>
@@ -4788,10 +4790,10 @@
             <w:tcW w:type="dxa" w:w="2520"/>
             <w:shd w:fill="F9FBF9"/>
             <w:tcMar>
-              <w:top w:w="70" w:type="dxa"/>
-              <w:bottom w:w="70" w:type="dxa"/>
-              <w:left w:w="80" w:type="dxa"/>
-              <w:right w:w="80" w:type="dxa"/>
+              <w:top w:w="60" w:type="dxa"/>
+              <w:bottom w:w="60" w:type="dxa"/>
+              <w:left w:w="70" w:type="dxa"/>
+              <w:right w:w="70" w:type="dxa"/>
             </w:tcMar>
           </w:tcPr>
           <w:p>
@@ -4809,10 +4811,10 @@
             <w:tcW w:type="dxa" w:w="2520"/>
             <w:shd w:fill="F9FBF9"/>
             <w:tcMar>
-              <w:top w:w="70" w:type="dxa"/>
-              <w:bottom w:w="70" w:type="dxa"/>
-              <w:left w:w="80" w:type="dxa"/>
-              <w:right w:w="80" w:type="dxa"/>
+              <w:top w:w="60" w:type="dxa"/>
+              <w:bottom w:w="60" w:type="dxa"/>
+              <w:left w:w="70" w:type="dxa"/>
+              <w:right w:w="70" w:type="dxa"/>
             </w:tcMar>
           </w:tcPr>
           <w:p>
@@ -4829,10 +4831,10 @@
             <w:tcW w:type="dxa" w:w="2520"/>
             <w:shd w:fill="F9FBF9"/>
             <w:tcMar>
-              <w:top w:w="70" w:type="dxa"/>
-              <w:bottom w:w="70" w:type="dxa"/>
-              <w:left w:w="80" w:type="dxa"/>
-              <w:right w:w="80" w:type="dxa"/>
+              <w:top w:w="60" w:type="dxa"/>
+              <w:bottom w:w="60" w:type="dxa"/>
+              <w:left w:w="70" w:type="dxa"/>
+              <w:right w:w="70" w:type="dxa"/>
             </w:tcMar>
           </w:tcPr>
           <w:p>
@@ -4851,10 +4853,10 @@
             <w:tcW w:type="dxa" w:w="2520"/>
             <w:shd w:fill="FFFFFF"/>
             <w:tcMar>
-              <w:top w:w="70" w:type="dxa"/>
-              <w:bottom w:w="70" w:type="dxa"/>
-              <w:left w:w="80" w:type="dxa"/>
-              <w:right w:w="80" w:type="dxa"/>
+              <w:top w:w="60" w:type="dxa"/>
+              <w:bottom w:w="60" w:type="dxa"/>
+              <w:left w:w="70" w:type="dxa"/>
+              <w:right w:w="70" w:type="dxa"/>
             </w:tcMar>
           </w:tcPr>
           <w:p>
@@ -4872,10 +4874,10 @@
             <w:tcW w:type="dxa" w:w="2520"/>
             <w:shd w:fill="FFFFFF"/>
             <w:tcMar>
-              <w:top w:w="70" w:type="dxa"/>
-              <w:bottom w:w="70" w:type="dxa"/>
-              <w:left w:w="80" w:type="dxa"/>
-              <w:right w:w="80" w:type="dxa"/>
+              <w:top w:w="60" w:type="dxa"/>
+              <w:bottom w:w="60" w:type="dxa"/>
+              <w:left w:w="70" w:type="dxa"/>
+              <w:right w:w="70" w:type="dxa"/>
             </w:tcMar>
           </w:tcPr>
           <w:p>
@@ -4893,10 +4895,10 @@
             <w:tcW w:type="dxa" w:w="2520"/>
             <w:shd w:fill="FFFFFF"/>
             <w:tcMar>
-              <w:top w:w="70" w:type="dxa"/>
-              <w:bottom w:w="70" w:type="dxa"/>
-              <w:left w:w="80" w:type="dxa"/>
-              <w:right w:w="80" w:type="dxa"/>
+              <w:top w:w="60" w:type="dxa"/>
+              <w:bottom w:w="60" w:type="dxa"/>
+              <w:left w:w="70" w:type="dxa"/>
+              <w:right w:w="70" w:type="dxa"/>
             </w:tcMar>
           </w:tcPr>
           <w:p>
@@ -4913,10 +4915,10 @@
             <w:tcW w:type="dxa" w:w="2520"/>
             <w:shd w:fill="FFFFFF"/>
             <w:tcMar>
-              <w:top w:w="70" w:type="dxa"/>
-              <w:bottom w:w="70" w:type="dxa"/>
-              <w:left w:w="80" w:type="dxa"/>
-              <w:right w:w="80" w:type="dxa"/>
+              <w:top w:w="60" w:type="dxa"/>
+              <w:bottom w:w="60" w:type="dxa"/>
+              <w:left w:w="70" w:type="dxa"/>
+              <w:right w:w="70" w:type="dxa"/>
             </w:tcMar>
           </w:tcPr>
           <w:p>
@@ -4935,10 +4937,10 @@
             <w:tcW w:type="dxa" w:w="2520"/>
             <w:shd w:fill="F9FBF9"/>
             <w:tcMar>
-              <w:top w:w="70" w:type="dxa"/>
-              <w:bottom w:w="70" w:type="dxa"/>
-              <w:left w:w="80" w:type="dxa"/>
-              <w:right w:w="80" w:type="dxa"/>
+              <w:top w:w="60" w:type="dxa"/>
+              <w:bottom w:w="60" w:type="dxa"/>
+              <w:left w:w="70" w:type="dxa"/>
+              <w:right w:w="70" w:type="dxa"/>
             </w:tcMar>
           </w:tcPr>
           <w:p>
@@ -4956,10 +4958,10 @@
             <w:tcW w:type="dxa" w:w="2520"/>
             <w:shd w:fill="F9FBF9"/>
             <w:tcMar>
-              <w:top w:w="70" w:type="dxa"/>
-              <w:bottom w:w="70" w:type="dxa"/>
-              <w:left w:w="80" w:type="dxa"/>
-              <w:right w:w="80" w:type="dxa"/>
+              <w:top w:w="60" w:type="dxa"/>
+              <w:bottom w:w="60" w:type="dxa"/>
+              <w:left w:w="70" w:type="dxa"/>
+              <w:right w:w="70" w:type="dxa"/>
             </w:tcMar>
           </w:tcPr>
           <w:p>
@@ -4977,10 +4979,10 @@
             <w:tcW w:type="dxa" w:w="2520"/>
             <w:shd w:fill="F9FBF9"/>
             <w:tcMar>
-              <w:top w:w="70" w:type="dxa"/>
-              <w:bottom w:w="70" w:type="dxa"/>
-              <w:left w:w="80" w:type="dxa"/>
-              <w:right w:w="80" w:type="dxa"/>
+              <w:top w:w="60" w:type="dxa"/>
+              <w:bottom w:w="60" w:type="dxa"/>
+              <w:left w:w="70" w:type="dxa"/>
+              <w:right w:w="70" w:type="dxa"/>
             </w:tcMar>
           </w:tcPr>
           <w:p>
@@ -4997,10 +4999,10 @@
             <w:tcW w:type="dxa" w:w="2520"/>
             <w:shd w:fill="F9FBF9"/>
             <w:tcMar>
-              <w:top w:w="70" w:type="dxa"/>
-              <w:bottom w:w="70" w:type="dxa"/>
-              <w:left w:w="80" w:type="dxa"/>
-              <w:right w:w="80" w:type="dxa"/>
+              <w:top w:w="60" w:type="dxa"/>
+              <w:bottom w:w="60" w:type="dxa"/>
+              <w:left w:w="70" w:type="dxa"/>
+              <w:right w:w="70" w:type="dxa"/>
             </w:tcMar>
           </w:tcPr>
           <w:p>
@@ -5019,10 +5021,10 @@
             <w:tcW w:type="dxa" w:w="2520"/>
             <w:shd w:fill="FFFFFF"/>
             <w:tcMar>
-              <w:top w:w="70" w:type="dxa"/>
-              <w:bottom w:w="70" w:type="dxa"/>
-              <w:left w:w="80" w:type="dxa"/>
-              <w:right w:w="80" w:type="dxa"/>
+              <w:top w:w="60" w:type="dxa"/>
+              <w:bottom w:w="60" w:type="dxa"/>
+              <w:left w:w="70" w:type="dxa"/>
+              <w:right w:w="70" w:type="dxa"/>
             </w:tcMar>
           </w:tcPr>
           <w:p>
@@ -5040,10 +5042,10 @@
             <w:tcW w:type="dxa" w:w="2520"/>
             <w:shd w:fill="FFFFFF"/>
             <w:tcMar>
-              <w:top w:w="70" w:type="dxa"/>
-              <w:bottom w:w="70" w:type="dxa"/>
-              <w:left w:w="80" w:type="dxa"/>
-              <w:right w:w="80" w:type="dxa"/>
+              <w:top w:w="60" w:type="dxa"/>
+              <w:bottom w:w="60" w:type="dxa"/>
+              <w:left w:w="70" w:type="dxa"/>
+              <w:right w:w="70" w:type="dxa"/>
             </w:tcMar>
           </w:tcPr>
           <w:p>
@@ -5061,10 +5063,10 @@
             <w:tcW w:type="dxa" w:w="2520"/>
             <w:shd w:fill="FFFFFF"/>
             <w:tcMar>
-              <w:top w:w="70" w:type="dxa"/>
-              <w:bottom w:w="70" w:type="dxa"/>
-              <w:left w:w="80" w:type="dxa"/>
-              <w:right w:w="80" w:type="dxa"/>
+              <w:top w:w="60" w:type="dxa"/>
+              <w:bottom w:w="60" w:type="dxa"/>
+              <w:left w:w="70" w:type="dxa"/>
+              <w:right w:w="70" w:type="dxa"/>
             </w:tcMar>
           </w:tcPr>
           <w:p>
@@ -5081,10 +5083,10 @@
             <w:tcW w:type="dxa" w:w="2520"/>
             <w:shd w:fill="FFFFFF"/>
             <w:tcMar>
-              <w:top w:w="70" w:type="dxa"/>
-              <w:bottom w:w="70" w:type="dxa"/>
-              <w:left w:w="80" w:type="dxa"/>
-              <w:right w:w="80" w:type="dxa"/>
+              <w:top w:w="60" w:type="dxa"/>
+              <w:bottom w:w="60" w:type="dxa"/>
+              <w:left w:w="70" w:type="dxa"/>
+              <w:right w:w="70" w:type="dxa"/>
             </w:tcMar>
           </w:tcPr>
           <w:p>
@@ -5103,10 +5105,10 @@
             <w:tcW w:type="dxa" w:w="2520"/>
             <w:shd w:fill="F9FBF9"/>
             <w:tcMar>
-              <w:top w:w="70" w:type="dxa"/>
-              <w:bottom w:w="70" w:type="dxa"/>
-              <w:left w:w="80" w:type="dxa"/>
-              <w:right w:w="80" w:type="dxa"/>
+              <w:top w:w="60" w:type="dxa"/>
+              <w:bottom w:w="60" w:type="dxa"/>
+              <w:left w:w="70" w:type="dxa"/>
+              <w:right w:w="70" w:type="dxa"/>
             </w:tcMar>
           </w:tcPr>
           <w:p>
@@ -5124,10 +5126,10 @@
             <w:tcW w:type="dxa" w:w="2520"/>
             <w:shd w:fill="F9FBF9"/>
             <w:tcMar>
-              <w:top w:w="70" w:type="dxa"/>
-              <w:bottom w:w="70" w:type="dxa"/>
-              <w:left w:w="80" w:type="dxa"/>
-              <w:right w:w="80" w:type="dxa"/>
+              <w:top w:w="60" w:type="dxa"/>
+              <w:bottom w:w="60" w:type="dxa"/>
+              <w:left w:w="70" w:type="dxa"/>
+              <w:right w:w="70" w:type="dxa"/>
             </w:tcMar>
           </w:tcPr>
           <w:p>
@@ -5145,10 +5147,10 @@
             <w:tcW w:type="dxa" w:w="2520"/>
             <w:shd w:fill="F9FBF9"/>
             <w:tcMar>
-              <w:top w:w="70" w:type="dxa"/>
-              <w:bottom w:w="70" w:type="dxa"/>
-              <w:left w:w="80" w:type="dxa"/>
-              <w:right w:w="80" w:type="dxa"/>
+              <w:top w:w="60" w:type="dxa"/>
+              <w:bottom w:w="60" w:type="dxa"/>
+              <w:left w:w="70" w:type="dxa"/>
+              <w:right w:w="70" w:type="dxa"/>
             </w:tcMar>
           </w:tcPr>
           <w:p>
@@ -5165,10 +5167,10 @@
             <w:tcW w:type="dxa" w:w="2520"/>
             <w:shd w:fill="F9FBF9"/>
             <w:tcMar>
-              <w:top w:w="70" w:type="dxa"/>
-              <w:bottom w:w="70" w:type="dxa"/>
-              <w:left w:w="80" w:type="dxa"/>
-              <w:right w:w="80" w:type="dxa"/>
+              <w:top w:w="60" w:type="dxa"/>
+              <w:bottom w:w="60" w:type="dxa"/>
+              <w:left w:w="70" w:type="dxa"/>
+              <w:right w:w="70" w:type="dxa"/>
             </w:tcMar>
           </w:tcPr>
           <w:p>
@@ -5187,10 +5189,10 @@
             <w:tcW w:type="dxa" w:w="2520"/>
             <w:shd w:fill="FFFFFF"/>
             <w:tcMar>
-              <w:top w:w="70" w:type="dxa"/>
-              <w:bottom w:w="70" w:type="dxa"/>
-              <w:left w:w="80" w:type="dxa"/>
-              <w:right w:w="80" w:type="dxa"/>
+              <w:top w:w="60" w:type="dxa"/>
+              <w:bottom w:w="60" w:type="dxa"/>
+              <w:left w:w="70" w:type="dxa"/>
+              <w:right w:w="70" w:type="dxa"/>
             </w:tcMar>
           </w:tcPr>
           <w:p>
@@ -5208,10 +5210,10 @@
             <w:tcW w:type="dxa" w:w="2520"/>
             <w:shd w:fill="FFFFFF"/>
             <w:tcMar>
-              <w:top w:w="70" w:type="dxa"/>
-              <w:bottom w:w="70" w:type="dxa"/>
-              <w:left w:w="80" w:type="dxa"/>
-              <w:right w:w="80" w:type="dxa"/>
+              <w:top w:w="60" w:type="dxa"/>
+              <w:bottom w:w="60" w:type="dxa"/>
+              <w:left w:w="70" w:type="dxa"/>
+              <w:right w:w="70" w:type="dxa"/>
             </w:tcMar>
           </w:tcPr>
           <w:p>
@@ -5229,10 +5231,10 @@
             <w:tcW w:type="dxa" w:w="2520"/>
             <w:shd w:fill="FFFFFF"/>
             <w:tcMar>
-              <w:top w:w="70" w:type="dxa"/>
-              <w:bottom w:w="70" w:type="dxa"/>
-              <w:left w:w="80" w:type="dxa"/>
-              <w:right w:w="80" w:type="dxa"/>
+              <w:top w:w="60" w:type="dxa"/>
+              <w:bottom w:w="60" w:type="dxa"/>
+              <w:left w:w="70" w:type="dxa"/>
+              <w:right w:w="70" w:type="dxa"/>
             </w:tcMar>
           </w:tcPr>
           <w:p>
@@ -5249,10 +5251,10 @@
             <w:tcW w:type="dxa" w:w="2520"/>
             <w:shd w:fill="FFFFFF"/>
             <w:tcMar>
-              <w:top w:w="70" w:type="dxa"/>
-              <w:bottom w:w="70" w:type="dxa"/>
-              <w:left w:w="80" w:type="dxa"/>
-              <w:right w:w="80" w:type="dxa"/>
+              <w:top w:w="60" w:type="dxa"/>
+              <w:bottom w:w="60" w:type="dxa"/>
+              <w:left w:w="70" w:type="dxa"/>
+              <w:right w:w="70" w:type="dxa"/>
             </w:tcMar>
           </w:tcPr>
           <w:p>
@@ -5271,10 +5273,10 @@
             <w:tcW w:type="dxa" w:w="2520"/>
             <w:shd w:fill="F9FBF9"/>
             <w:tcMar>
-              <w:top w:w="70" w:type="dxa"/>
-              <w:bottom w:w="70" w:type="dxa"/>
-              <w:left w:w="80" w:type="dxa"/>
-              <w:right w:w="80" w:type="dxa"/>
+              <w:top w:w="60" w:type="dxa"/>
+              <w:bottom w:w="60" w:type="dxa"/>
+              <w:left w:w="70" w:type="dxa"/>
+              <w:right w:w="70" w:type="dxa"/>
             </w:tcMar>
           </w:tcPr>
           <w:p>
@@ -5292,10 +5294,10 @@
             <w:tcW w:type="dxa" w:w="2520"/>
             <w:shd w:fill="F9FBF9"/>
             <w:tcMar>
-              <w:top w:w="70" w:type="dxa"/>
-              <w:bottom w:w="70" w:type="dxa"/>
-              <w:left w:w="80" w:type="dxa"/>
-              <w:right w:w="80" w:type="dxa"/>
+              <w:top w:w="60" w:type="dxa"/>
+              <w:bottom w:w="60" w:type="dxa"/>
+              <w:left w:w="70" w:type="dxa"/>
+              <w:right w:w="70" w:type="dxa"/>
             </w:tcMar>
           </w:tcPr>
           <w:p>
@@ -5313,10 +5315,10 @@
             <w:tcW w:type="dxa" w:w="2520"/>
             <w:shd w:fill="F9FBF9"/>
             <w:tcMar>
-              <w:top w:w="70" w:type="dxa"/>
-              <w:bottom w:w="70" w:type="dxa"/>
-              <w:left w:w="80" w:type="dxa"/>
-              <w:right w:w="80" w:type="dxa"/>
+              <w:top w:w="60" w:type="dxa"/>
+              <w:bottom w:w="60" w:type="dxa"/>
+              <w:left w:w="70" w:type="dxa"/>
+              <w:right w:w="70" w:type="dxa"/>
             </w:tcMar>
           </w:tcPr>
           <w:p>
@@ -5333,10 +5335,10 @@
             <w:tcW w:type="dxa" w:w="2520"/>
             <w:shd w:fill="F9FBF9"/>
             <w:tcMar>
-              <w:top w:w="70" w:type="dxa"/>
-              <w:bottom w:w="70" w:type="dxa"/>
-              <w:left w:w="80" w:type="dxa"/>
-              <w:right w:w="80" w:type="dxa"/>
+              <w:top w:w="60" w:type="dxa"/>
+              <w:bottom w:w="60" w:type="dxa"/>
+              <w:left w:w="70" w:type="dxa"/>
+              <w:right w:w="70" w:type="dxa"/>
             </w:tcMar>
           </w:tcPr>
           <w:p>
@@ -5355,10 +5357,10 @@
             <w:tcW w:type="dxa" w:w="2520"/>
             <w:shd w:fill="FFFFFF"/>
             <w:tcMar>
-              <w:top w:w="70" w:type="dxa"/>
-              <w:bottom w:w="70" w:type="dxa"/>
-              <w:left w:w="80" w:type="dxa"/>
-              <w:right w:w="80" w:type="dxa"/>
+              <w:top w:w="60" w:type="dxa"/>
+              <w:bottom w:w="60" w:type="dxa"/>
+              <w:left w:w="70" w:type="dxa"/>
+              <w:right w:w="70" w:type="dxa"/>
             </w:tcMar>
           </w:tcPr>
           <w:p>
@@ -5376,10 +5378,10 @@
             <w:tcW w:type="dxa" w:w="2520"/>
             <w:shd w:fill="FFFFFF"/>
             <w:tcMar>
-              <w:top w:w="70" w:type="dxa"/>
-              <w:bottom w:w="70" w:type="dxa"/>
-              <w:left w:w="80" w:type="dxa"/>
-              <w:right w:w="80" w:type="dxa"/>
+              <w:top w:w="60" w:type="dxa"/>
+              <w:bottom w:w="60" w:type="dxa"/>
+              <w:left w:w="70" w:type="dxa"/>
+              <w:right w:w="70" w:type="dxa"/>
             </w:tcMar>
           </w:tcPr>
           <w:p>
@@ -5397,10 +5399,10 @@
             <w:tcW w:type="dxa" w:w="2520"/>
             <w:shd w:fill="FFFFFF"/>
             <w:tcMar>
-              <w:top w:w="70" w:type="dxa"/>
-              <w:bottom w:w="70" w:type="dxa"/>
-              <w:left w:w="80" w:type="dxa"/>
-              <w:right w:w="80" w:type="dxa"/>
+              <w:top w:w="60" w:type="dxa"/>
+              <w:bottom w:w="60" w:type="dxa"/>
+              <w:left w:w="70" w:type="dxa"/>
+              <w:right w:w="70" w:type="dxa"/>
             </w:tcMar>
           </w:tcPr>
           <w:p>
@@ -5417,10 +5419,10 @@
             <w:tcW w:type="dxa" w:w="2520"/>
             <w:shd w:fill="FFFFFF"/>
             <w:tcMar>
-              <w:top w:w="70" w:type="dxa"/>
-              <w:bottom w:w="70" w:type="dxa"/>
-              <w:left w:w="80" w:type="dxa"/>
-              <w:right w:w="80" w:type="dxa"/>
+              <w:top w:w="60" w:type="dxa"/>
+              <w:bottom w:w="60" w:type="dxa"/>
+              <w:left w:w="70" w:type="dxa"/>
+              <w:right w:w="70" w:type="dxa"/>
             </w:tcMar>
           </w:tcPr>
           <w:p>
@@ -5439,10 +5441,10 @@
             <w:tcW w:type="dxa" w:w="2520"/>
             <w:shd w:fill="F9FBF9"/>
             <w:tcMar>
-              <w:top w:w="70" w:type="dxa"/>
-              <w:bottom w:w="70" w:type="dxa"/>
-              <w:left w:w="80" w:type="dxa"/>
-              <w:right w:w="80" w:type="dxa"/>
+              <w:top w:w="60" w:type="dxa"/>
+              <w:bottom w:w="60" w:type="dxa"/>
+              <w:left w:w="70" w:type="dxa"/>
+              <w:right w:w="70" w:type="dxa"/>
             </w:tcMar>
           </w:tcPr>
           <w:p>
@@ -5460,10 +5462,10 @@
             <w:tcW w:type="dxa" w:w="2520"/>
             <w:shd w:fill="F9FBF9"/>
             <w:tcMar>
-              <w:top w:w="70" w:type="dxa"/>
-              <w:bottom w:w="70" w:type="dxa"/>
-              <w:left w:w="80" w:type="dxa"/>
-              <w:right w:w="80" w:type="dxa"/>
+              <w:top w:w="60" w:type="dxa"/>
+              <w:bottom w:w="60" w:type="dxa"/>
+              <w:left w:w="70" w:type="dxa"/>
+              <w:right w:w="70" w:type="dxa"/>
             </w:tcMar>
           </w:tcPr>
           <w:p>
@@ -5481,10 +5483,10 @@
             <w:tcW w:type="dxa" w:w="2520"/>
             <w:shd w:fill="F9FBF9"/>
             <w:tcMar>
-              <w:top w:w="70" w:type="dxa"/>
-              <w:bottom w:w="70" w:type="dxa"/>
-              <w:left w:w="80" w:type="dxa"/>
-              <w:right w:w="80" w:type="dxa"/>
+              <w:top w:w="60" w:type="dxa"/>
+              <w:bottom w:w="60" w:type="dxa"/>
+              <w:left w:w="70" w:type="dxa"/>
+              <w:right w:w="70" w:type="dxa"/>
             </w:tcMar>
           </w:tcPr>
           <w:p>
@@ -5501,10 +5503,10 @@
             <w:tcW w:type="dxa" w:w="2520"/>
             <w:shd w:fill="F9FBF9"/>
             <w:tcMar>
-              <w:top w:w="70" w:type="dxa"/>
-              <w:bottom w:w="70" w:type="dxa"/>
-              <w:left w:w="80" w:type="dxa"/>
-              <w:right w:w="80" w:type="dxa"/>
+              <w:top w:w="60" w:type="dxa"/>
+              <w:bottom w:w="60" w:type="dxa"/>
+              <w:left w:w="70" w:type="dxa"/>
+              <w:right w:w="70" w:type="dxa"/>
             </w:tcMar>
           </w:tcPr>
           <w:p>
@@ -5523,10 +5525,10 @@
             <w:tcW w:type="dxa" w:w="2520"/>
             <w:shd w:fill="FFFFFF"/>
             <w:tcMar>
-              <w:top w:w="70" w:type="dxa"/>
-              <w:bottom w:w="70" w:type="dxa"/>
-              <w:left w:w="80" w:type="dxa"/>
-              <w:right w:w="80" w:type="dxa"/>
+              <w:top w:w="60" w:type="dxa"/>
+              <w:bottom w:w="60" w:type="dxa"/>
+              <w:left w:w="70" w:type="dxa"/>
+              <w:right w:w="70" w:type="dxa"/>
             </w:tcMar>
           </w:tcPr>
           <w:p>
@@ -5544,10 +5546,10 @@
             <w:tcW w:type="dxa" w:w="2520"/>
             <w:shd w:fill="FFFFFF"/>
             <w:tcMar>
-              <w:top w:w="70" w:type="dxa"/>
-              <w:bottom w:w="70" w:type="dxa"/>
-              <w:left w:w="80" w:type="dxa"/>
-              <w:right w:w="80" w:type="dxa"/>
+              <w:top w:w="60" w:type="dxa"/>
+              <w:bottom w:w="60" w:type="dxa"/>
+              <w:left w:w="70" w:type="dxa"/>
+              <w:right w:w="70" w:type="dxa"/>
             </w:tcMar>
           </w:tcPr>
           <w:p>
@@ -5565,10 +5567,10 @@
             <w:tcW w:type="dxa" w:w="2520"/>
             <w:shd w:fill="FFFFFF"/>
             <w:tcMar>
-              <w:top w:w="70" w:type="dxa"/>
-              <w:bottom w:w="70" w:type="dxa"/>
-              <w:left w:w="80" w:type="dxa"/>
-              <w:right w:w="80" w:type="dxa"/>
+              <w:top w:w="60" w:type="dxa"/>
+              <w:bottom w:w="60" w:type="dxa"/>
+              <w:left w:w="70" w:type="dxa"/>
+              <w:right w:w="70" w:type="dxa"/>
             </w:tcMar>
           </w:tcPr>
           <w:p>
@@ -5585,10 +5587,10 @@
             <w:tcW w:type="dxa" w:w="2520"/>
             <w:shd w:fill="FFFFFF"/>
             <w:tcMar>
-              <w:top w:w="70" w:type="dxa"/>
-              <w:bottom w:w="70" w:type="dxa"/>
-              <w:left w:w="80" w:type="dxa"/>
-              <w:right w:w="80" w:type="dxa"/>
+              <w:top w:w="60" w:type="dxa"/>
+              <w:bottom w:w="60" w:type="dxa"/>
+              <w:left w:w="70" w:type="dxa"/>
+              <w:right w:w="70" w:type="dxa"/>
             </w:tcMar>
           </w:tcPr>
           <w:p>
@@ -5627,10 +5629,6 @@
         <w:t>This occurs due to two foundational Machine Learning principles:</w:t>
         <w:br/>
         <w:br/>
-      </w:r>
-    </w:p>
-    <w:p>
-      <w:r>
         <w:t>1. The Closed-World Assumption (Softmax Function):</w:t>
         <w:br/>
         <w:t>The mathematical formula for the final layer is:</w:t>
@@ -5638,17 +5636,13 @@
         <w:t xml:space="preserve">   P(class_i) = exp(z_i) / SUM(exp(z_j)) for j = 1 to 15</w:t>
         <w:br/>
         <w:t>The probabilities across all 15 classes are mathematically compelled to sum to 1.0 (100%). The model possesses no 'Unknown' or 'None of the Above' neuron. It cannot say 'This is Wheat' because Wheat was never defined in its mathematical universe.</w:t>
-      </w:r>
-    </w:p>
-    <w:p>
-      <w:r>
+        <w:br/>
+        <w:br/>
         <w:t>2. Feature Similarity Overlap:</w:t>
         <w:br/>
         <w:t>Wheat Rust produces small, raised, orange-brown necrotic pustules on green plant tissue. When the convolutional feature maps look at low-level edge and color textures (small circular brownish spots against plant chlorophyll), the closest match in its training set is Pepper Bell Bacterial Spot. Softmax exponentiates the logits, converting this nearest-neighbor match into an artificially high 95%+ confidence score.</w:t>
-      </w:r>
-    </w:p>
-    <w:p>
-      <w:r>
+        <w:br/>
+        <w:br/>
         <w:t>3. Downstream Consequence:</w:t>
         <w:br/>
         <w:t>The downstream agronomic system trusts the CNN output and issues a prescription for Pepper Bacterial Spot (Copper sprays). For wheat farmers, this is completely wrong, because Wheat Rust requires Triazole fungicides (Propiconazole, Tebuconazole).</w:t>
@@ -5668,7 +5662,558 @@
         <w:rPr>
           <w:color w:val="1B5E20"/>
         </w:rPr>
-        <w:t>5. Step-by-Step Code Instructions</w:t>
+        <w:t>5. Leaf Color Combinations (LCC) &amp; Leaf Color Chart: Architectural Feasibility &amp; Analysis</w:t>
+      </w:r>
+    </w:p>
+    <w:p>
+      <w:pPr>
+        <w:spacing w:after="160"/>
+      </w:pPr>
+      <w:r>
+        <w:t>In agricultural computing, 'LCC' holds two distinct meanings: (A) Digital Leaf Color Combinations (color space transforms like HSV, LAB, and botanical indices), and (B) the physical Leaf Color Chart (a 4-to-6 green shade ruler developed by IRRI/ICAR for Nitrogen management). Below is the comprehensive academic and architectural evaluation of whether LCC should be integrated into the deep learning model.</w:t>
+      </w:r>
+    </w:p>
+    <w:p>
+      <w:pPr>
+        <w:pStyle w:val="Heading2"/>
+      </w:pPr>
+      <w:r>
+        <w:rPr>
+          <w:color w:val="2E7D32"/>
+        </w:rPr>
+        <w:t>5.1 Technical Approaches to Using Color Combinations</w:t>
+      </w:r>
+    </w:p>
+    <w:p>
+      <w:r>
+        <w:t>1. Botanical Color Spaces (HSV &amp; LAB): HSV separates pure Hue (chromatic identity) from Value (illumination brightness). LAB separates Luminance (L*) from Green-Red (a*) and Blue-Yellow (b*) color opponent axes.</w:t>
+        <w:br/>
+        <w:t>2. Agronomic Color Indices:</w:t>
+        <w:br/>
+        <w:t xml:space="preserve">   • ExG (Excess Green Index) = 2G - R - B: Separates plant biomass from background soil.</w:t>
+        <w:br/>
+        <w:t xml:space="preserve">   • GLI (Green Leaf Index) = (2G - R - B) / (2G + R + B): Normalizes chlorophyll reflectance.</w:t>
+        <w:br/>
+        <w:t xml:space="preserve">   • VARI (Visible Atmospherically Resistant Index) = (G - R) / (G + R - B): Compensates for ambient sunlight haze.</w:t>
+        <w:br/>
+        <w:t>3. Multi-Channel Tensor Stacking: Stacking 6 channels (RGB + HSV or RGB + LAB) into the initial convolutional input layer.</w:t>
+        <w:br/>
+        <w:t>4. Lesion-to-Foliage Pixel Masking: Using color thresholding to segment healthy green pixels vs. necrotic brown/black pixels.</w:t>
+      </w:r>
+    </w:p>
+    <w:p>
+      <w:pPr>
+        <w:pStyle w:val="Heading2"/>
+      </w:pPr>
+      <w:r>
+        <w:rPr>
+          <w:color w:val="2E7D32"/>
+        </w:rPr>
+        <w:t>5.2 Where LCC / Color Combinations are HIGHLY VALUABLE (Worth It)</w:t>
+      </w:r>
+    </w:p>
+    <w:p>
+      <w:r>
+        <w:t>• Disease Severity &amp; Damage Quantification: CNNs excel at classification ('what is the disease?'), but struggle to count the exact square millimeters of damaged tissue. Color segmentation in HSV precisely computes necrotic surface area (e.g. 'Necrotic Foliage: 29.2%'). This is 100% worth it.</w:t>
+        <w:br/>
+        <w:t>• Botanical &amp; Out-of-Distribution Guardrails: Rejecting human hands, clothes, tractors, and walls before images reach the CNN. Using YCbCr skin chrominance + GLI foliage coverage prevents catastrophic misdiagnoses.</w:t>
+        <w:br/>
+        <w:t>• Nitrogen &amp; Fertilizer Guidance (The True Purpose of Agronomic LCC): The IRRI/ICAR Leaf Color Chart is the international standard for real-time Nitrogen (N) management. Shade 1-2 indicates nitrogen deficiency requiring Urea foliar application; Shade 3-4 indicates optimal nutrition; Shade 5+ indicates excess nitrogen, which increases sucking pest vulnerability.</w:t>
+      </w:r>
+    </w:p>
+    <w:p>
+      <w:pPr>
+        <w:pStyle w:val="Heading2"/>
+      </w:pPr>
+      <w:r>
+        <w:rPr>
+          <w:color w:val="2E7D32"/>
+        </w:rPr>
+        <w:t>5.3 Critical Limitations: Why LCC Cannot Replace CNN for Disease Diagnosis</w:t>
+      </w:r>
+    </w:p>
+    <w:p>
+      <w:r>
+        <w:t>• Ambient Sunlight &amp; White Balance Vulnerability: In outdoor fields, morning light, direct noon sun, cloudy overcast, and shadow create extreme RGB shifts on the exact same leaf. Fixed color thresholds fail catastrophically in unconstrained field photography.</w:t>
+        <w:br/>
+        <w:t>• Pathological Color Overlap: In plant biology, almost all diseases produce the identical three colors: Chlorosis (Yellow), Necrosis (Brown/Black), and Pustules (Orange). Early Blight, Late Blight, Bacterial Spot, and Septoria Spot share the exact same color palette! Only spatial geometry (concentric rings, angular margins, circular specks) differentiates them.</w:t>
+        <w:br/>
+        <w:t>• Feature Redundancy in CNNs: MobileNetV2's initial convolutional layers already learn color opponency filters automatically. Manually stacking color indices adds negligible accuracy (typically &lt; 0.8%) while substantially increasing computational overhead.</w:t>
+      </w:r>
+    </w:p>
+    <w:p>
+      <w:pPr>
+        <w:pStyle w:val="Heading2"/>
+      </w:pPr>
+      <w:r>
+        <w:rPr>
+          <w:color w:val="2E7D32"/>
+        </w:rPr>
+        <w:t>5.4 Comparative Evaluation Matrix (For Academic / Project Discussion)</w:t>
+      </w:r>
+    </w:p>
+    <w:tbl>
+      <w:tblPr>
+        <w:tblW w:type="auto" w:w="0"/>
+        <w:jc w:val="center"/>
+        <w:tblLook w:firstColumn="1" w:firstRow="1" w:lastColumn="0" w:lastRow="0" w:noHBand="0" w:noVBand="1" w:val="04A0"/>
+      </w:tblPr>
+      <w:tblGrid>
+        <w:gridCol w:w="2520"/>
+        <w:gridCol w:w="2520"/>
+        <w:gridCol w:w="2520"/>
+        <w:gridCol w:w="2520"/>
+      </w:tblGrid>
+      <w:tr>
+        <w:tc>
+          <w:tcPr>
+            <w:tcW w:type="dxa" w:w="2520"/>
+            <w:shd w:fill="1B5E20"/>
+            <w:tcMar>
+              <w:top w:w="100" w:type="dxa"/>
+              <w:bottom w:w="100" w:type="dxa"/>
+              <w:left w:w="90" w:type="dxa"/>
+              <w:right w:w="90" w:type="dxa"/>
+            </w:tcMar>
+          </w:tcPr>
+          <w:p>
+            <w:r>
+              <w:rPr>
+                <w:b/>
+                <w:color w:val="FFFFFF"/>
+                <w:sz w:val="18"/>
+              </w:rPr>
+              <w:t>Approach</w:t>
+            </w:r>
+          </w:p>
+        </w:tc>
+        <w:tc>
+          <w:tcPr>
+            <w:tcW w:type="dxa" w:w="2520"/>
+            <w:shd w:fill="1B5E20"/>
+            <w:tcMar>
+              <w:top w:w="100" w:type="dxa"/>
+              <w:bottom w:w="100" w:type="dxa"/>
+              <w:left w:w="90" w:type="dxa"/>
+              <w:right w:w="90" w:type="dxa"/>
+            </w:tcMar>
+          </w:tcPr>
+          <w:p>
+            <w:r>
+              <w:rPr>
+                <w:b/>
+                <w:color w:val="FFFFFF"/>
+                <w:sz w:val="18"/>
+              </w:rPr>
+              <w:t>Primary Strength</w:t>
+            </w:r>
+          </w:p>
+        </w:tc>
+        <w:tc>
+          <w:tcPr>
+            <w:tcW w:type="dxa" w:w="2520"/>
+            <w:shd w:fill="1B5E20"/>
+            <w:tcMar>
+              <w:top w:w="100" w:type="dxa"/>
+              <w:bottom w:w="100" w:type="dxa"/>
+              <w:left w:w="90" w:type="dxa"/>
+              <w:right w:w="90" w:type="dxa"/>
+            </w:tcMar>
+          </w:tcPr>
+          <w:p>
+            <w:r>
+              <w:rPr>
+                <w:b/>
+                <w:color w:val="FFFFFF"/>
+                <w:sz w:val="18"/>
+              </w:rPr>
+              <w:t>Key Technical Limitation</w:t>
+            </w:r>
+          </w:p>
+        </w:tc>
+        <w:tc>
+          <w:tcPr>
+            <w:tcW w:type="dxa" w:w="2520"/>
+            <w:shd w:fill="1B5E20"/>
+            <w:tcMar>
+              <w:top w:w="100" w:type="dxa"/>
+              <w:bottom w:w="100" w:type="dxa"/>
+              <w:left w:w="90" w:type="dxa"/>
+              <w:right w:w="90" w:type="dxa"/>
+            </w:tcMar>
+          </w:tcPr>
+          <w:p>
+            <w:r>
+              <w:rPr>
+                <w:b/>
+                <w:color w:val="FFFFFF"/>
+                <w:sz w:val="18"/>
+              </w:rPr>
+              <w:t>Academic Verdict</w:t>
+            </w:r>
+          </w:p>
+        </w:tc>
+      </w:tr>
+      <w:tr>
+        <w:tc>
+          <w:tcPr>
+            <w:tcW w:type="dxa" w:w="2520"/>
+            <w:shd w:fill="FFFFFF"/>
+            <w:tcMar>
+              <w:top w:w="60" w:type="dxa"/>
+              <w:bottom w:w="60" w:type="dxa"/>
+              <w:left w:w="70" w:type="dxa"/>
+              <w:right w:w="70" w:type="dxa"/>
+            </w:tcMar>
+          </w:tcPr>
+          <w:p>
+            <w:r>
+              <w:rPr>
+                <w:b/>
+                <w:sz w:val="17"/>
+              </w:rPr>
+              <w:t>CNN Deep Learning</w:t>
+              <w:br/>
+              <w:t>(MobileNetV2)</w:t>
+            </w:r>
+          </w:p>
+        </w:tc>
+        <w:tc>
+          <w:tcPr>
+            <w:tcW w:type="dxa" w:w="2520"/>
+            <w:shd w:fill="FFFFFF"/>
+            <w:tcMar>
+              <w:top w:w="60" w:type="dxa"/>
+              <w:bottom w:w="60" w:type="dxa"/>
+              <w:left w:w="70" w:type="dxa"/>
+              <w:right w:w="70" w:type="dxa"/>
+            </w:tcMar>
+          </w:tcPr>
+          <w:p>
+            <w:r>
+              <w:rPr>
+                <w:sz w:val="17"/>
+              </w:rPr>
+              <w:t>Extracts complex spatial textures (concentric rings, pustules, shapes, margins)</w:t>
+            </w:r>
+          </w:p>
+        </w:tc>
+        <w:tc>
+          <w:tcPr>
+            <w:tcW w:type="dxa" w:w="2520"/>
+            <w:shd w:fill="FFFFFF"/>
+            <w:tcMar>
+              <w:top w:w="60" w:type="dxa"/>
+              <w:bottom w:w="60" w:type="dxa"/>
+              <w:left w:w="70" w:type="dxa"/>
+              <w:right w:w="70" w:type="dxa"/>
+            </w:tcMar>
+          </w:tcPr>
+          <w:p>
+            <w:r>
+              <w:rPr>
+                <w:sz w:val="17"/>
+              </w:rPr>
+              <w:t>Requires GPU for training; acts as a 'black box' without Grad-CAM explanation</w:t>
+            </w:r>
+          </w:p>
+        </w:tc>
+        <w:tc>
+          <w:tcPr>
+            <w:tcW w:type="dxa" w:w="2520"/>
+            <w:shd w:fill="FFFFFF"/>
+            <w:tcMar>
+              <w:top w:w="60" w:type="dxa"/>
+              <w:bottom w:w="60" w:type="dxa"/>
+              <w:left w:w="70" w:type="dxa"/>
+              <w:right w:w="70" w:type="dxa"/>
+            </w:tcMar>
+          </w:tcPr>
+          <w:p>
+            <w:r>
+              <w:rPr>
+                <w:b/>
+                <w:sz w:val="17"/>
+              </w:rPr>
+              <w:t>Best Choice for Disease Diagnosis ✅</w:t>
+            </w:r>
+          </w:p>
+        </w:tc>
+      </w:tr>
+      <w:tr>
+        <w:tc>
+          <w:tcPr>
+            <w:tcW w:type="dxa" w:w="2520"/>
+            <w:shd w:fill="F9FBF9"/>
+            <w:tcMar>
+              <w:top w:w="60" w:type="dxa"/>
+              <w:bottom w:w="60" w:type="dxa"/>
+              <w:left w:w="70" w:type="dxa"/>
+              <w:right w:w="70" w:type="dxa"/>
+            </w:tcMar>
+          </w:tcPr>
+          <w:p>
+            <w:r>
+              <w:rPr>
+                <w:b/>
+                <w:sz w:val="17"/>
+              </w:rPr>
+              <w:t>Rule-Based LCC</w:t>
+              <w:br/>
+              <w:t>(Color Combination)</w:t>
+            </w:r>
+          </w:p>
+        </w:tc>
+        <w:tc>
+          <w:tcPr>
+            <w:tcW w:type="dxa" w:w="2520"/>
+            <w:shd w:fill="F9FBF9"/>
+            <w:tcMar>
+              <w:top w:w="60" w:type="dxa"/>
+              <w:bottom w:w="60" w:type="dxa"/>
+              <w:left w:w="70" w:type="dxa"/>
+              <w:right w:w="70" w:type="dxa"/>
+            </w:tcMar>
+          </w:tcPr>
+          <w:p>
+            <w:r>
+              <w:rPr>
+                <w:sz w:val="17"/>
+              </w:rPr>
+              <w:t>Instant pixel math; no training required; explains lesion surface %</w:t>
+            </w:r>
+          </w:p>
+        </w:tc>
+        <w:tc>
+          <w:tcPr>
+            <w:tcW w:type="dxa" w:w="2520"/>
+            <w:shd w:fill="F9FBF9"/>
+            <w:tcMar>
+              <w:top w:w="60" w:type="dxa"/>
+              <w:bottom w:w="60" w:type="dxa"/>
+              <w:left w:w="70" w:type="dxa"/>
+              <w:right w:w="70" w:type="dxa"/>
+            </w:tcMar>
+          </w:tcPr>
+          <w:p>
+            <w:r>
+              <w:rPr>
+                <w:sz w:val="17"/>
+              </w:rPr>
+              <w:t>Completely fails under variable sunlight; cannot distinguish diseases with same color</w:t>
+            </w:r>
+          </w:p>
+        </w:tc>
+        <w:tc>
+          <w:tcPr>
+            <w:tcW w:type="dxa" w:w="2520"/>
+            <w:shd w:fill="F9FBF9"/>
+            <w:tcMar>
+              <w:top w:w="60" w:type="dxa"/>
+              <w:bottom w:w="60" w:type="dxa"/>
+              <w:left w:w="70" w:type="dxa"/>
+              <w:right w:w="70" w:type="dxa"/>
+            </w:tcMar>
+          </w:tcPr>
+          <w:p>
+            <w:r>
+              <w:rPr>
+                <w:b/>
+                <w:sz w:val="17"/>
+              </w:rPr>
+              <w:t>Not Recommended as Primary Classifier ❌</w:t>
+            </w:r>
+          </w:p>
+        </w:tc>
+      </w:tr>
+      <w:tr>
+        <w:tc>
+          <w:tcPr>
+            <w:tcW w:type="dxa" w:w="2520"/>
+            <w:shd w:fill="FFFFFF"/>
+            <w:tcMar>
+              <w:top w:w="60" w:type="dxa"/>
+              <w:bottom w:w="60" w:type="dxa"/>
+              <w:left w:w="70" w:type="dxa"/>
+              <w:right w:w="70" w:type="dxa"/>
+            </w:tcMar>
+          </w:tcPr>
+          <w:p>
+            <w:r>
+              <w:rPr>
+                <w:b/>
+                <w:sz w:val="17"/>
+              </w:rPr>
+              <w:t>Traditional Agronomic</w:t>
+              <w:br/>
+              <w:t>Leaf Color Chart</w:t>
+            </w:r>
+          </w:p>
+        </w:tc>
+        <w:tc>
+          <w:tcPr>
+            <w:tcW w:type="dxa" w:w="2520"/>
+            <w:shd w:fill="FFFFFF"/>
+            <w:tcMar>
+              <w:top w:w="60" w:type="dxa"/>
+              <w:bottom w:w="60" w:type="dxa"/>
+              <w:left w:w="70" w:type="dxa"/>
+              <w:right w:w="70" w:type="dxa"/>
+            </w:tcMar>
+          </w:tcPr>
+          <w:p>
+            <w:r>
+              <w:rPr>
+                <w:sz w:val="17"/>
+              </w:rPr>
+              <w:t>Standardized physical metric for Nitrogen &amp; Urea application timing</w:t>
+            </w:r>
+          </w:p>
+        </w:tc>
+        <w:tc>
+          <w:tcPr>
+            <w:tcW w:type="dxa" w:w="2520"/>
+            <w:shd w:fill="FFFFFF"/>
+            <w:tcMar>
+              <w:top w:w="60" w:type="dxa"/>
+              <w:bottom w:w="60" w:type="dxa"/>
+              <w:left w:w="70" w:type="dxa"/>
+              <w:right w:w="70" w:type="dxa"/>
+            </w:tcMar>
+          </w:tcPr>
+          <w:p>
+            <w:r>
+              <w:rPr>
+                <w:sz w:val="17"/>
+              </w:rPr>
+              <w:t>Designed solely for nutrient greenness; completely ineffective for fungal/bacterial spots</w:t>
+            </w:r>
+          </w:p>
+        </w:tc>
+        <w:tc>
+          <w:tcPr>
+            <w:tcW w:type="dxa" w:w="2520"/>
+            <w:shd w:fill="FFFFFF"/>
+            <w:tcMar>
+              <w:top w:w="60" w:type="dxa"/>
+              <w:bottom w:w="60" w:type="dxa"/>
+              <w:left w:w="70" w:type="dxa"/>
+              <w:right w:w="70" w:type="dxa"/>
+            </w:tcMar>
+          </w:tcPr>
+          <w:p>
+            <w:r>
+              <w:rPr>
+                <w:b/>
+                <w:sz w:val="17"/>
+              </w:rPr>
+              <w:t>Excellent for Fertilizer Module Only 🌾</w:t>
+            </w:r>
+          </w:p>
+        </w:tc>
+      </w:tr>
+      <w:tr>
+        <w:tc>
+          <w:tcPr>
+            <w:tcW w:type="dxa" w:w="2520"/>
+            <w:shd w:fill="F9FBF9"/>
+            <w:tcMar>
+              <w:top w:w="60" w:type="dxa"/>
+              <w:bottom w:w="60" w:type="dxa"/>
+              <w:left w:w="70" w:type="dxa"/>
+              <w:right w:w="70" w:type="dxa"/>
+            </w:tcMar>
+          </w:tcPr>
+          <w:p>
+            <w:r>
+              <w:rPr>
+                <w:b/>
+                <w:sz w:val="17"/>
+              </w:rPr>
+              <w:t>Two-Tier Hybrid</w:t>
+              <w:br/>
+              <w:t>(AgriVision Architecture)</w:t>
+            </w:r>
+          </w:p>
+        </w:tc>
+        <w:tc>
+          <w:tcPr>
+            <w:tcW w:type="dxa" w:w="2520"/>
+            <w:shd w:fill="F9FBF9"/>
+            <w:tcMar>
+              <w:top w:w="60" w:type="dxa"/>
+              <w:bottom w:w="60" w:type="dxa"/>
+              <w:left w:w="70" w:type="dxa"/>
+              <w:right w:w="70" w:type="dxa"/>
+            </w:tcMar>
+          </w:tcPr>
+          <w:p>
+            <w:r>
+              <w:rPr>
+                <w:sz w:val="17"/>
+              </w:rPr>
+              <w:t>CNN identifies disease pathogen; OpenCV HSV/GLI measures severity &amp; rejects non-plants</w:t>
+            </w:r>
+          </w:p>
+        </w:tc>
+        <w:tc>
+          <w:tcPr>
+            <w:tcW w:type="dxa" w:w="2520"/>
+            <w:shd w:fill="F9FBF9"/>
+            <w:tcMar>
+              <w:top w:w="60" w:type="dxa"/>
+              <w:bottom w:w="60" w:type="dxa"/>
+              <w:left w:w="70" w:type="dxa"/>
+              <w:right w:w="70" w:type="dxa"/>
+            </w:tcMar>
+          </w:tcPr>
+          <w:p>
+            <w:r>
+              <w:rPr>
+                <w:sz w:val="17"/>
+              </w:rPr>
+              <w:t>Requires balancing both CV pipelines; slightly more engineering code</w:t>
+            </w:r>
+          </w:p>
+        </w:tc>
+        <w:tc>
+          <w:tcPr>
+            <w:tcW w:type="dxa" w:w="2520"/>
+            <w:shd w:fill="F9FBF9"/>
+            <w:tcMar>
+              <w:top w:w="60" w:type="dxa"/>
+              <w:bottom w:w="60" w:type="dxa"/>
+              <w:left w:w="70" w:type="dxa"/>
+              <w:right w:w="70" w:type="dxa"/>
+            </w:tcMar>
+          </w:tcPr>
+          <w:p>
+            <w:r>
+              <w:rPr>
+                <w:b/>
+                <w:sz w:val="17"/>
+              </w:rPr>
+              <w:t>Recommended Industry Standard 🏆</w:t>
+            </w:r>
+          </w:p>
+        </w:tc>
+      </w:tr>
+    </w:tbl>
+    <w:p>
+      <w:pPr>
+        <w:spacing w:after="240"/>
+      </w:pPr>
+    </w:p>
+    <w:p>
+      <w:pPr>
+        <w:pStyle w:val="Heading1"/>
+        <w:spacing w:before="280" w:after="120"/>
+      </w:pPr>
+      <w:r>
+        <w:rPr>
+          <w:color w:val="1B5E20"/>
+        </w:rPr>
+        <w:t>6. Step-by-Step Code Instructions</w:t>
       </w:r>
     </w:p>
     <w:p>
@@ -6331,7 +6876,7 @@
     <w:rPr>
       <w:rFonts w:ascii="Calibri" w:hAnsi="Calibri"/>
       <w:color w:val="212121"/>
-      <w:sz w:val="21"/>
+      <w:sz w:val="20"/>
     </w:rPr>
   </w:style>
   <w:style w:type="paragraph" w:styleId="Header">

</xml_diff>

<commit_message>
feat(market): restrict market intelligence and agricultural defaults exclusively to Haryana state APMC mandis
</commit_message>
<xml_diff>
--- a/AgriVision_Plant_Disease_Detection_Guide.docx
+++ b/AgriVision_Plant_Disease_Detection_Guide.docx
@@ -58,22 +58,14 @@
             </w:tcMar>
           </w:tcPr>
           <w:p>
-            <w:pPr>
-              <w:spacing w:after="80"/>
-            </w:pPr>
             <w:r>
               <w:rPr>
-                <w:b/>
-                <w:color w:val="1B5E20"/>
-                <w:sz w:val="22"/>
+                <w:rFonts w:ascii="Segoe UI" w:hAnsi="Segoe UI"/>
+                <w:color w:val="1B4332"/>
+                <w:sz w:val="20"/>
               </w:rPr>
               <w:t>📌 Project Mission &amp; Academic High-Concept</w:t>
               <w:br/>
-            </w:r>
-            <w:r>
-              <w:rPr>
-                <w:sz w:val="19"/>
-              </w:rPr>
               <w:t>AgriVision Agent is designed not merely as an academic leaf disease classifier, but as an Autonomous Precision Agronomy Decision Support System solving interconnected real-world crises in modern agriculture.</w:t>
               <w:br/>
               <w:br/>
@@ -83,7 +75,7 @@
               <w:br/>
               <w:t>• Digital IRRI Leaf Color Chart (LCC): Direct camera-based Nitrogen &amp; Urea fertilizer optimizer preventing the #1 cause of disease outbreaks.</w:t>
               <w:br/>
-              <w:t>• 6-Pillar Strategic Expansion: Weather spray windows, precision knapsack math, preventive microclimate forecasting, vernacular voice UI, and Mandi market intelligence.</w:t>
+              <w:t>• 6-Pillar Strategic Expansion: Weather spray windows, precision knapsack math, preventive microclimate forecasting, vernacular voice UI, and Haryana State APMC Mandi market intelligence.</w:t>
             </w:r>
           </w:p>
         </w:tc>
@@ -552,12 +544,12 @@
           <w:p>
             <w:r>
               <w:rPr>
-                <w:b/>
-                <w:sz w:val="17"/>
+                <w:rFonts w:ascii="Segoe UI" w:hAnsi="Segoe UI"/>
+                <w:sz w:val="19"/>
               </w:rPr>
               <w:t>Pillar 6:</w:t>
               <w:br/>
-              <w:t>Mandi Market Intelligence</w:t>
+              <w:t>Haryana Mandi Market Intelligence &amp; Economics</w:t>
             </w:r>
           </w:p>
         </w:tc>
@@ -575,9 +567,10 @@
           <w:p>
             <w:r>
               <w:rPr>
-                <w:sz w:val="17"/>
+                <w:rFonts w:ascii="Segoe UI" w:hAnsi="Segoe UI"/>
+                <w:sz w:val="19"/>
               </w:rPr>
-              <w:t>Farmers save crops but sell at harvest glut prices at the lowest APMC Mandi.</w:t>
+              <w:t>Farmers save crops from disease but sell at harvest glut prices at the lowest local yard without visibility into neighboring district mandis.</w:t>
             </w:r>
           </w:p>
         </w:tc>
@@ -595,9 +588,10 @@
           <w:p>
             <w:r>
               <w:rPr>
-                <w:sz w:val="17"/>
+                <w:rFonts w:ascii="Segoe UI" w:hAnsi="Segoe UI"/>
+                <w:sz w:val="19"/>
               </w:rPr>
-              <w:t>APMC Mandi Price Tracker: Compares live commodity prices across local and district markets to optimize harvest and selling timing.</w:t>
+              <w:t>Haryana APMC Market Intelligence Engine: Tracks real-time commodity prices across Haryana APMC mandis (Karnal, Sonipat, Kurukshetra, Ambala, Yamunanagar, Rohtak, Sirsa, Kaithal) to provide district arbitrage gain alerts and projected net crop profit for Haryana growers.</w:t>
             </w:r>
           </w:p>
         </w:tc>
@@ -6298,6 +6292,296 @@
           </w:p>
         </w:tc>
       </w:tr>
+      <w:tr>
+        <w:tc>
+          <w:tcPr>
+            <w:tcW w:type="dxa" w:w="2520"/>
+          </w:tcPr>
+          <w:p>
+            <w:r>
+              <w:rPr>
+                <w:rFonts w:ascii="Segoe UI" w:hAnsi="Segoe UI"/>
+                <w:sz w:val="18"/>
+              </w:rPr>
+              <w:t>Haryana Market Intelligence</w:t>
+            </w:r>
+          </w:p>
+        </w:tc>
+        <w:tc>
+          <w:tcPr>
+            <w:tcW w:type="dxa" w:w="2520"/>
+          </w:tcPr>
+          <w:p>
+            <w:r>
+              <w:rPr>
+                <w:rFonts w:ascii="Segoe UI" w:hAnsi="Segoe UI"/>
+                <w:sz w:val="18"/>
+              </w:rPr>
+              <w:t>Target Geographic Domain</w:t>
+            </w:r>
+          </w:p>
+        </w:tc>
+        <w:tc>
+          <w:tcPr>
+            <w:tcW w:type="dxa" w:w="2520"/>
+          </w:tcPr>
+          <w:p>
+            <w:r>
+              <w:rPr>
+                <w:rFonts w:ascii="Segoe UI" w:hAnsi="Segoe UI"/>
+                <w:sz w:val="18"/>
+              </w:rPr>
+              <w:t>Haryana State Exclusively</w:t>
+            </w:r>
+          </w:p>
+        </w:tc>
+        <w:tc>
+          <w:tcPr>
+            <w:tcW w:type="dxa" w:w="2520"/>
+          </w:tcPr>
+          <w:p>
+            <w:r>
+              <w:rPr>
+                <w:rFonts w:ascii="Segoe UI" w:hAnsi="Segoe UI"/>
+                <w:sz w:val="18"/>
+              </w:rPr>
+              <w:t>Focused regional agronomic &amp; market intelligence covering all primary agricultural hubs: Karnal, Sonipat, Kurukshetra, Ambala, Yamunanagar, Rohtak, Sirsa, Kaithal.</w:t>
+            </w:r>
+          </w:p>
+        </w:tc>
+      </w:tr>
+      <w:tr>
+        <w:tc>
+          <w:tcPr>
+            <w:tcW w:type="dxa" w:w="2520"/>
+          </w:tcPr>
+          <w:p>
+            <w:r>
+              <w:rPr>
+                <w:rFonts w:ascii="Segoe UI" w:hAnsi="Segoe UI"/>
+                <w:sz w:val="18"/>
+              </w:rPr>
+              <w:t>Haryana Market Intelligence</w:t>
+            </w:r>
+          </w:p>
+        </w:tc>
+        <w:tc>
+          <w:tcPr>
+            <w:tcW w:type="dxa" w:w="2520"/>
+          </w:tcPr>
+          <w:p>
+            <w:r>
+              <w:rPr>
+                <w:rFonts w:ascii="Segoe UI" w:hAnsi="Segoe UI"/>
+                <w:sz w:val="18"/>
+              </w:rPr>
+              <w:t>Tomato Baseline Market</w:t>
+            </w:r>
+          </w:p>
+        </w:tc>
+        <w:tc>
+          <w:tcPr>
+            <w:tcW w:type="dxa" w:w="2520"/>
+          </w:tcPr>
+          <w:p>
+            <w:r>
+              <w:rPr>
+                <w:rFonts w:ascii="Segoe UI" w:hAnsi="Segoe UI"/>
+                <w:sz w:val="18"/>
+              </w:rPr>
+              <w:t>Karnal (Gharaunda Hub)</w:t>
+            </w:r>
+          </w:p>
+        </w:tc>
+        <w:tc>
+          <w:tcPr>
+            <w:tcW w:type="dxa" w:w="2520"/>
+          </w:tcPr>
+          <w:p>
+            <w:r>
+              <w:rPr>
+                <w:rFonts w:ascii="Segoe UI" w:hAnsi="Segoe UI"/>
+                <w:sz w:val="18"/>
+              </w:rPr>
+              <w:t>Primary vegetable corridor in Haryana. Avg yield: 140 Qtl/acre; Cultivation cost: ₹45,000/acre; Arbitrage benchmark against Sonipat (Ganaur APMC).</w:t>
+            </w:r>
+          </w:p>
+        </w:tc>
+      </w:tr>
+      <w:tr>
+        <w:tc>
+          <w:tcPr>
+            <w:tcW w:type="dxa" w:w="2520"/>
+          </w:tcPr>
+          <w:p>
+            <w:r>
+              <w:rPr>
+                <w:rFonts w:ascii="Segoe UI" w:hAnsi="Segoe UI"/>
+                <w:sz w:val="18"/>
+              </w:rPr>
+              <w:t>Haryana Market Intelligence</w:t>
+            </w:r>
+          </w:p>
+        </w:tc>
+        <w:tc>
+          <w:tcPr>
+            <w:tcW w:type="dxa" w:w="2520"/>
+          </w:tcPr>
+          <w:p>
+            <w:r>
+              <w:rPr>
+                <w:rFonts w:ascii="Segoe UI" w:hAnsi="Segoe UI"/>
+                <w:sz w:val="18"/>
+              </w:rPr>
+              <w:t>Potato Baseline Market</w:t>
+            </w:r>
+          </w:p>
+        </w:tc>
+        <w:tc>
+          <w:tcPr>
+            <w:tcW w:type="dxa" w:w="2520"/>
+          </w:tcPr>
+          <w:p>
+            <w:r>
+              <w:rPr>
+                <w:rFonts w:ascii="Segoe UI" w:hAnsi="Segoe UI"/>
+                <w:sz w:val="18"/>
+              </w:rPr>
+              <w:t>Kurukshetra (Pipli APMC)</w:t>
+            </w:r>
+          </w:p>
+        </w:tc>
+        <w:tc>
+          <w:tcPr>
+            <w:tcW w:type="dxa" w:w="2520"/>
+          </w:tcPr>
+          <w:p>
+            <w:r>
+              <w:rPr>
+                <w:rFonts w:ascii="Segoe UI" w:hAnsi="Segoe UI"/>
+                <w:sz w:val="18"/>
+              </w:rPr>
+              <w:t>Haryana potato heartland. Avg yield: 100 Qtl/acre; Cultivation cost: ₹38,000/acre; Arbitrage benchmark against Shahabad Markanda.</w:t>
+            </w:r>
+          </w:p>
+        </w:tc>
+      </w:tr>
+      <w:tr>
+        <w:tc>
+          <w:tcPr>
+            <w:tcW w:type="dxa" w:w="2520"/>
+          </w:tcPr>
+          <w:p>
+            <w:r>
+              <w:rPr>
+                <w:rFonts w:ascii="Segoe UI" w:hAnsi="Segoe UI"/>
+                <w:sz w:val="18"/>
+              </w:rPr>
+              <w:t>Haryana Market Intelligence</w:t>
+            </w:r>
+          </w:p>
+        </w:tc>
+        <w:tc>
+          <w:tcPr>
+            <w:tcW w:type="dxa" w:w="2520"/>
+          </w:tcPr>
+          <w:p>
+            <w:r>
+              <w:rPr>
+                <w:rFonts w:ascii="Segoe UI" w:hAnsi="Segoe UI"/>
+                <w:sz w:val="18"/>
+              </w:rPr>
+              <w:t>Pepper Bell Baseline Market</w:t>
+            </w:r>
+          </w:p>
+        </w:tc>
+        <w:tc>
+          <w:tcPr>
+            <w:tcW w:type="dxa" w:w="2520"/>
+          </w:tcPr>
+          <w:p>
+            <w:r>
+              <w:rPr>
+                <w:rFonts w:ascii="Segoe UI" w:hAnsi="Segoe UI"/>
+                <w:sz w:val="18"/>
+              </w:rPr>
+              <w:t>Karnal (Gharaunda CoE)</w:t>
+            </w:r>
+          </w:p>
+        </w:tc>
+        <w:tc>
+          <w:tcPr>
+            <w:tcW w:type="dxa" w:w="2520"/>
+          </w:tcPr>
+          <w:p>
+            <w:r>
+              <w:rPr>
+                <w:rFonts w:ascii="Segoe UI" w:hAnsi="Segoe UI"/>
+                <w:sz w:val="18"/>
+              </w:rPr>
+              <w:t>Indo-Israel Center of Excellence for Vegetables. Avg yield: 75 Qtl/acre; Cultivation cost: ₹42,000/acre; Arbitrage benchmark against Sonipat (Murthal APMC).</w:t>
+            </w:r>
+          </w:p>
+        </w:tc>
+      </w:tr>
+      <w:tr>
+        <w:tc>
+          <w:tcPr>
+            <w:tcW w:type="dxa" w:w="2520"/>
+          </w:tcPr>
+          <w:p>
+            <w:r>
+              <w:rPr>
+                <w:rFonts w:ascii="Segoe UI" w:hAnsi="Segoe UI"/>
+                <w:sz w:val="18"/>
+              </w:rPr>
+              <w:t>Haryana Market Intelligence</w:t>
+            </w:r>
+          </w:p>
+        </w:tc>
+        <w:tc>
+          <w:tcPr>
+            <w:tcW w:type="dxa" w:w="2520"/>
+          </w:tcPr>
+          <w:p>
+            <w:r>
+              <w:rPr>
+                <w:rFonts w:ascii="Segoe UI" w:hAnsi="Segoe UI"/>
+                <w:sz w:val="18"/>
+              </w:rPr>
+              <w:t>Wheat Baseline Market</w:t>
+            </w:r>
+          </w:p>
+        </w:tc>
+        <w:tc>
+          <w:tcPr>
+            <w:tcW w:type="dxa" w:w="2520"/>
+          </w:tcPr>
+          <w:p>
+            <w:r>
+              <w:rPr>
+                <w:rFonts w:ascii="Segoe UI" w:hAnsi="Segoe UI"/>
+                <w:sz w:val="18"/>
+              </w:rPr>
+              <w:t>Karnal (New Grain Market)</w:t>
+            </w:r>
+          </w:p>
+        </w:tc>
+        <w:tc>
+          <w:tcPr>
+            <w:tcW w:type="dxa" w:w="2520"/>
+          </w:tcPr>
+          <w:p>
+            <w:r>
+              <w:rPr>
+                <w:rFonts w:ascii="Segoe UI" w:hAnsi="Segoe UI"/>
+                <w:sz w:val="18"/>
+              </w:rPr>
+              <w:t>Haryana ICAR-IIWBR wheat hub. Avg yield: 22 Qtl/acre; Cultivation cost: ₹16,000/acre; Tracked against MSP and Kaithal Grain Market.</w:t>
+            </w:r>
+          </w:p>
+        </w:tc>
+      </w:tr>
     </w:tbl>
     <w:p>
       <w:pPr>

</xml_diff>

<commit_message>
feat(haryana): add 22-district crop matrix, Kaggle multi-crop dataset, and stepwise GPU model training on NVIDIA RTX 3050
</commit_message>
<xml_diff>
--- a/AgriVision_Plant_Disease_Detection_Guide.docx
+++ b/AgriVision_Plant_Disease_Detection_Guide.docx
@@ -6798,6 +6798,3641 @@
               <w:t xml:space="preserve">                     key=lambda p: np.linalg.norm(np.array(mean_lab) - np.array(IRRI_LCC_LAB[p])))</w:t>
               <w:br/>
               <w:t xml:space="preserve">    return {'panel': best_panel, 'mean_lab': mean_lab}</w:t>
+            </w:r>
+          </w:p>
+        </w:tc>
+      </w:tr>
+    </w:tbl>
+    <w:p>
+      <w:pPr>
+        <w:spacing w:before="280" w:after="80"/>
+      </w:pPr>
+      <w:r>
+        <w:rPr>
+          <w:rFonts w:ascii="Segoe UI Semibold" w:hAnsi="Segoe UI Semibold"/>
+          <w:b/>
+          <w:color w:val="1B4332"/>
+          <w:sz w:val="26"/>
+        </w:rPr>
+        <w:t>8. Haryana State: 22-District Agricultural Matrix &amp; Crop Distributions</w:t>
+      </w:r>
+    </w:p>
+    <w:p>
+      <w:pPr>
+        <w:spacing w:after="120"/>
+      </w:pPr>
+      <w:r>
+        <w:rPr>
+          <w:rFonts w:ascii="Segoe UI" w:hAnsi="Segoe UI"/>
+          <w:sz w:val="20"/>
+        </w:rPr>
+        <w:t>Haryana is divided into 4 distinct agro-climatic belts spanning all 22 districts. The table below documents the administrative towns, common crops, and associated APMC mandis incorporated into AgriVision Agent:</w:t>
+      </w:r>
+    </w:p>
+    <w:tbl>
+      <w:tblPr>
+        <w:tblW w:type="auto" w:w="0"/>
+        <w:jc w:val="center"/>
+        <w:tblLook w:firstColumn="1" w:firstRow="1" w:lastColumn="0" w:lastRow="0" w:noHBand="0" w:noVBand="1" w:val="04A0"/>
+      </w:tblPr>
+      <w:tblGrid>
+        <w:gridCol w:w="2016"/>
+        <w:gridCol w:w="2016"/>
+        <w:gridCol w:w="2016"/>
+        <w:gridCol w:w="2016"/>
+        <w:gridCol w:w="2016"/>
+      </w:tblGrid>
+      <w:tr>
+        <w:tc>
+          <w:tcPr>
+            <w:tcW w:type="dxa" w:w="2016"/>
+            <w:shd w:fill="1B4332"/>
+            <w:tcMar>
+              <w:top w:w="120" w:type="dxa"/>
+              <w:bottom w:w="120" w:type="dxa"/>
+              <w:left w:w="120" w:type="dxa"/>
+              <w:right w:w="120" w:type="dxa"/>
+            </w:tcMar>
+          </w:tcPr>
+          <w:p>
+            <w:r>
+              <w:rPr>
+                <w:rFonts w:ascii="Segoe UI" w:hAnsi="Segoe UI"/>
+                <w:b/>
+                <w:color w:val="FFFFFF"/>
+                <w:sz w:val="19"/>
+              </w:rPr>
+              <w:t>#</w:t>
+            </w:r>
+          </w:p>
+        </w:tc>
+        <w:tc>
+          <w:tcPr>
+            <w:tcW w:type="dxa" w:w="2016"/>
+            <w:shd w:fill="1B4332"/>
+            <w:tcMar>
+              <w:top w:w="120" w:type="dxa"/>
+              <w:bottom w:w="120" w:type="dxa"/>
+              <w:left w:w="120" w:type="dxa"/>
+              <w:right w:w="120" w:type="dxa"/>
+            </w:tcMar>
+          </w:tcPr>
+          <w:p>
+            <w:r>
+              <w:rPr>
+                <w:rFonts w:ascii="Segoe UI" w:hAnsi="Segoe UI"/>
+                <w:b/>
+                <w:color w:val="FFFFFF"/>
+                <w:sz w:val="19"/>
+              </w:rPr>
+              <w:t>District</w:t>
+            </w:r>
+          </w:p>
+        </w:tc>
+        <w:tc>
+          <w:tcPr>
+            <w:tcW w:type="dxa" w:w="2016"/>
+            <w:shd w:fill="1B4332"/>
+            <w:tcMar>
+              <w:top w:w="120" w:type="dxa"/>
+              <w:bottom w:w="120" w:type="dxa"/>
+              <w:left w:w="120" w:type="dxa"/>
+              <w:right w:w="120" w:type="dxa"/>
+            </w:tcMar>
+          </w:tcPr>
+          <w:p>
+            <w:r>
+              <w:rPr>
+                <w:rFonts w:ascii="Segoe UI" w:hAnsi="Segoe UI"/>
+                <w:b/>
+                <w:color w:val="FFFFFF"/>
+                <w:sz w:val="19"/>
+              </w:rPr>
+              <w:t>Belt</w:t>
+            </w:r>
+          </w:p>
+        </w:tc>
+        <w:tc>
+          <w:tcPr>
+            <w:tcW w:type="dxa" w:w="2016"/>
+            <w:shd w:fill="1B4332"/>
+            <w:tcMar>
+              <w:top w:w="120" w:type="dxa"/>
+              <w:bottom w:w="120" w:type="dxa"/>
+              <w:left w:w="120" w:type="dxa"/>
+              <w:right w:w="120" w:type="dxa"/>
+            </w:tcMar>
+          </w:tcPr>
+          <w:p>
+            <w:r>
+              <w:rPr>
+                <w:rFonts w:ascii="Segoe UI" w:hAnsi="Segoe UI"/>
+                <w:b/>
+                <w:color w:val="FFFFFF"/>
+                <w:sz w:val="19"/>
+              </w:rPr>
+              <w:t>Main Cities / Towns</w:t>
+            </w:r>
+          </w:p>
+        </w:tc>
+        <w:tc>
+          <w:tcPr>
+            <w:tcW w:type="dxa" w:w="2016"/>
+            <w:shd w:fill="1B4332"/>
+            <w:tcMar>
+              <w:top w:w="120" w:type="dxa"/>
+              <w:bottom w:w="120" w:type="dxa"/>
+              <w:left w:w="120" w:type="dxa"/>
+              <w:right w:w="120" w:type="dxa"/>
+            </w:tcMar>
+          </w:tcPr>
+          <w:p>
+            <w:r>
+              <w:rPr>
+                <w:rFonts w:ascii="Segoe UI" w:hAnsi="Segoe UI"/>
+                <w:b/>
+                <w:color w:val="FFFFFF"/>
+                <w:sz w:val="19"/>
+              </w:rPr>
+              <w:t>Commonly Grown Crops</w:t>
+            </w:r>
+          </w:p>
+        </w:tc>
+      </w:tr>
+      <w:tr>
+        <w:tc>
+          <w:tcPr>
+            <w:tcW w:type="dxa" w:w="2016"/>
+            <w:shd w:fill="FFFFFF"/>
+            <w:tcMar>
+              <w:top w:w="70" w:type="dxa"/>
+              <w:bottom w:w="70" w:type="dxa"/>
+              <w:left w:w="90" w:type="dxa"/>
+              <w:right w:w="90" w:type="dxa"/>
+            </w:tcMar>
+          </w:tcPr>
+          <w:p>
+            <w:r>
+              <w:rPr>
+                <w:rFonts w:ascii="Segoe UI" w:hAnsi="Segoe UI"/>
+                <w:sz w:val="17"/>
+              </w:rPr>
+              <w:t>1</w:t>
+            </w:r>
+          </w:p>
+        </w:tc>
+        <w:tc>
+          <w:tcPr>
+            <w:tcW w:type="dxa" w:w="2016"/>
+            <w:shd w:fill="FFFFFF"/>
+            <w:tcMar>
+              <w:top w:w="70" w:type="dxa"/>
+              <w:bottom w:w="70" w:type="dxa"/>
+              <w:left w:w="90" w:type="dxa"/>
+              <w:right w:w="90" w:type="dxa"/>
+            </w:tcMar>
+          </w:tcPr>
+          <w:p>
+            <w:r>
+              <w:rPr>
+                <w:rFonts w:ascii="Segoe UI" w:hAnsi="Segoe UI"/>
+                <w:b/>
+                <w:sz w:val="17"/>
+              </w:rPr>
+              <w:t>Ambala</w:t>
+            </w:r>
+          </w:p>
+        </w:tc>
+        <w:tc>
+          <w:tcPr>
+            <w:tcW w:type="dxa" w:w="2016"/>
+            <w:shd w:fill="FFFFFF"/>
+            <w:tcMar>
+              <w:top w:w="70" w:type="dxa"/>
+              <w:bottom w:w="70" w:type="dxa"/>
+              <w:left w:w="90" w:type="dxa"/>
+              <w:right w:w="90" w:type="dxa"/>
+            </w:tcMar>
+          </w:tcPr>
+          <w:p>
+            <w:r>
+              <w:rPr>
+                <w:rFonts w:ascii="Segoe UI" w:hAnsi="Segoe UI"/>
+                <w:sz w:val="17"/>
+              </w:rPr>
+              <w:t>North-East</w:t>
+            </w:r>
+          </w:p>
+        </w:tc>
+        <w:tc>
+          <w:tcPr>
+            <w:tcW w:type="dxa" w:w="2016"/>
+            <w:shd w:fill="FFFFFF"/>
+            <w:tcMar>
+              <w:top w:w="70" w:type="dxa"/>
+              <w:bottom w:w="70" w:type="dxa"/>
+              <w:left w:w="90" w:type="dxa"/>
+              <w:right w:w="90" w:type="dxa"/>
+            </w:tcMar>
+          </w:tcPr>
+          <w:p>
+            <w:r>
+              <w:rPr>
+                <w:rFonts w:ascii="Segoe UI" w:hAnsi="Segoe UI"/>
+                <w:sz w:val="17"/>
+              </w:rPr>
+              <w:t>Ambala City, Ambala Cantt, Naraingarh, Barara</w:t>
+            </w:r>
+          </w:p>
+        </w:tc>
+        <w:tc>
+          <w:tcPr>
+            <w:tcW w:type="dxa" w:w="2016"/>
+            <w:shd w:fill="FFFFFF"/>
+            <w:tcMar>
+              <w:top w:w="70" w:type="dxa"/>
+              <w:bottom w:w="70" w:type="dxa"/>
+              <w:left w:w="90" w:type="dxa"/>
+              <w:right w:w="90" w:type="dxa"/>
+            </w:tcMar>
+          </w:tcPr>
+          <w:p>
+            <w:r>
+              <w:rPr>
+                <w:rFonts w:ascii="Segoe UI" w:hAnsi="Segoe UI"/>
+                <w:sz w:val="17"/>
+              </w:rPr>
+              <w:t>Wheat, Paddy, Sugarcane, Maize, Vegetables</w:t>
+            </w:r>
+          </w:p>
+        </w:tc>
+      </w:tr>
+      <w:tr>
+        <w:tc>
+          <w:tcPr>
+            <w:tcW w:type="dxa" w:w="2016"/>
+            <w:shd w:fill="F8F9FA"/>
+            <w:tcMar>
+              <w:top w:w="70" w:type="dxa"/>
+              <w:bottom w:w="70" w:type="dxa"/>
+              <w:left w:w="90" w:type="dxa"/>
+              <w:right w:w="90" w:type="dxa"/>
+            </w:tcMar>
+          </w:tcPr>
+          <w:p>
+            <w:r>
+              <w:rPr>
+                <w:rFonts w:ascii="Segoe UI" w:hAnsi="Segoe UI"/>
+                <w:sz w:val="17"/>
+              </w:rPr>
+              <w:t>2</w:t>
+            </w:r>
+          </w:p>
+        </w:tc>
+        <w:tc>
+          <w:tcPr>
+            <w:tcW w:type="dxa" w:w="2016"/>
+            <w:shd w:fill="F8F9FA"/>
+            <w:tcMar>
+              <w:top w:w="70" w:type="dxa"/>
+              <w:bottom w:w="70" w:type="dxa"/>
+              <w:left w:w="90" w:type="dxa"/>
+              <w:right w:w="90" w:type="dxa"/>
+            </w:tcMar>
+          </w:tcPr>
+          <w:p>
+            <w:r>
+              <w:rPr>
+                <w:rFonts w:ascii="Segoe UI" w:hAnsi="Segoe UI"/>
+                <w:b/>
+                <w:sz w:val="17"/>
+              </w:rPr>
+              <w:t>Bhiwani</w:t>
+            </w:r>
+          </w:p>
+        </w:tc>
+        <w:tc>
+          <w:tcPr>
+            <w:tcW w:type="dxa" w:w="2016"/>
+            <w:shd w:fill="F8F9FA"/>
+            <w:tcMar>
+              <w:top w:w="70" w:type="dxa"/>
+              <w:bottom w:w="70" w:type="dxa"/>
+              <w:left w:w="90" w:type="dxa"/>
+              <w:right w:w="90" w:type="dxa"/>
+            </w:tcMar>
+          </w:tcPr>
+          <w:p>
+            <w:r>
+              <w:rPr>
+                <w:rFonts w:ascii="Segoe UI" w:hAnsi="Segoe UI"/>
+                <w:sz w:val="17"/>
+              </w:rPr>
+              <w:t>Western / South-Western</w:t>
+            </w:r>
+          </w:p>
+        </w:tc>
+        <w:tc>
+          <w:tcPr>
+            <w:tcW w:type="dxa" w:w="2016"/>
+            <w:shd w:fill="F8F9FA"/>
+            <w:tcMar>
+              <w:top w:w="70" w:type="dxa"/>
+              <w:bottom w:w="70" w:type="dxa"/>
+              <w:left w:w="90" w:type="dxa"/>
+              <w:right w:w="90" w:type="dxa"/>
+            </w:tcMar>
+          </w:tcPr>
+          <w:p>
+            <w:r>
+              <w:rPr>
+                <w:rFonts w:ascii="Segoe UI" w:hAnsi="Segoe UI"/>
+                <w:sz w:val="17"/>
+              </w:rPr>
+              <w:t>Bhiwani, Loharu, Siwani, Tosham</w:t>
+            </w:r>
+          </w:p>
+        </w:tc>
+        <w:tc>
+          <w:tcPr>
+            <w:tcW w:type="dxa" w:w="2016"/>
+            <w:shd w:fill="F8F9FA"/>
+            <w:tcMar>
+              <w:top w:w="70" w:type="dxa"/>
+              <w:bottom w:w="70" w:type="dxa"/>
+              <w:left w:w="90" w:type="dxa"/>
+              <w:right w:w="90" w:type="dxa"/>
+            </w:tcMar>
+          </w:tcPr>
+          <w:p>
+            <w:r>
+              <w:rPr>
+                <w:rFonts w:ascii="Segoe UI" w:hAnsi="Segoe UI"/>
+                <w:sz w:val="17"/>
+              </w:rPr>
+              <w:t>Bajra, Guar, Mustard, Cotton, Gram, Wheat</w:t>
+            </w:r>
+          </w:p>
+        </w:tc>
+      </w:tr>
+      <w:tr>
+        <w:tc>
+          <w:tcPr>
+            <w:tcW w:type="dxa" w:w="2016"/>
+            <w:shd w:fill="FFFFFF"/>
+            <w:tcMar>
+              <w:top w:w="70" w:type="dxa"/>
+              <w:bottom w:w="70" w:type="dxa"/>
+              <w:left w:w="90" w:type="dxa"/>
+              <w:right w:w="90" w:type="dxa"/>
+            </w:tcMar>
+          </w:tcPr>
+          <w:p>
+            <w:r>
+              <w:rPr>
+                <w:rFonts w:ascii="Segoe UI" w:hAnsi="Segoe UI"/>
+                <w:sz w:val="17"/>
+              </w:rPr>
+              <w:t>3</w:t>
+            </w:r>
+          </w:p>
+        </w:tc>
+        <w:tc>
+          <w:tcPr>
+            <w:tcW w:type="dxa" w:w="2016"/>
+            <w:shd w:fill="FFFFFF"/>
+            <w:tcMar>
+              <w:top w:w="70" w:type="dxa"/>
+              <w:bottom w:w="70" w:type="dxa"/>
+              <w:left w:w="90" w:type="dxa"/>
+              <w:right w:w="90" w:type="dxa"/>
+            </w:tcMar>
+          </w:tcPr>
+          <w:p>
+            <w:r>
+              <w:rPr>
+                <w:rFonts w:ascii="Segoe UI" w:hAnsi="Segoe UI"/>
+                <w:b/>
+                <w:sz w:val="17"/>
+              </w:rPr>
+              <w:t>Charkhi Dadri</w:t>
+            </w:r>
+          </w:p>
+        </w:tc>
+        <w:tc>
+          <w:tcPr>
+            <w:tcW w:type="dxa" w:w="2016"/>
+            <w:shd w:fill="FFFFFF"/>
+            <w:tcMar>
+              <w:top w:w="70" w:type="dxa"/>
+              <w:bottom w:w="70" w:type="dxa"/>
+              <w:left w:w="90" w:type="dxa"/>
+              <w:right w:w="90" w:type="dxa"/>
+            </w:tcMar>
+          </w:tcPr>
+          <w:p>
+            <w:r>
+              <w:rPr>
+                <w:rFonts w:ascii="Segoe UI" w:hAnsi="Segoe UI"/>
+                <w:sz w:val="17"/>
+              </w:rPr>
+              <w:t>Southern</w:t>
+            </w:r>
+          </w:p>
+        </w:tc>
+        <w:tc>
+          <w:tcPr>
+            <w:tcW w:type="dxa" w:w="2016"/>
+            <w:shd w:fill="FFFFFF"/>
+            <w:tcMar>
+              <w:top w:w="70" w:type="dxa"/>
+              <w:bottom w:w="70" w:type="dxa"/>
+              <w:left w:w="90" w:type="dxa"/>
+              <w:right w:w="90" w:type="dxa"/>
+            </w:tcMar>
+          </w:tcPr>
+          <w:p>
+            <w:r>
+              <w:rPr>
+                <w:rFonts w:ascii="Segoe UI" w:hAnsi="Segoe UI"/>
+                <w:sz w:val="17"/>
+              </w:rPr>
+              <w:t>Charkhi Dadri, Badhra, Bahal</w:t>
+            </w:r>
+          </w:p>
+        </w:tc>
+        <w:tc>
+          <w:tcPr>
+            <w:tcW w:type="dxa" w:w="2016"/>
+            <w:shd w:fill="FFFFFF"/>
+            <w:tcMar>
+              <w:top w:w="70" w:type="dxa"/>
+              <w:bottom w:w="70" w:type="dxa"/>
+              <w:left w:w="90" w:type="dxa"/>
+              <w:right w:w="90" w:type="dxa"/>
+            </w:tcMar>
+          </w:tcPr>
+          <w:p>
+            <w:r>
+              <w:rPr>
+                <w:rFonts w:ascii="Segoe UI" w:hAnsi="Segoe UI"/>
+                <w:sz w:val="17"/>
+              </w:rPr>
+              <w:t>Bajra, Mustard, Wheat, Guar, Cotton</w:t>
+            </w:r>
+          </w:p>
+        </w:tc>
+      </w:tr>
+      <w:tr>
+        <w:tc>
+          <w:tcPr>
+            <w:tcW w:type="dxa" w:w="2016"/>
+            <w:shd w:fill="F8F9FA"/>
+            <w:tcMar>
+              <w:top w:w="70" w:type="dxa"/>
+              <w:bottom w:w="70" w:type="dxa"/>
+              <w:left w:w="90" w:type="dxa"/>
+              <w:right w:w="90" w:type="dxa"/>
+            </w:tcMar>
+          </w:tcPr>
+          <w:p>
+            <w:r>
+              <w:rPr>
+                <w:rFonts w:ascii="Segoe UI" w:hAnsi="Segoe UI"/>
+                <w:sz w:val="17"/>
+              </w:rPr>
+              <w:t>4</w:t>
+            </w:r>
+          </w:p>
+        </w:tc>
+        <w:tc>
+          <w:tcPr>
+            <w:tcW w:type="dxa" w:w="2016"/>
+            <w:shd w:fill="F8F9FA"/>
+            <w:tcMar>
+              <w:top w:w="70" w:type="dxa"/>
+              <w:bottom w:w="70" w:type="dxa"/>
+              <w:left w:w="90" w:type="dxa"/>
+              <w:right w:w="90" w:type="dxa"/>
+            </w:tcMar>
+          </w:tcPr>
+          <w:p>
+            <w:r>
+              <w:rPr>
+                <w:rFonts w:ascii="Segoe UI" w:hAnsi="Segoe UI"/>
+                <w:b/>
+                <w:sz w:val="17"/>
+              </w:rPr>
+              <w:t>Faridabad</w:t>
+            </w:r>
+          </w:p>
+        </w:tc>
+        <w:tc>
+          <w:tcPr>
+            <w:tcW w:type="dxa" w:w="2016"/>
+            <w:shd w:fill="F8F9FA"/>
+            <w:tcMar>
+              <w:top w:w="70" w:type="dxa"/>
+              <w:bottom w:w="70" w:type="dxa"/>
+              <w:left w:w="90" w:type="dxa"/>
+              <w:right w:w="90" w:type="dxa"/>
+            </w:tcMar>
+          </w:tcPr>
+          <w:p>
+            <w:r>
+              <w:rPr>
+                <w:rFonts w:ascii="Segoe UI" w:hAnsi="Segoe UI"/>
+                <w:sz w:val="17"/>
+              </w:rPr>
+              <w:t>Southern</w:t>
+            </w:r>
+          </w:p>
+        </w:tc>
+        <w:tc>
+          <w:tcPr>
+            <w:tcW w:type="dxa" w:w="2016"/>
+            <w:shd w:fill="F8F9FA"/>
+            <w:tcMar>
+              <w:top w:w="70" w:type="dxa"/>
+              <w:bottom w:w="70" w:type="dxa"/>
+              <w:left w:w="90" w:type="dxa"/>
+              <w:right w:w="90" w:type="dxa"/>
+            </w:tcMar>
+          </w:tcPr>
+          <w:p>
+            <w:r>
+              <w:rPr>
+                <w:rFonts w:ascii="Segoe UI" w:hAnsi="Segoe UI"/>
+                <w:sz w:val="17"/>
+              </w:rPr>
+              <w:t>Faridabad, Ballabgarh</w:t>
+            </w:r>
+          </w:p>
+        </w:tc>
+        <w:tc>
+          <w:tcPr>
+            <w:tcW w:type="dxa" w:w="2016"/>
+            <w:shd w:fill="F8F9FA"/>
+            <w:tcMar>
+              <w:top w:w="70" w:type="dxa"/>
+              <w:bottom w:w="70" w:type="dxa"/>
+              <w:left w:w="90" w:type="dxa"/>
+              <w:right w:w="90" w:type="dxa"/>
+            </w:tcMar>
+          </w:tcPr>
+          <w:p>
+            <w:r>
+              <w:rPr>
+                <w:rFonts w:ascii="Segoe UI" w:hAnsi="Segoe UI"/>
+                <w:sz w:val="17"/>
+              </w:rPr>
+              <w:t>Wheat, Paddy, Bajra, Mustard, Vegetables</w:t>
+            </w:r>
+          </w:p>
+        </w:tc>
+      </w:tr>
+      <w:tr>
+        <w:tc>
+          <w:tcPr>
+            <w:tcW w:type="dxa" w:w="2016"/>
+            <w:shd w:fill="FFFFFF"/>
+            <w:tcMar>
+              <w:top w:w="70" w:type="dxa"/>
+              <w:bottom w:w="70" w:type="dxa"/>
+              <w:left w:w="90" w:type="dxa"/>
+              <w:right w:w="90" w:type="dxa"/>
+            </w:tcMar>
+          </w:tcPr>
+          <w:p>
+            <w:r>
+              <w:rPr>
+                <w:rFonts w:ascii="Segoe UI" w:hAnsi="Segoe UI"/>
+                <w:sz w:val="17"/>
+              </w:rPr>
+              <w:t>5</w:t>
+            </w:r>
+          </w:p>
+        </w:tc>
+        <w:tc>
+          <w:tcPr>
+            <w:tcW w:type="dxa" w:w="2016"/>
+            <w:shd w:fill="FFFFFF"/>
+            <w:tcMar>
+              <w:top w:w="70" w:type="dxa"/>
+              <w:bottom w:w="70" w:type="dxa"/>
+              <w:left w:w="90" w:type="dxa"/>
+              <w:right w:w="90" w:type="dxa"/>
+            </w:tcMar>
+          </w:tcPr>
+          <w:p>
+            <w:r>
+              <w:rPr>
+                <w:rFonts w:ascii="Segoe UI" w:hAnsi="Segoe UI"/>
+                <w:b/>
+                <w:sz w:val="17"/>
+              </w:rPr>
+              <w:t>Fatehabad</w:t>
+            </w:r>
+          </w:p>
+        </w:tc>
+        <w:tc>
+          <w:tcPr>
+            <w:tcW w:type="dxa" w:w="2016"/>
+            <w:shd w:fill="FFFFFF"/>
+            <w:tcMar>
+              <w:top w:w="70" w:type="dxa"/>
+              <w:bottom w:w="70" w:type="dxa"/>
+              <w:left w:w="90" w:type="dxa"/>
+              <w:right w:w="90" w:type="dxa"/>
+            </w:tcMar>
+          </w:tcPr>
+          <w:p>
+            <w:r>
+              <w:rPr>
+                <w:rFonts w:ascii="Segoe UI" w:hAnsi="Segoe UI"/>
+                <w:sz w:val="17"/>
+              </w:rPr>
+              <w:t>Western / South-Western</w:t>
+            </w:r>
+          </w:p>
+        </w:tc>
+        <w:tc>
+          <w:tcPr>
+            <w:tcW w:type="dxa" w:w="2016"/>
+            <w:shd w:fill="FFFFFF"/>
+            <w:tcMar>
+              <w:top w:w="70" w:type="dxa"/>
+              <w:bottom w:w="70" w:type="dxa"/>
+              <w:left w:w="90" w:type="dxa"/>
+              <w:right w:w="90" w:type="dxa"/>
+            </w:tcMar>
+          </w:tcPr>
+          <w:p>
+            <w:r>
+              <w:rPr>
+                <w:rFonts w:ascii="Segoe UI" w:hAnsi="Segoe UI"/>
+                <w:sz w:val="17"/>
+              </w:rPr>
+              <w:t>Fatehabad, Tohana, Ratia, Bhuna</w:t>
+            </w:r>
+          </w:p>
+        </w:tc>
+        <w:tc>
+          <w:tcPr>
+            <w:tcW w:type="dxa" w:w="2016"/>
+            <w:shd w:fill="FFFFFF"/>
+            <w:tcMar>
+              <w:top w:w="70" w:type="dxa"/>
+              <w:bottom w:w="70" w:type="dxa"/>
+              <w:left w:w="90" w:type="dxa"/>
+              <w:right w:w="90" w:type="dxa"/>
+            </w:tcMar>
+          </w:tcPr>
+          <w:p>
+            <w:r>
+              <w:rPr>
+                <w:rFonts w:ascii="Segoe UI" w:hAnsi="Segoe UI"/>
+                <w:sz w:val="17"/>
+              </w:rPr>
+              <w:t>Cotton, Wheat, Paddy, Mustard, Guar</w:t>
+            </w:r>
+          </w:p>
+        </w:tc>
+      </w:tr>
+      <w:tr>
+        <w:tc>
+          <w:tcPr>
+            <w:tcW w:type="dxa" w:w="2016"/>
+            <w:shd w:fill="F8F9FA"/>
+            <w:tcMar>
+              <w:top w:w="70" w:type="dxa"/>
+              <w:bottom w:w="70" w:type="dxa"/>
+              <w:left w:w="90" w:type="dxa"/>
+              <w:right w:w="90" w:type="dxa"/>
+            </w:tcMar>
+          </w:tcPr>
+          <w:p>
+            <w:r>
+              <w:rPr>
+                <w:rFonts w:ascii="Segoe UI" w:hAnsi="Segoe UI"/>
+                <w:sz w:val="17"/>
+              </w:rPr>
+              <w:t>6</w:t>
+            </w:r>
+          </w:p>
+        </w:tc>
+        <w:tc>
+          <w:tcPr>
+            <w:tcW w:type="dxa" w:w="2016"/>
+            <w:shd w:fill="F8F9FA"/>
+            <w:tcMar>
+              <w:top w:w="70" w:type="dxa"/>
+              <w:bottom w:w="70" w:type="dxa"/>
+              <w:left w:w="90" w:type="dxa"/>
+              <w:right w:w="90" w:type="dxa"/>
+            </w:tcMar>
+          </w:tcPr>
+          <w:p>
+            <w:r>
+              <w:rPr>
+                <w:rFonts w:ascii="Segoe UI" w:hAnsi="Segoe UI"/>
+                <w:b/>
+                <w:sz w:val="17"/>
+              </w:rPr>
+              <w:t>Gurugram</w:t>
+            </w:r>
+          </w:p>
+        </w:tc>
+        <w:tc>
+          <w:tcPr>
+            <w:tcW w:type="dxa" w:w="2016"/>
+            <w:shd w:fill="F8F9FA"/>
+            <w:tcMar>
+              <w:top w:w="70" w:type="dxa"/>
+              <w:bottom w:w="70" w:type="dxa"/>
+              <w:left w:w="90" w:type="dxa"/>
+              <w:right w:w="90" w:type="dxa"/>
+            </w:tcMar>
+          </w:tcPr>
+          <w:p>
+            <w:r>
+              <w:rPr>
+                <w:rFonts w:ascii="Segoe UI" w:hAnsi="Segoe UI"/>
+                <w:sz w:val="17"/>
+              </w:rPr>
+              <w:t>Southern</w:t>
+            </w:r>
+          </w:p>
+        </w:tc>
+        <w:tc>
+          <w:tcPr>
+            <w:tcW w:type="dxa" w:w="2016"/>
+            <w:shd w:fill="F8F9FA"/>
+            <w:tcMar>
+              <w:top w:w="70" w:type="dxa"/>
+              <w:bottom w:w="70" w:type="dxa"/>
+              <w:left w:w="90" w:type="dxa"/>
+              <w:right w:w="90" w:type="dxa"/>
+            </w:tcMar>
+          </w:tcPr>
+          <w:p>
+            <w:r>
+              <w:rPr>
+                <w:rFonts w:ascii="Segoe UI" w:hAnsi="Segoe UI"/>
+                <w:sz w:val="17"/>
+              </w:rPr>
+              <w:t>Gurugram, Sohna, Pataudi, Farrukhnagar</w:t>
+            </w:r>
+          </w:p>
+        </w:tc>
+        <w:tc>
+          <w:tcPr>
+            <w:tcW w:type="dxa" w:w="2016"/>
+            <w:shd w:fill="F8F9FA"/>
+            <w:tcMar>
+              <w:top w:w="70" w:type="dxa"/>
+              <w:bottom w:w="70" w:type="dxa"/>
+              <w:left w:w="90" w:type="dxa"/>
+              <w:right w:w="90" w:type="dxa"/>
+            </w:tcMar>
+          </w:tcPr>
+          <w:p>
+            <w:r>
+              <w:rPr>
+                <w:rFonts w:ascii="Segoe UI" w:hAnsi="Segoe UI"/>
+                <w:sz w:val="17"/>
+              </w:rPr>
+              <w:t>Wheat, Mustard, Bajra, Vegetables</w:t>
+            </w:r>
+          </w:p>
+        </w:tc>
+      </w:tr>
+      <w:tr>
+        <w:tc>
+          <w:tcPr>
+            <w:tcW w:type="dxa" w:w="2016"/>
+            <w:shd w:fill="FFFFFF"/>
+            <w:tcMar>
+              <w:top w:w="70" w:type="dxa"/>
+              <w:bottom w:w="70" w:type="dxa"/>
+              <w:left w:w="90" w:type="dxa"/>
+              <w:right w:w="90" w:type="dxa"/>
+            </w:tcMar>
+          </w:tcPr>
+          <w:p>
+            <w:r>
+              <w:rPr>
+                <w:rFonts w:ascii="Segoe UI" w:hAnsi="Segoe UI"/>
+                <w:sz w:val="17"/>
+              </w:rPr>
+              <w:t>7</w:t>
+            </w:r>
+          </w:p>
+        </w:tc>
+        <w:tc>
+          <w:tcPr>
+            <w:tcW w:type="dxa" w:w="2016"/>
+            <w:shd w:fill="FFFFFF"/>
+            <w:tcMar>
+              <w:top w:w="70" w:type="dxa"/>
+              <w:bottom w:w="70" w:type="dxa"/>
+              <w:left w:w="90" w:type="dxa"/>
+              <w:right w:w="90" w:type="dxa"/>
+            </w:tcMar>
+          </w:tcPr>
+          <w:p>
+            <w:r>
+              <w:rPr>
+                <w:rFonts w:ascii="Segoe UI" w:hAnsi="Segoe UI"/>
+                <w:b/>
+                <w:sz w:val="17"/>
+              </w:rPr>
+              <w:t>Hisar</w:t>
+            </w:r>
+          </w:p>
+        </w:tc>
+        <w:tc>
+          <w:tcPr>
+            <w:tcW w:type="dxa" w:w="2016"/>
+            <w:shd w:fill="FFFFFF"/>
+            <w:tcMar>
+              <w:top w:w="70" w:type="dxa"/>
+              <w:bottom w:w="70" w:type="dxa"/>
+              <w:left w:w="90" w:type="dxa"/>
+              <w:right w:w="90" w:type="dxa"/>
+            </w:tcMar>
+          </w:tcPr>
+          <w:p>
+            <w:r>
+              <w:rPr>
+                <w:rFonts w:ascii="Segoe UI" w:hAnsi="Segoe UI"/>
+                <w:sz w:val="17"/>
+              </w:rPr>
+              <w:t>Western / South-Western</w:t>
+            </w:r>
+          </w:p>
+        </w:tc>
+        <w:tc>
+          <w:tcPr>
+            <w:tcW w:type="dxa" w:w="2016"/>
+            <w:shd w:fill="FFFFFF"/>
+            <w:tcMar>
+              <w:top w:w="70" w:type="dxa"/>
+              <w:bottom w:w="70" w:type="dxa"/>
+              <w:left w:w="90" w:type="dxa"/>
+              <w:right w:w="90" w:type="dxa"/>
+            </w:tcMar>
+          </w:tcPr>
+          <w:p>
+            <w:r>
+              <w:rPr>
+                <w:rFonts w:ascii="Segoe UI" w:hAnsi="Segoe UI"/>
+                <w:sz w:val="17"/>
+              </w:rPr>
+              <w:t>Hisar, Hansi, Barwala, Adampur</w:t>
+            </w:r>
+          </w:p>
+        </w:tc>
+        <w:tc>
+          <w:tcPr>
+            <w:tcW w:type="dxa" w:w="2016"/>
+            <w:shd w:fill="FFFFFF"/>
+            <w:tcMar>
+              <w:top w:w="70" w:type="dxa"/>
+              <w:bottom w:w="70" w:type="dxa"/>
+              <w:left w:w="90" w:type="dxa"/>
+              <w:right w:w="90" w:type="dxa"/>
+            </w:tcMar>
+          </w:tcPr>
+          <w:p>
+            <w:r>
+              <w:rPr>
+                <w:rFonts w:ascii="Segoe UI" w:hAnsi="Segoe UI"/>
+                <w:sz w:val="17"/>
+              </w:rPr>
+              <w:t>Wheat, Cotton, Mustard, Bajra, Gram, Guar</w:t>
+            </w:r>
+          </w:p>
+        </w:tc>
+      </w:tr>
+      <w:tr>
+        <w:tc>
+          <w:tcPr>
+            <w:tcW w:type="dxa" w:w="2016"/>
+            <w:shd w:fill="F8F9FA"/>
+            <w:tcMar>
+              <w:top w:w="70" w:type="dxa"/>
+              <w:bottom w:w="70" w:type="dxa"/>
+              <w:left w:w="90" w:type="dxa"/>
+              <w:right w:w="90" w:type="dxa"/>
+            </w:tcMar>
+          </w:tcPr>
+          <w:p>
+            <w:r>
+              <w:rPr>
+                <w:rFonts w:ascii="Segoe UI" w:hAnsi="Segoe UI"/>
+                <w:sz w:val="17"/>
+              </w:rPr>
+              <w:t>8</w:t>
+            </w:r>
+          </w:p>
+        </w:tc>
+        <w:tc>
+          <w:tcPr>
+            <w:tcW w:type="dxa" w:w="2016"/>
+            <w:shd w:fill="F8F9FA"/>
+            <w:tcMar>
+              <w:top w:w="70" w:type="dxa"/>
+              <w:bottom w:w="70" w:type="dxa"/>
+              <w:left w:w="90" w:type="dxa"/>
+              <w:right w:w="90" w:type="dxa"/>
+            </w:tcMar>
+          </w:tcPr>
+          <w:p>
+            <w:r>
+              <w:rPr>
+                <w:rFonts w:ascii="Segoe UI" w:hAnsi="Segoe UI"/>
+                <w:b/>
+                <w:sz w:val="17"/>
+              </w:rPr>
+              <w:t>Jhajjar</w:t>
+            </w:r>
+          </w:p>
+        </w:tc>
+        <w:tc>
+          <w:tcPr>
+            <w:tcW w:type="dxa" w:w="2016"/>
+            <w:shd w:fill="F8F9FA"/>
+            <w:tcMar>
+              <w:top w:w="70" w:type="dxa"/>
+              <w:bottom w:w="70" w:type="dxa"/>
+              <w:left w:w="90" w:type="dxa"/>
+              <w:right w:w="90" w:type="dxa"/>
+            </w:tcMar>
+          </w:tcPr>
+          <w:p>
+            <w:r>
+              <w:rPr>
+                <w:rFonts w:ascii="Segoe UI" w:hAnsi="Segoe UI"/>
+                <w:sz w:val="17"/>
+              </w:rPr>
+              <w:t>Central</w:t>
+            </w:r>
+          </w:p>
+        </w:tc>
+        <w:tc>
+          <w:tcPr>
+            <w:tcW w:type="dxa" w:w="2016"/>
+            <w:shd w:fill="F8F9FA"/>
+            <w:tcMar>
+              <w:top w:w="70" w:type="dxa"/>
+              <w:bottom w:w="70" w:type="dxa"/>
+              <w:left w:w="90" w:type="dxa"/>
+              <w:right w:w="90" w:type="dxa"/>
+            </w:tcMar>
+          </w:tcPr>
+          <w:p>
+            <w:r>
+              <w:rPr>
+                <w:rFonts w:ascii="Segoe UI" w:hAnsi="Segoe UI"/>
+                <w:sz w:val="17"/>
+              </w:rPr>
+              <w:t>Jhajjar, Bahadurgarh, Beri, Matenhail</w:t>
+            </w:r>
+          </w:p>
+        </w:tc>
+        <w:tc>
+          <w:tcPr>
+            <w:tcW w:type="dxa" w:w="2016"/>
+            <w:shd w:fill="F8F9FA"/>
+            <w:tcMar>
+              <w:top w:w="70" w:type="dxa"/>
+              <w:bottom w:w="70" w:type="dxa"/>
+              <w:left w:w="90" w:type="dxa"/>
+              <w:right w:w="90" w:type="dxa"/>
+            </w:tcMar>
+          </w:tcPr>
+          <w:p>
+            <w:r>
+              <w:rPr>
+                <w:rFonts w:ascii="Segoe UI" w:hAnsi="Segoe UI"/>
+                <w:sz w:val="17"/>
+              </w:rPr>
+              <w:t>Wheat, Paddy, Mustard, Bajra, Vegetables</w:t>
+            </w:r>
+          </w:p>
+        </w:tc>
+      </w:tr>
+      <w:tr>
+        <w:tc>
+          <w:tcPr>
+            <w:tcW w:type="dxa" w:w="2016"/>
+            <w:shd w:fill="FFFFFF"/>
+            <w:tcMar>
+              <w:top w:w="70" w:type="dxa"/>
+              <w:bottom w:w="70" w:type="dxa"/>
+              <w:left w:w="90" w:type="dxa"/>
+              <w:right w:w="90" w:type="dxa"/>
+            </w:tcMar>
+          </w:tcPr>
+          <w:p>
+            <w:r>
+              <w:rPr>
+                <w:rFonts w:ascii="Segoe UI" w:hAnsi="Segoe UI"/>
+                <w:sz w:val="17"/>
+              </w:rPr>
+              <w:t>9</w:t>
+            </w:r>
+          </w:p>
+        </w:tc>
+        <w:tc>
+          <w:tcPr>
+            <w:tcW w:type="dxa" w:w="2016"/>
+            <w:shd w:fill="FFFFFF"/>
+            <w:tcMar>
+              <w:top w:w="70" w:type="dxa"/>
+              <w:bottom w:w="70" w:type="dxa"/>
+              <w:left w:w="90" w:type="dxa"/>
+              <w:right w:w="90" w:type="dxa"/>
+            </w:tcMar>
+          </w:tcPr>
+          <w:p>
+            <w:r>
+              <w:rPr>
+                <w:rFonts w:ascii="Segoe UI" w:hAnsi="Segoe UI"/>
+                <w:b/>
+                <w:sz w:val="17"/>
+              </w:rPr>
+              <w:t>Jind</w:t>
+            </w:r>
+          </w:p>
+        </w:tc>
+        <w:tc>
+          <w:tcPr>
+            <w:tcW w:type="dxa" w:w="2016"/>
+            <w:shd w:fill="FFFFFF"/>
+            <w:tcMar>
+              <w:top w:w="70" w:type="dxa"/>
+              <w:bottom w:w="70" w:type="dxa"/>
+              <w:left w:w="90" w:type="dxa"/>
+              <w:right w:w="90" w:type="dxa"/>
+            </w:tcMar>
+          </w:tcPr>
+          <w:p>
+            <w:r>
+              <w:rPr>
+                <w:rFonts w:ascii="Segoe UI" w:hAnsi="Segoe UI"/>
+                <w:sz w:val="17"/>
+              </w:rPr>
+              <w:t>Central</w:t>
+            </w:r>
+          </w:p>
+        </w:tc>
+        <w:tc>
+          <w:tcPr>
+            <w:tcW w:type="dxa" w:w="2016"/>
+            <w:shd w:fill="FFFFFF"/>
+            <w:tcMar>
+              <w:top w:w="70" w:type="dxa"/>
+              <w:bottom w:w="70" w:type="dxa"/>
+              <w:left w:w="90" w:type="dxa"/>
+              <w:right w:w="90" w:type="dxa"/>
+            </w:tcMar>
+          </w:tcPr>
+          <w:p>
+            <w:r>
+              <w:rPr>
+                <w:rFonts w:ascii="Segoe UI" w:hAnsi="Segoe UI"/>
+                <w:sz w:val="17"/>
+              </w:rPr>
+              <w:t>Jind, Narwana, Safidon, Julana</w:t>
+            </w:r>
+          </w:p>
+        </w:tc>
+        <w:tc>
+          <w:tcPr>
+            <w:tcW w:type="dxa" w:w="2016"/>
+            <w:shd w:fill="FFFFFF"/>
+            <w:tcMar>
+              <w:top w:w="70" w:type="dxa"/>
+              <w:bottom w:w="70" w:type="dxa"/>
+              <w:left w:w="90" w:type="dxa"/>
+              <w:right w:w="90" w:type="dxa"/>
+            </w:tcMar>
+          </w:tcPr>
+          <w:p>
+            <w:r>
+              <w:rPr>
+                <w:rFonts w:ascii="Segoe UI" w:hAnsi="Segoe UI"/>
+                <w:sz w:val="17"/>
+              </w:rPr>
+              <w:t>Wheat, Paddy, Sugarcane, Cotton, Mustard</w:t>
+            </w:r>
+          </w:p>
+        </w:tc>
+      </w:tr>
+      <w:tr>
+        <w:tc>
+          <w:tcPr>
+            <w:tcW w:type="dxa" w:w="2016"/>
+            <w:shd w:fill="F8F9FA"/>
+            <w:tcMar>
+              <w:top w:w="70" w:type="dxa"/>
+              <w:bottom w:w="70" w:type="dxa"/>
+              <w:left w:w="90" w:type="dxa"/>
+              <w:right w:w="90" w:type="dxa"/>
+            </w:tcMar>
+          </w:tcPr>
+          <w:p>
+            <w:r>
+              <w:rPr>
+                <w:rFonts w:ascii="Segoe UI" w:hAnsi="Segoe UI"/>
+                <w:sz w:val="17"/>
+              </w:rPr>
+              <w:t>10</w:t>
+            </w:r>
+          </w:p>
+        </w:tc>
+        <w:tc>
+          <w:tcPr>
+            <w:tcW w:type="dxa" w:w="2016"/>
+            <w:shd w:fill="F8F9FA"/>
+            <w:tcMar>
+              <w:top w:w="70" w:type="dxa"/>
+              <w:bottom w:w="70" w:type="dxa"/>
+              <w:left w:w="90" w:type="dxa"/>
+              <w:right w:w="90" w:type="dxa"/>
+            </w:tcMar>
+          </w:tcPr>
+          <w:p>
+            <w:r>
+              <w:rPr>
+                <w:rFonts w:ascii="Segoe UI" w:hAnsi="Segoe UI"/>
+                <w:b/>
+                <w:sz w:val="17"/>
+              </w:rPr>
+              <w:t>Kaithal</w:t>
+            </w:r>
+          </w:p>
+        </w:tc>
+        <w:tc>
+          <w:tcPr>
+            <w:tcW w:type="dxa" w:w="2016"/>
+            <w:shd w:fill="F8F9FA"/>
+            <w:tcMar>
+              <w:top w:w="70" w:type="dxa"/>
+              <w:bottom w:w="70" w:type="dxa"/>
+              <w:left w:w="90" w:type="dxa"/>
+              <w:right w:w="90" w:type="dxa"/>
+            </w:tcMar>
+          </w:tcPr>
+          <w:p>
+            <w:r>
+              <w:rPr>
+                <w:rFonts w:ascii="Segoe UI" w:hAnsi="Segoe UI"/>
+                <w:sz w:val="17"/>
+              </w:rPr>
+              <w:t>North-East</w:t>
+            </w:r>
+          </w:p>
+        </w:tc>
+        <w:tc>
+          <w:tcPr>
+            <w:tcW w:type="dxa" w:w="2016"/>
+            <w:shd w:fill="F8F9FA"/>
+            <w:tcMar>
+              <w:top w:w="70" w:type="dxa"/>
+              <w:bottom w:w="70" w:type="dxa"/>
+              <w:left w:w="90" w:type="dxa"/>
+              <w:right w:w="90" w:type="dxa"/>
+            </w:tcMar>
+          </w:tcPr>
+          <w:p>
+            <w:r>
+              <w:rPr>
+                <w:rFonts w:ascii="Segoe UI" w:hAnsi="Segoe UI"/>
+                <w:sz w:val="17"/>
+              </w:rPr>
+              <w:t>Kaithal, Pundri, Guhla (Cheeka), Rajaund</w:t>
+            </w:r>
+          </w:p>
+        </w:tc>
+        <w:tc>
+          <w:tcPr>
+            <w:tcW w:type="dxa" w:w="2016"/>
+            <w:shd w:fill="F8F9FA"/>
+            <w:tcMar>
+              <w:top w:w="70" w:type="dxa"/>
+              <w:bottom w:w="70" w:type="dxa"/>
+              <w:left w:w="90" w:type="dxa"/>
+              <w:right w:w="90" w:type="dxa"/>
+            </w:tcMar>
+          </w:tcPr>
+          <w:p>
+            <w:r>
+              <w:rPr>
+                <w:rFonts w:ascii="Segoe UI" w:hAnsi="Segoe UI"/>
+                <w:sz w:val="17"/>
+              </w:rPr>
+              <w:t>Paddy, Wheat, Sugarcane</w:t>
+            </w:r>
+          </w:p>
+        </w:tc>
+      </w:tr>
+      <w:tr>
+        <w:tc>
+          <w:tcPr>
+            <w:tcW w:type="dxa" w:w="2016"/>
+            <w:shd w:fill="FFFFFF"/>
+            <w:tcMar>
+              <w:top w:w="70" w:type="dxa"/>
+              <w:bottom w:w="70" w:type="dxa"/>
+              <w:left w:w="90" w:type="dxa"/>
+              <w:right w:w="90" w:type="dxa"/>
+            </w:tcMar>
+          </w:tcPr>
+          <w:p>
+            <w:r>
+              <w:rPr>
+                <w:rFonts w:ascii="Segoe UI" w:hAnsi="Segoe UI"/>
+                <w:sz w:val="17"/>
+              </w:rPr>
+              <w:t>11</w:t>
+            </w:r>
+          </w:p>
+        </w:tc>
+        <w:tc>
+          <w:tcPr>
+            <w:tcW w:type="dxa" w:w="2016"/>
+            <w:shd w:fill="FFFFFF"/>
+            <w:tcMar>
+              <w:top w:w="70" w:type="dxa"/>
+              <w:bottom w:w="70" w:type="dxa"/>
+              <w:left w:w="90" w:type="dxa"/>
+              <w:right w:w="90" w:type="dxa"/>
+            </w:tcMar>
+          </w:tcPr>
+          <w:p>
+            <w:r>
+              <w:rPr>
+                <w:rFonts w:ascii="Segoe UI" w:hAnsi="Segoe UI"/>
+                <w:b/>
+                <w:sz w:val="17"/>
+              </w:rPr>
+              <w:t>Karnal</w:t>
+            </w:r>
+          </w:p>
+        </w:tc>
+        <w:tc>
+          <w:tcPr>
+            <w:tcW w:type="dxa" w:w="2016"/>
+            <w:shd w:fill="FFFFFF"/>
+            <w:tcMar>
+              <w:top w:w="70" w:type="dxa"/>
+              <w:bottom w:w="70" w:type="dxa"/>
+              <w:left w:w="90" w:type="dxa"/>
+              <w:right w:w="90" w:type="dxa"/>
+            </w:tcMar>
+          </w:tcPr>
+          <w:p>
+            <w:r>
+              <w:rPr>
+                <w:rFonts w:ascii="Segoe UI" w:hAnsi="Segoe UI"/>
+                <w:sz w:val="17"/>
+              </w:rPr>
+              <w:t>North-East</w:t>
+            </w:r>
+          </w:p>
+        </w:tc>
+        <w:tc>
+          <w:tcPr>
+            <w:tcW w:type="dxa" w:w="2016"/>
+            <w:shd w:fill="FFFFFF"/>
+            <w:tcMar>
+              <w:top w:w="70" w:type="dxa"/>
+              <w:bottom w:w="70" w:type="dxa"/>
+              <w:left w:w="90" w:type="dxa"/>
+              <w:right w:w="90" w:type="dxa"/>
+            </w:tcMar>
+          </w:tcPr>
+          <w:p>
+            <w:r>
+              <w:rPr>
+                <w:rFonts w:ascii="Segoe UI" w:hAnsi="Segoe UI"/>
+                <w:sz w:val="17"/>
+              </w:rPr>
+              <w:t>Karnal, Assandh, Gharaunda, Indri</w:t>
+            </w:r>
+          </w:p>
+        </w:tc>
+        <w:tc>
+          <w:tcPr>
+            <w:tcW w:type="dxa" w:w="2016"/>
+            <w:shd w:fill="FFFFFF"/>
+            <w:tcMar>
+              <w:top w:w="70" w:type="dxa"/>
+              <w:bottom w:w="70" w:type="dxa"/>
+              <w:left w:w="90" w:type="dxa"/>
+              <w:right w:w="90" w:type="dxa"/>
+            </w:tcMar>
+          </w:tcPr>
+          <w:p>
+            <w:r>
+              <w:rPr>
+                <w:rFonts w:ascii="Segoe UI" w:hAnsi="Segoe UI"/>
+                <w:sz w:val="17"/>
+              </w:rPr>
+              <w:t>Paddy, Wheat, Sugarcane, Maize, Vegetables</w:t>
+            </w:r>
+          </w:p>
+        </w:tc>
+      </w:tr>
+      <w:tr>
+        <w:tc>
+          <w:tcPr>
+            <w:tcW w:type="dxa" w:w="2016"/>
+            <w:shd w:fill="F8F9FA"/>
+            <w:tcMar>
+              <w:top w:w="70" w:type="dxa"/>
+              <w:bottom w:w="70" w:type="dxa"/>
+              <w:left w:w="90" w:type="dxa"/>
+              <w:right w:w="90" w:type="dxa"/>
+            </w:tcMar>
+          </w:tcPr>
+          <w:p>
+            <w:r>
+              <w:rPr>
+                <w:rFonts w:ascii="Segoe UI" w:hAnsi="Segoe UI"/>
+                <w:sz w:val="17"/>
+              </w:rPr>
+              <w:t>12</w:t>
+            </w:r>
+          </w:p>
+        </w:tc>
+        <w:tc>
+          <w:tcPr>
+            <w:tcW w:type="dxa" w:w="2016"/>
+            <w:shd w:fill="F8F9FA"/>
+            <w:tcMar>
+              <w:top w:w="70" w:type="dxa"/>
+              <w:bottom w:w="70" w:type="dxa"/>
+              <w:left w:w="90" w:type="dxa"/>
+              <w:right w:w="90" w:type="dxa"/>
+            </w:tcMar>
+          </w:tcPr>
+          <w:p>
+            <w:r>
+              <w:rPr>
+                <w:rFonts w:ascii="Segoe UI" w:hAnsi="Segoe UI"/>
+                <w:b/>
+                <w:sz w:val="17"/>
+              </w:rPr>
+              <w:t>Kurukshetra</w:t>
+            </w:r>
+          </w:p>
+        </w:tc>
+        <w:tc>
+          <w:tcPr>
+            <w:tcW w:type="dxa" w:w="2016"/>
+            <w:shd w:fill="F8F9FA"/>
+            <w:tcMar>
+              <w:top w:w="70" w:type="dxa"/>
+              <w:bottom w:w="70" w:type="dxa"/>
+              <w:left w:w="90" w:type="dxa"/>
+              <w:right w:w="90" w:type="dxa"/>
+            </w:tcMar>
+          </w:tcPr>
+          <w:p>
+            <w:r>
+              <w:rPr>
+                <w:rFonts w:ascii="Segoe UI" w:hAnsi="Segoe UI"/>
+                <w:sz w:val="17"/>
+              </w:rPr>
+              <w:t>North-East</w:t>
+            </w:r>
+          </w:p>
+        </w:tc>
+        <w:tc>
+          <w:tcPr>
+            <w:tcW w:type="dxa" w:w="2016"/>
+            <w:shd w:fill="F8F9FA"/>
+            <w:tcMar>
+              <w:top w:w="70" w:type="dxa"/>
+              <w:bottom w:w="70" w:type="dxa"/>
+              <w:left w:w="90" w:type="dxa"/>
+              <w:right w:w="90" w:type="dxa"/>
+            </w:tcMar>
+          </w:tcPr>
+          <w:p>
+            <w:r>
+              <w:rPr>
+                <w:rFonts w:ascii="Segoe UI" w:hAnsi="Segoe UI"/>
+                <w:sz w:val="17"/>
+              </w:rPr>
+              <w:t>Kurukshetra (Thanesar), Shahabad, Pehowa, Ladwa</w:t>
+            </w:r>
+          </w:p>
+        </w:tc>
+        <w:tc>
+          <w:tcPr>
+            <w:tcW w:type="dxa" w:w="2016"/>
+            <w:shd w:fill="F8F9FA"/>
+            <w:tcMar>
+              <w:top w:w="70" w:type="dxa"/>
+              <w:bottom w:w="70" w:type="dxa"/>
+              <w:left w:w="90" w:type="dxa"/>
+              <w:right w:w="90" w:type="dxa"/>
+            </w:tcMar>
+          </w:tcPr>
+          <w:p>
+            <w:r>
+              <w:rPr>
+                <w:rFonts w:ascii="Segoe UI" w:hAnsi="Segoe UI"/>
+                <w:sz w:val="17"/>
+              </w:rPr>
+              <w:t>Paddy, Wheat, Sugarcane, Potato, Sunflower</w:t>
+            </w:r>
+          </w:p>
+        </w:tc>
+      </w:tr>
+      <w:tr>
+        <w:tc>
+          <w:tcPr>
+            <w:tcW w:type="dxa" w:w="2016"/>
+            <w:shd w:fill="FFFFFF"/>
+            <w:tcMar>
+              <w:top w:w="70" w:type="dxa"/>
+              <w:bottom w:w="70" w:type="dxa"/>
+              <w:left w:w="90" w:type="dxa"/>
+              <w:right w:w="90" w:type="dxa"/>
+            </w:tcMar>
+          </w:tcPr>
+          <w:p>
+            <w:r>
+              <w:rPr>
+                <w:rFonts w:ascii="Segoe UI" w:hAnsi="Segoe UI"/>
+                <w:sz w:val="17"/>
+              </w:rPr>
+              <w:t>13</w:t>
+            </w:r>
+          </w:p>
+        </w:tc>
+        <w:tc>
+          <w:tcPr>
+            <w:tcW w:type="dxa" w:w="2016"/>
+            <w:shd w:fill="FFFFFF"/>
+            <w:tcMar>
+              <w:top w:w="70" w:type="dxa"/>
+              <w:bottom w:w="70" w:type="dxa"/>
+              <w:left w:w="90" w:type="dxa"/>
+              <w:right w:w="90" w:type="dxa"/>
+            </w:tcMar>
+          </w:tcPr>
+          <w:p>
+            <w:r>
+              <w:rPr>
+                <w:rFonts w:ascii="Segoe UI" w:hAnsi="Segoe UI"/>
+                <w:b/>
+                <w:sz w:val="17"/>
+              </w:rPr>
+              <w:t>Mahendragarh</w:t>
+            </w:r>
+          </w:p>
+        </w:tc>
+        <w:tc>
+          <w:tcPr>
+            <w:tcW w:type="dxa" w:w="2016"/>
+            <w:shd w:fill="FFFFFF"/>
+            <w:tcMar>
+              <w:top w:w="70" w:type="dxa"/>
+              <w:bottom w:w="70" w:type="dxa"/>
+              <w:left w:w="90" w:type="dxa"/>
+              <w:right w:w="90" w:type="dxa"/>
+            </w:tcMar>
+          </w:tcPr>
+          <w:p>
+            <w:r>
+              <w:rPr>
+                <w:rFonts w:ascii="Segoe UI" w:hAnsi="Segoe UI"/>
+                <w:sz w:val="17"/>
+              </w:rPr>
+              <w:t>Southern</w:t>
+            </w:r>
+          </w:p>
+        </w:tc>
+        <w:tc>
+          <w:tcPr>
+            <w:tcW w:type="dxa" w:w="2016"/>
+            <w:shd w:fill="FFFFFF"/>
+            <w:tcMar>
+              <w:top w:w="70" w:type="dxa"/>
+              <w:bottom w:w="70" w:type="dxa"/>
+              <w:left w:w="90" w:type="dxa"/>
+              <w:right w:w="90" w:type="dxa"/>
+            </w:tcMar>
+          </w:tcPr>
+          <w:p>
+            <w:r>
+              <w:rPr>
+                <w:rFonts w:ascii="Segoe UI" w:hAnsi="Segoe UI"/>
+                <w:sz w:val="17"/>
+              </w:rPr>
+              <w:t>Narnaul, Mahendragarh, Ateli, Nangal Chaudhry</w:t>
+            </w:r>
+          </w:p>
+        </w:tc>
+        <w:tc>
+          <w:tcPr>
+            <w:tcW w:type="dxa" w:w="2016"/>
+            <w:shd w:fill="FFFFFF"/>
+            <w:tcMar>
+              <w:top w:w="70" w:type="dxa"/>
+              <w:bottom w:w="70" w:type="dxa"/>
+              <w:left w:w="90" w:type="dxa"/>
+              <w:right w:w="90" w:type="dxa"/>
+            </w:tcMar>
+          </w:tcPr>
+          <w:p>
+            <w:r>
+              <w:rPr>
+                <w:rFonts w:ascii="Segoe UI" w:hAnsi="Segoe UI"/>
+                <w:sz w:val="17"/>
+              </w:rPr>
+              <w:t>Bajra, Mustard, Guar, Gram, Wheat</w:t>
+            </w:r>
+          </w:p>
+        </w:tc>
+      </w:tr>
+      <w:tr>
+        <w:tc>
+          <w:tcPr>
+            <w:tcW w:type="dxa" w:w="2016"/>
+            <w:shd w:fill="F8F9FA"/>
+            <w:tcMar>
+              <w:top w:w="70" w:type="dxa"/>
+              <w:bottom w:w="70" w:type="dxa"/>
+              <w:left w:w="90" w:type="dxa"/>
+              <w:right w:w="90" w:type="dxa"/>
+            </w:tcMar>
+          </w:tcPr>
+          <w:p>
+            <w:r>
+              <w:rPr>
+                <w:rFonts w:ascii="Segoe UI" w:hAnsi="Segoe UI"/>
+                <w:sz w:val="17"/>
+              </w:rPr>
+              <w:t>14</w:t>
+            </w:r>
+          </w:p>
+        </w:tc>
+        <w:tc>
+          <w:tcPr>
+            <w:tcW w:type="dxa" w:w="2016"/>
+            <w:shd w:fill="F8F9FA"/>
+            <w:tcMar>
+              <w:top w:w="70" w:type="dxa"/>
+              <w:bottom w:w="70" w:type="dxa"/>
+              <w:left w:w="90" w:type="dxa"/>
+              <w:right w:w="90" w:type="dxa"/>
+            </w:tcMar>
+          </w:tcPr>
+          <w:p>
+            <w:r>
+              <w:rPr>
+                <w:rFonts w:ascii="Segoe UI" w:hAnsi="Segoe UI"/>
+                <w:b/>
+                <w:sz w:val="17"/>
+              </w:rPr>
+              <w:t>Nuh</w:t>
+            </w:r>
+          </w:p>
+        </w:tc>
+        <w:tc>
+          <w:tcPr>
+            <w:tcW w:type="dxa" w:w="2016"/>
+            <w:shd w:fill="F8F9FA"/>
+            <w:tcMar>
+              <w:top w:w="70" w:type="dxa"/>
+              <w:bottom w:w="70" w:type="dxa"/>
+              <w:left w:w="90" w:type="dxa"/>
+              <w:right w:w="90" w:type="dxa"/>
+            </w:tcMar>
+          </w:tcPr>
+          <w:p>
+            <w:r>
+              <w:rPr>
+                <w:rFonts w:ascii="Segoe UI" w:hAnsi="Segoe UI"/>
+                <w:sz w:val="17"/>
+              </w:rPr>
+              <w:t>Southern</w:t>
+            </w:r>
+          </w:p>
+        </w:tc>
+        <w:tc>
+          <w:tcPr>
+            <w:tcW w:type="dxa" w:w="2016"/>
+            <w:shd w:fill="F8F9FA"/>
+            <w:tcMar>
+              <w:top w:w="70" w:type="dxa"/>
+              <w:bottom w:w="70" w:type="dxa"/>
+              <w:left w:w="90" w:type="dxa"/>
+              <w:right w:w="90" w:type="dxa"/>
+            </w:tcMar>
+          </w:tcPr>
+          <w:p>
+            <w:r>
+              <w:rPr>
+                <w:rFonts w:ascii="Segoe UI" w:hAnsi="Segoe UI"/>
+                <w:sz w:val="17"/>
+              </w:rPr>
+              <w:t>Nuh, Ferozepur Jhirka, Punahana, Taoru</w:t>
+            </w:r>
+          </w:p>
+        </w:tc>
+        <w:tc>
+          <w:tcPr>
+            <w:tcW w:type="dxa" w:w="2016"/>
+            <w:shd w:fill="F8F9FA"/>
+            <w:tcMar>
+              <w:top w:w="70" w:type="dxa"/>
+              <w:bottom w:w="70" w:type="dxa"/>
+              <w:left w:w="90" w:type="dxa"/>
+              <w:right w:w="90" w:type="dxa"/>
+            </w:tcMar>
+          </w:tcPr>
+          <w:p>
+            <w:r>
+              <w:rPr>
+                <w:rFonts w:ascii="Segoe UI" w:hAnsi="Segoe UI"/>
+                <w:sz w:val="17"/>
+              </w:rPr>
+              <w:t>Wheat, Mustard, Bajra, Vegetables</w:t>
+            </w:r>
+          </w:p>
+        </w:tc>
+      </w:tr>
+      <w:tr>
+        <w:tc>
+          <w:tcPr>
+            <w:tcW w:type="dxa" w:w="2016"/>
+            <w:shd w:fill="FFFFFF"/>
+            <w:tcMar>
+              <w:top w:w="70" w:type="dxa"/>
+              <w:bottom w:w="70" w:type="dxa"/>
+              <w:left w:w="90" w:type="dxa"/>
+              <w:right w:w="90" w:type="dxa"/>
+            </w:tcMar>
+          </w:tcPr>
+          <w:p>
+            <w:r>
+              <w:rPr>
+                <w:rFonts w:ascii="Segoe UI" w:hAnsi="Segoe UI"/>
+                <w:sz w:val="17"/>
+              </w:rPr>
+              <w:t>15</w:t>
+            </w:r>
+          </w:p>
+        </w:tc>
+        <w:tc>
+          <w:tcPr>
+            <w:tcW w:type="dxa" w:w="2016"/>
+            <w:shd w:fill="FFFFFF"/>
+            <w:tcMar>
+              <w:top w:w="70" w:type="dxa"/>
+              <w:bottom w:w="70" w:type="dxa"/>
+              <w:left w:w="90" w:type="dxa"/>
+              <w:right w:w="90" w:type="dxa"/>
+            </w:tcMar>
+          </w:tcPr>
+          <w:p>
+            <w:r>
+              <w:rPr>
+                <w:rFonts w:ascii="Segoe UI" w:hAnsi="Segoe UI"/>
+                <w:b/>
+                <w:sz w:val="17"/>
+              </w:rPr>
+              <w:t>Palwal</w:t>
+            </w:r>
+          </w:p>
+        </w:tc>
+        <w:tc>
+          <w:tcPr>
+            <w:tcW w:type="dxa" w:w="2016"/>
+            <w:shd w:fill="FFFFFF"/>
+            <w:tcMar>
+              <w:top w:w="70" w:type="dxa"/>
+              <w:bottom w:w="70" w:type="dxa"/>
+              <w:left w:w="90" w:type="dxa"/>
+              <w:right w:w="90" w:type="dxa"/>
+            </w:tcMar>
+          </w:tcPr>
+          <w:p>
+            <w:r>
+              <w:rPr>
+                <w:rFonts w:ascii="Segoe UI" w:hAnsi="Segoe UI"/>
+                <w:sz w:val="17"/>
+              </w:rPr>
+              <w:t>Southern</w:t>
+            </w:r>
+          </w:p>
+        </w:tc>
+        <w:tc>
+          <w:tcPr>
+            <w:tcW w:type="dxa" w:w="2016"/>
+            <w:shd w:fill="FFFFFF"/>
+            <w:tcMar>
+              <w:top w:w="70" w:type="dxa"/>
+              <w:bottom w:w="70" w:type="dxa"/>
+              <w:left w:w="90" w:type="dxa"/>
+              <w:right w:w="90" w:type="dxa"/>
+            </w:tcMar>
+          </w:tcPr>
+          <w:p>
+            <w:r>
+              <w:rPr>
+                <w:rFonts w:ascii="Segoe UI" w:hAnsi="Segoe UI"/>
+                <w:sz w:val="17"/>
+              </w:rPr>
+              <w:t>Palwal, Hodal, Hathin</w:t>
+            </w:r>
+          </w:p>
+        </w:tc>
+        <w:tc>
+          <w:tcPr>
+            <w:tcW w:type="dxa" w:w="2016"/>
+            <w:shd w:fill="FFFFFF"/>
+            <w:tcMar>
+              <w:top w:w="70" w:type="dxa"/>
+              <w:bottom w:w="70" w:type="dxa"/>
+              <w:left w:w="90" w:type="dxa"/>
+              <w:right w:w="90" w:type="dxa"/>
+            </w:tcMar>
+          </w:tcPr>
+          <w:p>
+            <w:r>
+              <w:rPr>
+                <w:rFonts w:ascii="Segoe UI" w:hAnsi="Segoe UI"/>
+                <w:sz w:val="17"/>
+              </w:rPr>
+              <w:t>Wheat, Paddy, Mustard, Potato, Vegetables</w:t>
+            </w:r>
+          </w:p>
+        </w:tc>
+      </w:tr>
+      <w:tr>
+        <w:tc>
+          <w:tcPr>
+            <w:tcW w:type="dxa" w:w="2016"/>
+            <w:shd w:fill="F8F9FA"/>
+            <w:tcMar>
+              <w:top w:w="70" w:type="dxa"/>
+              <w:bottom w:w="70" w:type="dxa"/>
+              <w:left w:w="90" w:type="dxa"/>
+              <w:right w:w="90" w:type="dxa"/>
+            </w:tcMar>
+          </w:tcPr>
+          <w:p>
+            <w:r>
+              <w:rPr>
+                <w:rFonts w:ascii="Segoe UI" w:hAnsi="Segoe UI"/>
+                <w:sz w:val="17"/>
+              </w:rPr>
+              <w:t>16</w:t>
+            </w:r>
+          </w:p>
+        </w:tc>
+        <w:tc>
+          <w:tcPr>
+            <w:tcW w:type="dxa" w:w="2016"/>
+            <w:shd w:fill="F8F9FA"/>
+            <w:tcMar>
+              <w:top w:w="70" w:type="dxa"/>
+              <w:bottom w:w="70" w:type="dxa"/>
+              <w:left w:w="90" w:type="dxa"/>
+              <w:right w:w="90" w:type="dxa"/>
+            </w:tcMar>
+          </w:tcPr>
+          <w:p>
+            <w:r>
+              <w:rPr>
+                <w:rFonts w:ascii="Segoe UI" w:hAnsi="Segoe UI"/>
+                <w:b/>
+                <w:sz w:val="17"/>
+              </w:rPr>
+              <w:t>Panchkula</w:t>
+            </w:r>
+          </w:p>
+        </w:tc>
+        <w:tc>
+          <w:tcPr>
+            <w:tcW w:type="dxa" w:w="2016"/>
+            <w:shd w:fill="F8F9FA"/>
+            <w:tcMar>
+              <w:top w:w="70" w:type="dxa"/>
+              <w:bottom w:w="70" w:type="dxa"/>
+              <w:left w:w="90" w:type="dxa"/>
+              <w:right w:w="90" w:type="dxa"/>
+            </w:tcMar>
+          </w:tcPr>
+          <w:p>
+            <w:r>
+              <w:rPr>
+                <w:rFonts w:ascii="Segoe UI" w:hAnsi="Segoe UI"/>
+                <w:sz w:val="17"/>
+              </w:rPr>
+              <w:t>North-East</w:t>
+            </w:r>
+          </w:p>
+        </w:tc>
+        <w:tc>
+          <w:tcPr>
+            <w:tcW w:type="dxa" w:w="2016"/>
+            <w:shd w:fill="F8F9FA"/>
+            <w:tcMar>
+              <w:top w:w="70" w:type="dxa"/>
+              <w:bottom w:w="70" w:type="dxa"/>
+              <w:left w:w="90" w:type="dxa"/>
+              <w:right w:w="90" w:type="dxa"/>
+            </w:tcMar>
+          </w:tcPr>
+          <w:p>
+            <w:r>
+              <w:rPr>
+                <w:rFonts w:ascii="Segoe UI" w:hAnsi="Segoe UI"/>
+                <w:sz w:val="17"/>
+              </w:rPr>
+              <w:t>Panchkula, Kalka, Pinjore, Raipur Rani</w:t>
+            </w:r>
+          </w:p>
+        </w:tc>
+        <w:tc>
+          <w:tcPr>
+            <w:tcW w:type="dxa" w:w="2016"/>
+            <w:shd w:fill="F8F9FA"/>
+            <w:tcMar>
+              <w:top w:w="70" w:type="dxa"/>
+              <w:bottom w:w="70" w:type="dxa"/>
+              <w:left w:w="90" w:type="dxa"/>
+              <w:right w:w="90" w:type="dxa"/>
+            </w:tcMar>
+          </w:tcPr>
+          <w:p>
+            <w:r>
+              <w:rPr>
+                <w:rFonts w:ascii="Segoe UI" w:hAnsi="Segoe UI"/>
+                <w:sz w:val="17"/>
+              </w:rPr>
+              <w:t>Wheat, Maize, Paddy, Vegetables, Mango and Litchi</w:t>
+            </w:r>
+          </w:p>
+        </w:tc>
+      </w:tr>
+      <w:tr>
+        <w:tc>
+          <w:tcPr>
+            <w:tcW w:type="dxa" w:w="2016"/>
+            <w:shd w:fill="FFFFFF"/>
+            <w:tcMar>
+              <w:top w:w="70" w:type="dxa"/>
+              <w:bottom w:w="70" w:type="dxa"/>
+              <w:left w:w="90" w:type="dxa"/>
+              <w:right w:w="90" w:type="dxa"/>
+            </w:tcMar>
+          </w:tcPr>
+          <w:p>
+            <w:r>
+              <w:rPr>
+                <w:rFonts w:ascii="Segoe UI" w:hAnsi="Segoe UI"/>
+                <w:sz w:val="17"/>
+              </w:rPr>
+              <w:t>17</w:t>
+            </w:r>
+          </w:p>
+        </w:tc>
+        <w:tc>
+          <w:tcPr>
+            <w:tcW w:type="dxa" w:w="2016"/>
+            <w:shd w:fill="FFFFFF"/>
+            <w:tcMar>
+              <w:top w:w="70" w:type="dxa"/>
+              <w:bottom w:w="70" w:type="dxa"/>
+              <w:left w:w="90" w:type="dxa"/>
+              <w:right w:w="90" w:type="dxa"/>
+            </w:tcMar>
+          </w:tcPr>
+          <w:p>
+            <w:r>
+              <w:rPr>
+                <w:rFonts w:ascii="Segoe UI" w:hAnsi="Segoe UI"/>
+                <w:b/>
+                <w:sz w:val="17"/>
+              </w:rPr>
+              <w:t>Panipat</w:t>
+            </w:r>
+          </w:p>
+        </w:tc>
+        <w:tc>
+          <w:tcPr>
+            <w:tcW w:type="dxa" w:w="2016"/>
+            <w:shd w:fill="FFFFFF"/>
+            <w:tcMar>
+              <w:top w:w="70" w:type="dxa"/>
+              <w:bottom w:w="70" w:type="dxa"/>
+              <w:left w:w="90" w:type="dxa"/>
+              <w:right w:w="90" w:type="dxa"/>
+            </w:tcMar>
+          </w:tcPr>
+          <w:p>
+            <w:r>
+              <w:rPr>
+                <w:rFonts w:ascii="Segoe UI" w:hAnsi="Segoe UI"/>
+                <w:sz w:val="17"/>
+              </w:rPr>
+              <w:t>Central</w:t>
+            </w:r>
+          </w:p>
+        </w:tc>
+        <w:tc>
+          <w:tcPr>
+            <w:tcW w:type="dxa" w:w="2016"/>
+            <w:shd w:fill="FFFFFF"/>
+            <w:tcMar>
+              <w:top w:w="70" w:type="dxa"/>
+              <w:bottom w:w="70" w:type="dxa"/>
+              <w:left w:w="90" w:type="dxa"/>
+              <w:right w:w="90" w:type="dxa"/>
+            </w:tcMar>
+          </w:tcPr>
+          <w:p>
+            <w:r>
+              <w:rPr>
+                <w:rFonts w:ascii="Segoe UI" w:hAnsi="Segoe UI"/>
+                <w:sz w:val="17"/>
+              </w:rPr>
+              <w:t>Panipat, Samalkha, Israna, Bapoli</w:t>
+            </w:r>
+          </w:p>
+        </w:tc>
+        <w:tc>
+          <w:tcPr>
+            <w:tcW w:type="dxa" w:w="2016"/>
+            <w:shd w:fill="FFFFFF"/>
+            <w:tcMar>
+              <w:top w:w="70" w:type="dxa"/>
+              <w:bottom w:w="70" w:type="dxa"/>
+              <w:left w:w="90" w:type="dxa"/>
+              <w:right w:w="90" w:type="dxa"/>
+            </w:tcMar>
+          </w:tcPr>
+          <w:p>
+            <w:r>
+              <w:rPr>
+                <w:rFonts w:ascii="Segoe UI" w:hAnsi="Segoe UI"/>
+                <w:sz w:val="17"/>
+              </w:rPr>
+              <w:t>Wheat, Paddy, Sugarcane, Vegetables</w:t>
+            </w:r>
+          </w:p>
+        </w:tc>
+      </w:tr>
+      <w:tr>
+        <w:tc>
+          <w:tcPr>
+            <w:tcW w:type="dxa" w:w="2016"/>
+            <w:shd w:fill="F8F9FA"/>
+            <w:tcMar>
+              <w:top w:w="70" w:type="dxa"/>
+              <w:bottom w:w="70" w:type="dxa"/>
+              <w:left w:w="90" w:type="dxa"/>
+              <w:right w:w="90" w:type="dxa"/>
+            </w:tcMar>
+          </w:tcPr>
+          <w:p>
+            <w:r>
+              <w:rPr>
+                <w:rFonts w:ascii="Segoe UI" w:hAnsi="Segoe UI"/>
+                <w:sz w:val="17"/>
+              </w:rPr>
+              <w:t>18</w:t>
+            </w:r>
+          </w:p>
+        </w:tc>
+        <w:tc>
+          <w:tcPr>
+            <w:tcW w:type="dxa" w:w="2016"/>
+            <w:shd w:fill="F8F9FA"/>
+            <w:tcMar>
+              <w:top w:w="70" w:type="dxa"/>
+              <w:bottom w:w="70" w:type="dxa"/>
+              <w:left w:w="90" w:type="dxa"/>
+              <w:right w:w="90" w:type="dxa"/>
+            </w:tcMar>
+          </w:tcPr>
+          <w:p>
+            <w:r>
+              <w:rPr>
+                <w:rFonts w:ascii="Segoe UI" w:hAnsi="Segoe UI"/>
+                <w:b/>
+                <w:sz w:val="17"/>
+              </w:rPr>
+              <w:t>Rewari</w:t>
+            </w:r>
+          </w:p>
+        </w:tc>
+        <w:tc>
+          <w:tcPr>
+            <w:tcW w:type="dxa" w:w="2016"/>
+            <w:shd w:fill="F8F9FA"/>
+            <w:tcMar>
+              <w:top w:w="70" w:type="dxa"/>
+              <w:bottom w:w="70" w:type="dxa"/>
+              <w:left w:w="90" w:type="dxa"/>
+              <w:right w:w="90" w:type="dxa"/>
+            </w:tcMar>
+          </w:tcPr>
+          <w:p>
+            <w:r>
+              <w:rPr>
+                <w:rFonts w:ascii="Segoe UI" w:hAnsi="Segoe UI"/>
+                <w:sz w:val="17"/>
+              </w:rPr>
+              <w:t>Southern</w:t>
+            </w:r>
+          </w:p>
+        </w:tc>
+        <w:tc>
+          <w:tcPr>
+            <w:tcW w:type="dxa" w:w="2016"/>
+            <w:shd w:fill="F8F9FA"/>
+            <w:tcMar>
+              <w:top w:w="70" w:type="dxa"/>
+              <w:bottom w:w="70" w:type="dxa"/>
+              <w:left w:w="90" w:type="dxa"/>
+              <w:right w:w="90" w:type="dxa"/>
+            </w:tcMar>
+          </w:tcPr>
+          <w:p>
+            <w:r>
+              <w:rPr>
+                <w:rFonts w:ascii="Segoe UI" w:hAnsi="Segoe UI"/>
+                <w:sz w:val="17"/>
+              </w:rPr>
+              <w:t>Rewari, Bawal, Dharuhera, Kosli</w:t>
+            </w:r>
+          </w:p>
+        </w:tc>
+        <w:tc>
+          <w:tcPr>
+            <w:tcW w:type="dxa" w:w="2016"/>
+            <w:shd w:fill="F8F9FA"/>
+            <w:tcMar>
+              <w:top w:w="70" w:type="dxa"/>
+              <w:bottom w:w="70" w:type="dxa"/>
+              <w:left w:w="90" w:type="dxa"/>
+              <w:right w:w="90" w:type="dxa"/>
+            </w:tcMar>
+          </w:tcPr>
+          <w:p>
+            <w:r>
+              <w:rPr>
+                <w:rFonts w:ascii="Segoe UI" w:hAnsi="Segoe UI"/>
+                <w:sz w:val="17"/>
+              </w:rPr>
+              <w:t>Bajra, Mustard, Wheat, Guar, Gram</w:t>
+            </w:r>
+          </w:p>
+        </w:tc>
+      </w:tr>
+      <w:tr>
+        <w:tc>
+          <w:tcPr>
+            <w:tcW w:type="dxa" w:w="2016"/>
+            <w:shd w:fill="FFFFFF"/>
+            <w:tcMar>
+              <w:top w:w="70" w:type="dxa"/>
+              <w:bottom w:w="70" w:type="dxa"/>
+              <w:left w:w="90" w:type="dxa"/>
+              <w:right w:w="90" w:type="dxa"/>
+            </w:tcMar>
+          </w:tcPr>
+          <w:p>
+            <w:r>
+              <w:rPr>
+                <w:rFonts w:ascii="Segoe UI" w:hAnsi="Segoe UI"/>
+                <w:sz w:val="17"/>
+              </w:rPr>
+              <w:t>19</w:t>
+            </w:r>
+          </w:p>
+        </w:tc>
+        <w:tc>
+          <w:tcPr>
+            <w:tcW w:type="dxa" w:w="2016"/>
+            <w:shd w:fill="FFFFFF"/>
+            <w:tcMar>
+              <w:top w:w="70" w:type="dxa"/>
+              <w:bottom w:w="70" w:type="dxa"/>
+              <w:left w:w="90" w:type="dxa"/>
+              <w:right w:w="90" w:type="dxa"/>
+            </w:tcMar>
+          </w:tcPr>
+          <w:p>
+            <w:r>
+              <w:rPr>
+                <w:rFonts w:ascii="Segoe UI" w:hAnsi="Segoe UI"/>
+                <w:b/>
+                <w:sz w:val="17"/>
+              </w:rPr>
+              <w:t>Rohtak</w:t>
+            </w:r>
+          </w:p>
+        </w:tc>
+        <w:tc>
+          <w:tcPr>
+            <w:tcW w:type="dxa" w:w="2016"/>
+            <w:shd w:fill="FFFFFF"/>
+            <w:tcMar>
+              <w:top w:w="70" w:type="dxa"/>
+              <w:bottom w:w="70" w:type="dxa"/>
+              <w:left w:w="90" w:type="dxa"/>
+              <w:right w:w="90" w:type="dxa"/>
+            </w:tcMar>
+          </w:tcPr>
+          <w:p>
+            <w:r>
+              <w:rPr>
+                <w:rFonts w:ascii="Segoe UI" w:hAnsi="Segoe UI"/>
+                <w:sz w:val="17"/>
+              </w:rPr>
+              <w:t>Central</w:t>
+            </w:r>
+          </w:p>
+        </w:tc>
+        <w:tc>
+          <w:tcPr>
+            <w:tcW w:type="dxa" w:w="2016"/>
+            <w:shd w:fill="FFFFFF"/>
+            <w:tcMar>
+              <w:top w:w="70" w:type="dxa"/>
+              <w:bottom w:w="70" w:type="dxa"/>
+              <w:left w:w="90" w:type="dxa"/>
+              <w:right w:w="90" w:type="dxa"/>
+            </w:tcMar>
+          </w:tcPr>
+          <w:p>
+            <w:r>
+              <w:rPr>
+                <w:rFonts w:ascii="Segoe UI" w:hAnsi="Segoe UI"/>
+                <w:sz w:val="17"/>
+              </w:rPr>
+              <w:t>Rohtak, Meham, Kalanaur, Sampla</w:t>
+            </w:r>
+          </w:p>
+        </w:tc>
+        <w:tc>
+          <w:tcPr>
+            <w:tcW w:type="dxa" w:w="2016"/>
+            <w:shd w:fill="FFFFFF"/>
+            <w:tcMar>
+              <w:top w:w="70" w:type="dxa"/>
+              <w:bottom w:w="70" w:type="dxa"/>
+              <w:left w:w="90" w:type="dxa"/>
+              <w:right w:w="90" w:type="dxa"/>
+            </w:tcMar>
+          </w:tcPr>
+          <w:p>
+            <w:r>
+              <w:rPr>
+                <w:rFonts w:ascii="Segoe UI" w:hAnsi="Segoe UI"/>
+                <w:sz w:val="17"/>
+              </w:rPr>
+              <w:t>Wheat, Paddy, Mustard, Bajra, Vegetables</w:t>
+            </w:r>
+          </w:p>
+        </w:tc>
+      </w:tr>
+      <w:tr>
+        <w:tc>
+          <w:tcPr>
+            <w:tcW w:type="dxa" w:w="2016"/>
+            <w:shd w:fill="F8F9FA"/>
+            <w:tcMar>
+              <w:top w:w="70" w:type="dxa"/>
+              <w:bottom w:w="70" w:type="dxa"/>
+              <w:left w:w="90" w:type="dxa"/>
+              <w:right w:w="90" w:type="dxa"/>
+            </w:tcMar>
+          </w:tcPr>
+          <w:p>
+            <w:r>
+              <w:rPr>
+                <w:rFonts w:ascii="Segoe UI" w:hAnsi="Segoe UI"/>
+                <w:sz w:val="17"/>
+              </w:rPr>
+              <w:t>20</w:t>
+            </w:r>
+          </w:p>
+        </w:tc>
+        <w:tc>
+          <w:tcPr>
+            <w:tcW w:type="dxa" w:w="2016"/>
+            <w:shd w:fill="F8F9FA"/>
+            <w:tcMar>
+              <w:top w:w="70" w:type="dxa"/>
+              <w:bottom w:w="70" w:type="dxa"/>
+              <w:left w:w="90" w:type="dxa"/>
+              <w:right w:w="90" w:type="dxa"/>
+            </w:tcMar>
+          </w:tcPr>
+          <w:p>
+            <w:r>
+              <w:rPr>
+                <w:rFonts w:ascii="Segoe UI" w:hAnsi="Segoe UI"/>
+                <w:b/>
+                <w:sz w:val="17"/>
+              </w:rPr>
+              <w:t>Sirsa</w:t>
+            </w:r>
+          </w:p>
+        </w:tc>
+        <w:tc>
+          <w:tcPr>
+            <w:tcW w:type="dxa" w:w="2016"/>
+            <w:shd w:fill="F8F9FA"/>
+            <w:tcMar>
+              <w:top w:w="70" w:type="dxa"/>
+              <w:bottom w:w="70" w:type="dxa"/>
+              <w:left w:w="90" w:type="dxa"/>
+              <w:right w:w="90" w:type="dxa"/>
+            </w:tcMar>
+          </w:tcPr>
+          <w:p>
+            <w:r>
+              <w:rPr>
+                <w:rFonts w:ascii="Segoe UI" w:hAnsi="Segoe UI"/>
+                <w:sz w:val="17"/>
+              </w:rPr>
+              <w:t>Western / South-Western</w:t>
+            </w:r>
+          </w:p>
+        </w:tc>
+        <w:tc>
+          <w:tcPr>
+            <w:tcW w:type="dxa" w:w="2016"/>
+            <w:shd w:fill="F8F9FA"/>
+            <w:tcMar>
+              <w:top w:w="70" w:type="dxa"/>
+              <w:bottom w:w="70" w:type="dxa"/>
+              <w:left w:w="90" w:type="dxa"/>
+              <w:right w:w="90" w:type="dxa"/>
+            </w:tcMar>
+          </w:tcPr>
+          <w:p>
+            <w:r>
+              <w:rPr>
+                <w:rFonts w:ascii="Segoe UI" w:hAnsi="Segoe UI"/>
+                <w:sz w:val="17"/>
+              </w:rPr>
+              <w:t>Sirsa, Dabwali, Ellenabad, Rania</w:t>
+            </w:r>
+          </w:p>
+        </w:tc>
+        <w:tc>
+          <w:tcPr>
+            <w:tcW w:type="dxa" w:w="2016"/>
+            <w:shd w:fill="F8F9FA"/>
+            <w:tcMar>
+              <w:top w:w="70" w:type="dxa"/>
+              <w:bottom w:w="70" w:type="dxa"/>
+              <w:left w:w="90" w:type="dxa"/>
+              <w:right w:w="90" w:type="dxa"/>
+            </w:tcMar>
+          </w:tcPr>
+          <w:p>
+            <w:r>
+              <w:rPr>
+                <w:rFonts w:ascii="Segoe UI" w:hAnsi="Segoe UI"/>
+                <w:sz w:val="17"/>
+              </w:rPr>
+              <w:t>Cotton, Wheat, Paddy, Mustard, Guar</w:t>
+            </w:r>
+          </w:p>
+        </w:tc>
+      </w:tr>
+      <w:tr>
+        <w:tc>
+          <w:tcPr>
+            <w:tcW w:type="dxa" w:w="2016"/>
+            <w:shd w:fill="FFFFFF"/>
+            <w:tcMar>
+              <w:top w:w="70" w:type="dxa"/>
+              <w:bottom w:w="70" w:type="dxa"/>
+              <w:left w:w="90" w:type="dxa"/>
+              <w:right w:w="90" w:type="dxa"/>
+            </w:tcMar>
+          </w:tcPr>
+          <w:p>
+            <w:r>
+              <w:rPr>
+                <w:rFonts w:ascii="Segoe UI" w:hAnsi="Segoe UI"/>
+                <w:sz w:val="17"/>
+              </w:rPr>
+              <w:t>21</w:t>
+            </w:r>
+          </w:p>
+        </w:tc>
+        <w:tc>
+          <w:tcPr>
+            <w:tcW w:type="dxa" w:w="2016"/>
+            <w:shd w:fill="FFFFFF"/>
+            <w:tcMar>
+              <w:top w:w="70" w:type="dxa"/>
+              <w:bottom w:w="70" w:type="dxa"/>
+              <w:left w:w="90" w:type="dxa"/>
+              <w:right w:w="90" w:type="dxa"/>
+            </w:tcMar>
+          </w:tcPr>
+          <w:p>
+            <w:r>
+              <w:rPr>
+                <w:rFonts w:ascii="Segoe UI" w:hAnsi="Segoe UI"/>
+                <w:b/>
+                <w:sz w:val="17"/>
+              </w:rPr>
+              <w:t>Sonipat</w:t>
+            </w:r>
+          </w:p>
+        </w:tc>
+        <w:tc>
+          <w:tcPr>
+            <w:tcW w:type="dxa" w:w="2016"/>
+            <w:shd w:fill="FFFFFF"/>
+            <w:tcMar>
+              <w:top w:w="70" w:type="dxa"/>
+              <w:bottom w:w="70" w:type="dxa"/>
+              <w:left w:w="90" w:type="dxa"/>
+              <w:right w:w="90" w:type="dxa"/>
+            </w:tcMar>
+          </w:tcPr>
+          <w:p>
+            <w:r>
+              <w:rPr>
+                <w:rFonts w:ascii="Segoe UI" w:hAnsi="Segoe UI"/>
+                <w:sz w:val="17"/>
+              </w:rPr>
+              <w:t>Central</w:t>
+            </w:r>
+          </w:p>
+        </w:tc>
+        <w:tc>
+          <w:tcPr>
+            <w:tcW w:type="dxa" w:w="2016"/>
+            <w:shd w:fill="FFFFFF"/>
+            <w:tcMar>
+              <w:top w:w="70" w:type="dxa"/>
+              <w:bottom w:w="70" w:type="dxa"/>
+              <w:left w:w="90" w:type="dxa"/>
+              <w:right w:w="90" w:type="dxa"/>
+            </w:tcMar>
+          </w:tcPr>
+          <w:p>
+            <w:r>
+              <w:rPr>
+                <w:rFonts w:ascii="Segoe UI" w:hAnsi="Segoe UI"/>
+                <w:sz w:val="17"/>
+              </w:rPr>
+              <w:t>Sonipat, Gohana, Kharkhoda, Ganaur</w:t>
+            </w:r>
+          </w:p>
+        </w:tc>
+        <w:tc>
+          <w:tcPr>
+            <w:tcW w:type="dxa" w:w="2016"/>
+            <w:shd w:fill="FFFFFF"/>
+            <w:tcMar>
+              <w:top w:w="70" w:type="dxa"/>
+              <w:bottom w:w="70" w:type="dxa"/>
+              <w:left w:w="90" w:type="dxa"/>
+              <w:right w:w="90" w:type="dxa"/>
+            </w:tcMar>
+          </w:tcPr>
+          <w:p>
+            <w:r>
+              <w:rPr>
+                <w:rFonts w:ascii="Segoe UI" w:hAnsi="Segoe UI"/>
+                <w:sz w:val="17"/>
+              </w:rPr>
+              <w:t>Wheat, Paddy, Sugarcane, Vegetables, Baby Corn</w:t>
+            </w:r>
+          </w:p>
+        </w:tc>
+      </w:tr>
+      <w:tr>
+        <w:tc>
+          <w:tcPr>
+            <w:tcW w:type="dxa" w:w="2016"/>
+            <w:shd w:fill="F8F9FA"/>
+            <w:tcMar>
+              <w:top w:w="70" w:type="dxa"/>
+              <w:bottom w:w="70" w:type="dxa"/>
+              <w:left w:w="90" w:type="dxa"/>
+              <w:right w:w="90" w:type="dxa"/>
+            </w:tcMar>
+          </w:tcPr>
+          <w:p>
+            <w:r>
+              <w:rPr>
+                <w:rFonts w:ascii="Segoe UI" w:hAnsi="Segoe UI"/>
+                <w:sz w:val="17"/>
+              </w:rPr>
+              <w:t>22</w:t>
+            </w:r>
+          </w:p>
+        </w:tc>
+        <w:tc>
+          <w:tcPr>
+            <w:tcW w:type="dxa" w:w="2016"/>
+            <w:shd w:fill="F8F9FA"/>
+            <w:tcMar>
+              <w:top w:w="70" w:type="dxa"/>
+              <w:bottom w:w="70" w:type="dxa"/>
+              <w:left w:w="90" w:type="dxa"/>
+              <w:right w:w="90" w:type="dxa"/>
+            </w:tcMar>
+          </w:tcPr>
+          <w:p>
+            <w:r>
+              <w:rPr>
+                <w:rFonts w:ascii="Segoe UI" w:hAnsi="Segoe UI"/>
+                <w:b/>
+                <w:sz w:val="17"/>
+              </w:rPr>
+              <w:t>Yamunanagar</w:t>
+            </w:r>
+          </w:p>
+        </w:tc>
+        <w:tc>
+          <w:tcPr>
+            <w:tcW w:type="dxa" w:w="2016"/>
+            <w:shd w:fill="F8F9FA"/>
+            <w:tcMar>
+              <w:top w:w="70" w:type="dxa"/>
+              <w:bottom w:w="70" w:type="dxa"/>
+              <w:left w:w="90" w:type="dxa"/>
+              <w:right w:w="90" w:type="dxa"/>
+            </w:tcMar>
+          </w:tcPr>
+          <w:p>
+            <w:r>
+              <w:rPr>
+                <w:rFonts w:ascii="Segoe UI" w:hAnsi="Segoe UI"/>
+                <w:sz w:val="17"/>
+              </w:rPr>
+              <w:t>North-East</w:t>
+            </w:r>
+          </w:p>
+        </w:tc>
+        <w:tc>
+          <w:tcPr>
+            <w:tcW w:type="dxa" w:w="2016"/>
+            <w:shd w:fill="F8F9FA"/>
+            <w:tcMar>
+              <w:top w:w="70" w:type="dxa"/>
+              <w:bottom w:w="70" w:type="dxa"/>
+              <w:left w:w="90" w:type="dxa"/>
+              <w:right w:w="90" w:type="dxa"/>
+            </w:tcMar>
+          </w:tcPr>
+          <w:p>
+            <w:r>
+              <w:rPr>
+                <w:rFonts w:ascii="Segoe UI" w:hAnsi="Segoe UI"/>
+                <w:sz w:val="17"/>
+              </w:rPr>
+              <w:t>Yamunanagar, Jagadhri, Radaur, Bilaspur</w:t>
+            </w:r>
+          </w:p>
+        </w:tc>
+        <w:tc>
+          <w:tcPr>
+            <w:tcW w:type="dxa" w:w="2016"/>
+            <w:shd w:fill="F8F9FA"/>
+            <w:tcMar>
+              <w:top w:w="70" w:type="dxa"/>
+              <w:bottom w:w="70" w:type="dxa"/>
+              <w:left w:w="90" w:type="dxa"/>
+              <w:right w:w="90" w:type="dxa"/>
+            </w:tcMar>
+          </w:tcPr>
+          <w:p>
+            <w:r>
+              <w:rPr>
+                <w:rFonts w:ascii="Segoe UI" w:hAnsi="Segoe UI"/>
+                <w:sz w:val="17"/>
+              </w:rPr>
+              <w:t>Sugarcane, Paddy, Wheat, Maize, Poplar (Agroforestry)</w:t>
+            </w:r>
+          </w:p>
+        </w:tc>
+      </w:tr>
+    </w:tbl>
+    <w:p>
+      <w:pPr>
+        <w:spacing w:before="280" w:after="80"/>
+      </w:pPr>
+      <w:r>
+        <w:rPr>
+          <w:rFonts w:ascii="Segoe UI Semibold" w:hAnsi="Segoe UI Semibold"/>
+          <w:b/>
+          <w:color w:val="1B4332"/>
+          <w:sz w:val="26"/>
+        </w:rPr>
+        <w:t>9. Stepwise GPU Curriculum Training Telemetry (NVIDIA GeForce RTX 3050)</w:t>
+      </w:r>
+    </w:p>
+    <w:p>
+      <w:pPr>
+        <w:spacing w:after="120"/>
+      </w:pPr>
+      <w:r>
+        <w:rPr>
+          <w:rFonts w:ascii="Segoe UI" w:hAnsi="Segoe UI"/>
+          <w:sz w:val="20"/>
+        </w:rPr>
+        <w:t>To train across all newly incorporated Haryana crops, a dedicated Stepwise GPU Curriculum was executed using PyTorch CUDA (cu121) on an NVIDIA GeForce RTX 3050 6GB Laptop GPU. Training occurred step-by-step, crop-by-crop with its associated Haryana districts:</w:t>
+      </w:r>
+    </w:p>
+    <w:tbl>
+      <w:tblPr>
+        <w:tblW w:type="auto" w:w="0"/>
+        <w:jc w:val="center"/>
+        <w:tblLook w:firstColumn="1" w:firstRow="1" w:lastColumn="0" w:lastRow="0" w:noHBand="0" w:noVBand="1" w:val="04A0"/>
+      </w:tblPr>
+      <w:tblGrid>
+        <w:gridCol w:w="1680"/>
+        <w:gridCol w:w="1680"/>
+        <w:gridCol w:w="1680"/>
+        <w:gridCol w:w="1680"/>
+        <w:gridCol w:w="1680"/>
+        <w:gridCol w:w="1680"/>
+      </w:tblGrid>
+      <w:tr>
+        <w:tc>
+          <w:tcPr>
+            <w:tcW w:type="dxa" w:w="1680"/>
+            <w:shd w:fill="2D6A4F"/>
+            <w:tcMar>
+              <w:top w:w="120" w:type="dxa"/>
+              <w:bottom w:w="120" w:type="dxa"/>
+              <w:left w:w="120" w:type="dxa"/>
+              <w:right w:w="120" w:type="dxa"/>
+            </w:tcMar>
+          </w:tcPr>
+          <w:p>
+            <w:r>
+              <w:rPr>
+                <w:rFonts w:ascii="Segoe UI" w:hAnsi="Segoe UI"/>
+                <w:b/>
+                <w:color w:val="FFFFFF"/>
+                <w:sz w:val="19"/>
+              </w:rPr>
+              <w:t>Step</w:t>
+            </w:r>
+          </w:p>
+        </w:tc>
+        <w:tc>
+          <w:tcPr>
+            <w:tcW w:type="dxa" w:w="1680"/>
+            <w:shd w:fill="2D6A4F"/>
+            <w:tcMar>
+              <w:top w:w="120" w:type="dxa"/>
+              <w:bottom w:w="120" w:type="dxa"/>
+              <w:left w:w="120" w:type="dxa"/>
+              <w:right w:w="120" w:type="dxa"/>
+            </w:tcMar>
+          </w:tcPr>
+          <w:p>
+            <w:r>
+              <w:rPr>
+                <w:rFonts w:ascii="Segoe UI" w:hAnsi="Segoe UI"/>
+                <w:b/>
+                <w:color w:val="FFFFFF"/>
+                <w:sz w:val="19"/>
+              </w:rPr>
+              <w:t>Crop</w:t>
+            </w:r>
+          </w:p>
+        </w:tc>
+        <w:tc>
+          <w:tcPr>
+            <w:tcW w:type="dxa" w:w="1680"/>
+            <w:shd w:fill="2D6A4F"/>
+            <w:tcMar>
+              <w:top w:w="120" w:type="dxa"/>
+              <w:bottom w:w="120" w:type="dxa"/>
+              <w:left w:w="120" w:type="dxa"/>
+              <w:right w:w="120" w:type="dxa"/>
+            </w:tcMar>
+          </w:tcPr>
+          <w:p>
+            <w:r>
+              <w:rPr>
+                <w:rFonts w:ascii="Segoe UI" w:hAnsi="Segoe UI"/>
+                <w:b/>
+                <w:color w:val="FFFFFF"/>
+                <w:sz w:val="19"/>
+              </w:rPr>
+              <w:t>Target Haryana Districts</w:t>
+            </w:r>
+          </w:p>
+        </w:tc>
+        <w:tc>
+          <w:tcPr>
+            <w:tcW w:type="dxa" w:w="1680"/>
+            <w:shd w:fill="2D6A4F"/>
+            <w:tcMar>
+              <w:top w:w="120" w:type="dxa"/>
+              <w:bottom w:w="120" w:type="dxa"/>
+              <w:left w:w="120" w:type="dxa"/>
+              <w:right w:w="120" w:type="dxa"/>
+            </w:tcMar>
+          </w:tcPr>
+          <w:p>
+            <w:r>
+              <w:rPr>
+                <w:rFonts w:ascii="Segoe UI" w:hAnsi="Segoe UI"/>
+                <w:b/>
+                <w:color w:val="FFFFFF"/>
+                <w:sz w:val="19"/>
+              </w:rPr>
+              <w:t>Classes / Pathogens</w:t>
+            </w:r>
+          </w:p>
+        </w:tc>
+        <w:tc>
+          <w:tcPr>
+            <w:tcW w:type="dxa" w:w="1680"/>
+            <w:shd w:fill="2D6A4F"/>
+            <w:tcMar>
+              <w:top w:w="120" w:type="dxa"/>
+              <w:bottom w:w="120" w:type="dxa"/>
+              <w:left w:w="120" w:type="dxa"/>
+              <w:right w:w="120" w:type="dxa"/>
+            </w:tcMar>
+          </w:tcPr>
+          <w:p>
+            <w:r>
+              <w:rPr>
+                <w:rFonts w:ascii="Segoe UI" w:hAnsi="Segoe UI"/>
+                <w:b/>
+                <w:color w:val="FFFFFF"/>
+                <w:sz w:val="19"/>
+              </w:rPr>
+              <w:t>Duration</w:t>
+            </w:r>
+          </w:p>
+        </w:tc>
+        <w:tc>
+          <w:tcPr>
+            <w:tcW w:type="dxa" w:w="1680"/>
+            <w:shd w:fill="2D6A4F"/>
+            <w:tcMar>
+              <w:top w:w="120" w:type="dxa"/>
+              <w:bottom w:w="120" w:type="dxa"/>
+              <w:left w:w="120" w:type="dxa"/>
+              <w:right w:w="120" w:type="dxa"/>
+            </w:tcMar>
+          </w:tcPr>
+          <w:p>
+            <w:r>
+              <w:rPr>
+                <w:rFonts w:ascii="Segoe UI" w:hAnsi="Segoe UI"/>
+                <w:b/>
+                <w:color w:val="FFFFFF"/>
+                <w:sz w:val="19"/>
+              </w:rPr>
+              <w:t>Best Val Acc</w:t>
+            </w:r>
+          </w:p>
+        </w:tc>
+      </w:tr>
+      <w:tr>
+        <w:tc>
+          <w:tcPr>
+            <w:tcW w:type="dxa" w:w="1680"/>
+            <w:shd w:fill="FFFFFF"/>
+            <w:tcMar>
+              <w:top w:w="70" w:type="dxa"/>
+              <w:bottom w:w="70" w:type="dxa"/>
+              <w:left w:w="90" w:type="dxa"/>
+              <w:right w:w="90" w:type="dxa"/>
+            </w:tcMar>
+          </w:tcPr>
+          <w:p>
+            <w:r>
+              <w:rPr>
+                <w:rFonts w:ascii="Segoe UI" w:hAnsi="Segoe UI"/>
+                <w:b/>
+                <w:sz w:val="17"/>
+              </w:rPr>
+              <w:t>1</w:t>
+            </w:r>
+          </w:p>
+        </w:tc>
+        <w:tc>
+          <w:tcPr>
+            <w:tcW w:type="dxa" w:w="1680"/>
+            <w:shd w:fill="FFFFFF"/>
+            <w:tcMar>
+              <w:top w:w="70" w:type="dxa"/>
+              <w:bottom w:w="70" w:type="dxa"/>
+              <w:left w:w="90" w:type="dxa"/>
+              <w:right w:w="90" w:type="dxa"/>
+            </w:tcMar>
+          </w:tcPr>
+          <w:p>
+            <w:r>
+              <w:rPr>
+                <w:rFonts w:ascii="Segoe UI" w:hAnsi="Segoe UI"/>
+                <w:sz w:val="17"/>
+              </w:rPr>
+              <w:t>Wheat (Gehu)</w:t>
+            </w:r>
+          </w:p>
+        </w:tc>
+        <w:tc>
+          <w:tcPr>
+            <w:tcW w:type="dxa" w:w="1680"/>
+            <w:shd w:fill="FFFFFF"/>
+            <w:tcMar>
+              <w:top w:w="70" w:type="dxa"/>
+              <w:bottom w:w="70" w:type="dxa"/>
+              <w:left w:w="90" w:type="dxa"/>
+              <w:right w:w="90" w:type="dxa"/>
+            </w:tcMar>
+          </w:tcPr>
+          <w:p>
+            <w:r>
+              <w:rPr>
+                <w:rFonts w:ascii="Segoe UI" w:hAnsi="Segoe UI"/>
+                <w:sz w:val="17"/>
+              </w:rPr>
+              <w:t>Karnal, Kurukshetra, Hisar, Jind, Rohtak, Sirsa, Ambala, Kaithal</w:t>
+            </w:r>
+          </w:p>
+        </w:tc>
+        <w:tc>
+          <w:tcPr>
+            <w:tcW w:type="dxa" w:w="1680"/>
+            <w:shd w:fill="FFFFFF"/>
+            <w:tcMar>
+              <w:top w:w="70" w:type="dxa"/>
+              <w:bottom w:w="70" w:type="dxa"/>
+              <w:left w:w="90" w:type="dxa"/>
+              <w:right w:w="90" w:type="dxa"/>
+            </w:tcMar>
+          </w:tcPr>
+          <w:p>
+            <w:r>
+              <w:rPr>
+                <w:rFonts w:ascii="Segoe UI" w:hAnsi="Segoe UI"/>
+                <w:sz w:val="17"/>
+              </w:rPr>
+              <w:t>Stripe Rust, Leaf Rust, Stem Rust, Healthy (4 classes)</w:t>
+            </w:r>
+          </w:p>
+        </w:tc>
+        <w:tc>
+          <w:tcPr>
+            <w:tcW w:type="dxa" w:w="1680"/>
+            <w:shd w:fill="FFFFFF"/>
+            <w:tcMar>
+              <w:top w:w="70" w:type="dxa"/>
+              <w:bottom w:w="70" w:type="dxa"/>
+              <w:left w:w="90" w:type="dxa"/>
+              <w:right w:w="90" w:type="dxa"/>
+            </w:tcMar>
+          </w:tcPr>
+          <w:p>
+            <w:r>
+              <w:rPr>
+                <w:rFonts w:ascii="Segoe UI" w:hAnsi="Segoe UI"/>
+                <w:sz w:val="17"/>
+              </w:rPr>
+              <w:t>34.5s</w:t>
+            </w:r>
+          </w:p>
+        </w:tc>
+        <w:tc>
+          <w:tcPr>
+            <w:tcW w:type="dxa" w:w="1680"/>
+            <w:shd w:fill="FFFFFF"/>
+            <w:tcMar>
+              <w:top w:w="70" w:type="dxa"/>
+              <w:bottom w:w="70" w:type="dxa"/>
+              <w:left w:w="90" w:type="dxa"/>
+              <w:right w:w="90" w:type="dxa"/>
+            </w:tcMar>
+          </w:tcPr>
+          <w:p>
+            <w:r>
+              <w:rPr>
+                <w:rFonts w:ascii="Segoe UI" w:hAnsi="Segoe UI"/>
+                <w:b/>
+                <w:color w:val="081C15"/>
+                <w:sz w:val="17"/>
+              </w:rPr>
+              <w:t>97.40%</w:t>
+            </w:r>
+          </w:p>
+        </w:tc>
+      </w:tr>
+      <w:tr>
+        <w:tc>
+          <w:tcPr>
+            <w:tcW w:type="dxa" w:w="1680"/>
+            <w:shd w:fill="F8F9FA"/>
+            <w:tcMar>
+              <w:top w:w="70" w:type="dxa"/>
+              <w:bottom w:w="70" w:type="dxa"/>
+              <w:left w:w="90" w:type="dxa"/>
+              <w:right w:w="90" w:type="dxa"/>
+            </w:tcMar>
+          </w:tcPr>
+          <w:p>
+            <w:r>
+              <w:rPr>
+                <w:rFonts w:ascii="Segoe UI" w:hAnsi="Segoe UI"/>
+                <w:b/>
+                <w:sz w:val="17"/>
+              </w:rPr>
+              <w:t>2</w:t>
+            </w:r>
+          </w:p>
+        </w:tc>
+        <w:tc>
+          <w:tcPr>
+            <w:tcW w:type="dxa" w:w="1680"/>
+            <w:shd w:fill="F8F9FA"/>
+            <w:tcMar>
+              <w:top w:w="70" w:type="dxa"/>
+              <w:bottom w:w="70" w:type="dxa"/>
+              <w:left w:w="90" w:type="dxa"/>
+              <w:right w:w="90" w:type="dxa"/>
+            </w:tcMar>
+          </w:tcPr>
+          <w:p>
+            <w:r>
+              <w:rPr>
+                <w:rFonts w:ascii="Segoe UI" w:hAnsi="Segoe UI"/>
+                <w:sz w:val="17"/>
+              </w:rPr>
+              <w:t>Rice (Paddy)</w:t>
+            </w:r>
+          </w:p>
+        </w:tc>
+        <w:tc>
+          <w:tcPr>
+            <w:tcW w:type="dxa" w:w="1680"/>
+            <w:shd w:fill="F8F9FA"/>
+            <w:tcMar>
+              <w:top w:w="70" w:type="dxa"/>
+              <w:bottom w:w="70" w:type="dxa"/>
+              <w:left w:w="90" w:type="dxa"/>
+              <w:right w:w="90" w:type="dxa"/>
+            </w:tcMar>
+          </w:tcPr>
+          <w:p>
+            <w:r>
+              <w:rPr>
+                <w:rFonts w:ascii="Segoe UI" w:hAnsi="Segoe UI"/>
+                <w:sz w:val="17"/>
+              </w:rPr>
+              <w:t>Karnal, Kaithal, Kurukshetra, Yamunanagar, Ambala, Panipat, Sonipat</w:t>
+            </w:r>
+          </w:p>
+        </w:tc>
+        <w:tc>
+          <w:tcPr>
+            <w:tcW w:type="dxa" w:w="1680"/>
+            <w:shd w:fill="F8F9FA"/>
+            <w:tcMar>
+              <w:top w:w="70" w:type="dxa"/>
+              <w:bottom w:w="70" w:type="dxa"/>
+              <w:left w:w="90" w:type="dxa"/>
+              <w:right w:w="90" w:type="dxa"/>
+            </w:tcMar>
+          </w:tcPr>
+          <w:p>
+            <w:r>
+              <w:rPr>
+                <w:rFonts w:ascii="Segoe UI" w:hAnsi="Segoe UI"/>
+                <w:sz w:val="17"/>
+              </w:rPr>
+              <w:t>Bacterial Blight, Brown Spot, Leaf Smut (3 classes)</w:t>
+            </w:r>
+          </w:p>
+        </w:tc>
+        <w:tc>
+          <w:tcPr>
+            <w:tcW w:type="dxa" w:w="1680"/>
+            <w:shd w:fill="F8F9FA"/>
+            <w:tcMar>
+              <w:top w:w="70" w:type="dxa"/>
+              <w:bottom w:w="70" w:type="dxa"/>
+              <w:left w:w="90" w:type="dxa"/>
+              <w:right w:w="90" w:type="dxa"/>
+            </w:tcMar>
+          </w:tcPr>
+          <w:p>
+            <w:r>
+              <w:rPr>
+                <w:rFonts w:ascii="Segoe UI" w:hAnsi="Segoe UI"/>
+                <w:sz w:val="17"/>
+              </w:rPr>
+              <w:t>7.2s</w:t>
+            </w:r>
+          </w:p>
+        </w:tc>
+        <w:tc>
+          <w:tcPr>
+            <w:tcW w:type="dxa" w:w="1680"/>
+            <w:shd w:fill="F8F9FA"/>
+            <w:tcMar>
+              <w:top w:w="70" w:type="dxa"/>
+              <w:bottom w:w="70" w:type="dxa"/>
+              <w:left w:w="90" w:type="dxa"/>
+              <w:right w:w="90" w:type="dxa"/>
+            </w:tcMar>
+          </w:tcPr>
+          <w:p>
+            <w:r>
+              <w:rPr>
+                <w:rFonts w:ascii="Segoe UI" w:hAnsi="Segoe UI"/>
+                <w:b/>
+                <w:color w:val="081C15"/>
+                <w:sz w:val="17"/>
+              </w:rPr>
+              <w:t>87.50%</w:t>
+            </w:r>
+          </w:p>
+        </w:tc>
+      </w:tr>
+      <w:tr>
+        <w:tc>
+          <w:tcPr>
+            <w:tcW w:type="dxa" w:w="1680"/>
+            <w:shd w:fill="FFFFFF"/>
+            <w:tcMar>
+              <w:top w:w="70" w:type="dxa"/>
+              <w:bottom w:w="70" w:type="dxa"/>
+              <w:left w:w="90" w:type="dxa"/>
+              <w:right w:w="90" w:type="dxa"/>
+            </w:tcMar>
+          </w:tcPr>
+          <w:p>
+            <w:r>
+              <w:rPr>
+                <w:rFonts w:ascii="Segoe UI" w:hAnsi="Segoe UI"/>
+                <w:b/>
+                <w:sz w:val="17"/>
+              </w:rPr>
+              <w:t>3</w:t>
+            </w:r>
+          </w:p>
+        </w:tc>
+        <w:tc>
+          <w:tcPr>
+            <w:tcW w:type="dxa" w:w="1680"/>
+            <w:shd w:fill="FFFFFF"/>
+            <w:tcMar>
+              <w:top w:w="70" w:type="dxa"/>
+              <w:bottom w:w="70" w:type="dxa"/>
+              <w:left w:w="90" w:type="dxa"/>
+              <w:right w:w="90" w:type="dxa"/>
+            </w:tcMar>
+          </w:tcPr>
+          <w:p>
+            <w:r>
+              <w:rPr>
+                <w:rFonts w:ascii="Segoe UI" w:hAnsi="Segoe UI"/>
+                <w:sz w:val="17"/>
+              </w:rPr>
+              <w:t>Cotton (Kapas)</w:t>
+            </w:r>
+          </w:p>
+        </w:tc>
+        <w:tc>
+          <w:tcPr>
+            <w:tcW w:type="dxa" w:w="1680"/>
+            <w:shd w:fill="FFFFFF"/>
+            <w:tcMar>
+              <w:top w:w="70" w:type="dxa"/>
+              <w:bottom w:w="70" w:type="dxa"/>
+              <w:left w:w="90" w:type="dxa"/>
+              <w:right w:w="90" w:type="dxa"/>
+            </w:tcMar>
+          </w:tcPr>
+          <w:p>
+            <w:r>
+              <w:rPr>
+                <w:rFonts w:ascii="Segoe UI" w:hAnsi="Segoe UI"/>
+                <w:sz w:val="17"/>
+              </w:rPr>
+              <w:t>Sirsa, Fatehabad, Hisar, Bhiwani, Charkhi Dadri</w:t>
+            </w:r>
+          </w:p>
+        </w:tc>
+        <w:tc>
+          <w:tcPr>
+            <w:tcW w:type="dxa" w:w="1680"/>
+            <w:shd w:fill="FFFFFF"/>
+            <w:tcMar>
+              <w:top w:w="70" w:type="dxa"/>
+              <w:bottom w:w="70" w:type="dxa"/>
+              <w:left w:w="90" w:type="dxa"/>
+              <w:right w:w="90" w:type="dxa"/>
+            </w:tcMar>
+          </w:tcPr>
+          <w:p>
+            <w:r>
+              <w:rPr>
+                <w:rFonts w:ascii="Segoe UI" w:hAnsi="Segoe UI"/>
+                <w:sz w:val="17"/>
+              </w:rPr>
+              <w:t>Diseased Leaf, Fresh Leaf, Diseased Plant, Fresh Plant (4 classes)</w:t>
+            </w:r>
+          </w:p>
+        </w:tc>
+        <w:tc>
+          <w:tcPr>
+            <w:tcW w:type="dxa" w:w="1680"/>
+            <w:shd w:fill="FFFFFF"/>
+            <w:tcMar>
+              <w:top w:w="70" w:type="dxa"/>
+              <w:bottom w:w="70" w:type="dxa"/>
+              <w:left w:w="90" w:type="dxa"/>
+              <w:right w:w="90" w:type="dxa"/>
+            </w:tcMar>
+          </w:tcPr>
+          <w:p>
+            <w:r>
+              <w:rPr>
+                <w:rFonts w:ascii="Segoe UI" w:hAnsi="Segoe UI"/>
+                <w:sz w:val="17"/>
+              </w:rPr>
+              <w:t>38.2s</w:t>
+            </w:r>
+          </w:p>
+        </w:tc>
+        <w:tc>
+          <w:tcPr>
+            <w:tcW w:type="dxa" w:w="1680"/>
+            <w:shd w:fill="FFFFFF"/>
+            <w:tcMar>
+              <w:top w:w="70" w:type="dxa"/>
+              <w:bottom w:w="70" w:type="dxa"/>
+              <w:left w:w="90" w:type="dxa"/>
+              <w:right w:w="90" w:type="dxa"/>
+            </w:tcMar>
+          </w:tcPr>
+          <w:p>
+            <w:r>
+              <w:rPr>
+                <w:rFonts w:ascii="Segoe UI" w:hAnsi="Segoe UI"/>
+                <w:b/>
+                <w:color w:val="081C15"/>
+                <w:sz w:val="17"/>
+              </w:rPr>
+              <w:t>99.36%</w:t>
+            </w:r>
+          </w:p>
+        </w:tc>
+      </w:tr>
+      <w:tr>
+        <w:tc>
+          <w:tcPr>
+            <w:tcW w:type="dxa" w:w="1680"/>
+            <w:shd w:fill="F8F9FA"/>
+            <w:tcMar>
+              <w:top w:w="70" w:type="dxa"/>
+              <w:bottom w:w="70" w:type="dxa"/>
+              <w:left w:w="90" w:type="dxa"/>
+              <w:right w:w="90" w:type="dxa"/>
+            </w:tcMar>
+          </w:tcPr>
+          <w:p>
+            <w:r>
+              <w:rPr>
+                <w:rFonts w:ascii="Segoe UI" w:hAnsi="Segoe UI"/>
+                <w:b/>
+                <w:sz w:val="17"/>
+              </w:rPr>
+              <w:t>4</w:t>
+            </w:r>
+          </w:p>
+        </w:tc>
+        <w:tc>
+          <w:tcPr>
+            <w:tcW w:type="dxa" w:w="1680"/>
+            <w:shd w:fill="F8F9FA"/>
+            <w:tcMar>
+              <w:top w:w="70" w:type="dxa"/>
+              <w:bottom w:w="70" w:type="dxa"/>
+              <w:left w:w="90" w:type="dxa"/>
+              <w:right w:w="90" w:type="dxa"/>
+            </w:tcMar>
+          </w:tcPr>
+          <w:p>
+            <w:r>
+              <w:rPr>
+                <w:rFonts w:ascii="Segoe UI" w:hAnsi="Segoe UI"/>
+                <w:sz w:val="17"/>
+              </w:rPr>
+              <w:t>Sugarcane (Ganna)</w:t>
+            </w:r>
+          </w:p>
+        </w:tc>
+        <w:tc>
+          <w:tcPr>
+            <w:tcW w:type="dxa" w:w="1680"/>
+            <w:shd w:fill="F8F9FA"/>
+            <w:tcMar>
+              <w:top w:w="70" w:type="dxa"/>
+              <w:bottom w:w="70" w:type="dxa"/>
+              <w:left w:w="90" w:type="dxa"/>
+              <w:right w:w="90" w:type="dxa"/>
+            </w:tcMar>
+          </w:tcPr>
+          <w:p>
+            <w:r>
+              <w:rPr>
+                <w:rFonts w:ascii="Segoe UI" w:hAnsi="Segoe UI"/>
+                <w:sz w:val="17"/>
+              </w:rPr>
+              <w:t>Yamunanagar, Karnal, Panipat, Sonipat, Ambala, Kaithal</w:t>
+            </w:r>
+          </w:p>
+        </w:tc>
+        <w:tc>
+          <w:tcPr>
+            <w:tcW w:type="dxa" w:w="1680"/>
+            <w:shd w:fill="F8F9FA"/>
+            <w:tcMar>
+              <w:top w:w="70" w:type="dxa"/>
+              <w:bottom w:w="70" w:type="dxa"/>
+              <w:left w:w="90" w:type="dxa"/>
+              <w:right w:w="90" w:type="dxa"/>
+            </w:tcMar>
+          </w:tcPr>
+          <w:p>
+            <w:r>
+              <w:rPr>
+                <w:rFonts w:ascii="Segoe UI" w:hAnsi="Segoe UI"/>
+                <w:sz w:val="17"/>
+              </w:rPr>
+              <w:t>Red Rot, Mosaic, Rust, Yellow Leaf, Healthy (5 classes)</w:t>
+            </w:r>
+          </w:p>
+        </w:tc>
+        <w:tc>
+          <w:tcPr>
+            <w:tcW w:type="dxa" w:w="1680"/>
+            <w:shd w:fill="F8F9FA"/>
+            <w:tcMar>
+              <w:top w:w="70" w:type="dxa"/>
+              <w:bottom w:w="70" w:type="dxa"/>
+              <w:left w:w="90" w:type="dxa"/>
+              <w:right w:w="90" w:type="dxa"/>
+            </w:tcMar>
+          </w:tcPr>
+          <w:p>
+            <w:r>
+              <w:rPr>
+                <w:rFonts w:ascii="Segoe UI" w:hAnsi="Segoe UI"/>
+                <w:sz w:val="17"/>
+              </w:rPr>
+              <w:t>79.3s</w:t>
+            </w:r>
+          </w:p>
+        </w:tc>
+        <w:tc>
+          <w:tcPr>
+            <w:tcW w:type="dxa" w:w="1680"/>
+            <w:shd w:fill="F8F9FA"/>
+            <w:tcMar>
+              <w:top w:w="70" w:type="dxa"/>
+              <w:bottom w:w="70" w:type="dxa"/>
+              <w:left w:w="90" w:type="dxa"/>
+              <w:right w:w="90" w:type="dxa"/>
+            </w:tcMar>
+          </w:tcPr>
+          <w:p>
+            <w:r>
+              <w:rPr>
+                <w:rFonts w:ascii="Segoe UI" w:hAnsi="Segoe UI"/>
+                <w:b/>
+                <w:color w:val="081C15"/>
+                <w:sz w:val="17"/>
+              </w:rPr>
+              <w:t>95.75%</w:t>
+            </w:r>
+          </w:p>
+        </w:tc>
+      </w:tr>
+      <w:tr>
+        <w:tc>
+          <w:tcPr>
+            <w:tcW w:type="dxa" w:w="1680"/>
+            <w:shd w:fill="FFFFFF"/>
+            <w:tcMar>
+              <w:top w:w="70" w:type="dxa"/>
+              <w:bottom w:w="70" w:type="dxa"/>
+              <w:left w:w="90" w:type="dxa"/>
+              <w:right w:w="90" w:type="dxa"/>
+            </w:tcMar>
+          </w:tcPr>
+          <w:p>
+            <w:r>
+              <w:rPr>
+                <w:rFonts w:ascii="Segoe UI" w:hAnsi="Segoe UI"/>
+                <w:b/>
+                <w:sz w:val="17"/>
+              </w:rPr>
+              <w:t>5</w:t>
+            </w:r>
+          </w:p>
+        </w:tc>
+        <w:tc>
+          <w:tcPr>
+            <w:tcW w:type="dxa" w:w="1680"/>
+            <w:shd w:fill="FFFFFF"/>
+            <w:tcMar>
+              <w:top w:w="70" w:type="dxa"/>
+              <w:bottom w:w="70" w:type="dxa"/>
+              <w:left w:w="90" w:type="dxa"/>
+              <w:right w:w="90" w:type="dxa"/>
+            </w:tcMar>
+          </w:tcPr>
+          <w:p>
+            <w:r>
+              <w:rPr>
+                <w:rFonts w:ascii="Segoe UI" w:hAnsi="Segoe UI"/>
+                <w:sz w:val="17"/>
+              </w:rPr>
+              <w:t>Corn / Maize (Makka)</w:t>
+            </w:r>
+          </w:p>
+        </w:tc>
+        <w:tc>
+          <w:tcPr>
+            <w:tcW w:type="dxa" w:w="1680"/>
+            <w:shd w:fill="FFFFFF"/>
+            <w:tcMar>
+              <w:top w:w="70" w:type="dxa"/>
+              <w:bottom w:w="70" w:type="dxa"/>
+              <w:left w:w="90" w:type="dxa"/>
+              <w:right w:w="90" w:type="dxa"/>
+            </w:tcMar>
+          </w:tcPr>
+          <w:p>
+            <w:r>
+              <w:rPr>
+                <w:rFonts w:ascii="Segoe UI" w:hAnsi="Segoe UI"/>
+                <w:sz w:val="17"/>
+              </w:rPr>
+              <w:t>Panchkula, Ambala, Yamunanagar, Karnal, Sonipat</w:t>
+            </w:r>
+          </w:p>
+        </w:tc>
+        <w:tc>
+          <w:tcPr>
+            <w:tcW w:type="dxa" w:w="1680"/>
+            <w:shd w:fill="FFFFFF"/>
+            <w:tcMar>
+              <w:top w:w="70" w:type="dxa"/>
+              <w:bottom w:w="70" w:type="dxa"/>
+              <w:left w:w="90" w:type="dxa"/>
+              <w:right w:w="90" w:type="dxa"/>
+            </w:tcMar>
+          </w:tcPr>
+          <w:p>
+            <w:r>
+              <w:rPr>
+                <w:rFonts w:ascii="Segoe UI" w:hAnsi="Segoe UI"/>
+                <w:sz w:val="17"/>
+              </w:rPr>
+              <w:t>Northern Leaf Blight, Healthy (2 classes)</w:t>
+            </w:r>
+          </w:p>
+        </w:tc>
+        <w:tc>
+          <w:tcPr>
+            <w:tcW w:type="dxa" w:w="1680"/>
+            <w:shd w:fill="FFFFFF"/>
+            <w:tcMar>
+              <w:top w:w="70" w:type="dxa"/>
+              <w:bottom w:w="70" w:type="dxa"/>
+              <w:left w:w="90" w:type="dxa"/>
+              <w:right w:w="90" w:type="dxa"/>
+            </w:tcMar>
+          </w:tcPr>
+          <w:p>
+            <w:r>
+              <w:rPr>
+                <w:rFonts w:ascii="Segoe UI" w:hAnsi="Segoe UI"/>
+                <w:sz w:val="17"/>
+              </w:rPr>
+              <w:t>14.6s</w:t>
+            </w:r>
+          </w:p>
+        </w:tc>
+        <w:tc>
+          <w:tcPr>
+            <w:tcW w:type="dxa" w:w="1680"/>
+            <w:shd w:fill="FFFFFF"/>
+            <w:tcMar>
+              <w:top w:w="70" w:type="dxa"/>
+              <w:bottom w:w="70" w:type="dxa"/>
+              <w:left w:w="90" w:type="dxa"/>
+              <w:right w:w="90" w:type="dxa"/>
+            </w:tcMar>
+          </w:tcPr>
+          <w:p>
+            <w:r>
+              <w:rPr>
+                <w:rFonts w:ascii="Segoe UI" w:hAnsi="Segoe UI"/>
+                <w:b/>
+                <w:color w:val="081C15"/>
+                <w:sz w:val="17"/>
+              </w:rPr>
+              <w:t>86.88%</w:t>
+            </w:r>
+          </w:p>
+        </w:tc>
+      </w:tr>
+      <w:tr>
+        <w:tc>
+          <w:tcPr>
+            <w:tcW w:type="dxa" w:w="1680"/>
+            <w:shd w:fill="F8F9FA"/>
+            <w:tcMar>
+              <w:top w:w="70" w:type="dxa"/>
+              <w:bottom w:w="70" w:type="dxa"/>
+              <w:left w:w="90" w:type="dxa"/>
+              <w:right w:w="90" w:type="dxa"/>
+            </w:tcMar>
+          </w:tcPr>
+          <w:p>
+            <w:r>
+              <w:rPr>
+                <w:rFonts w:ascii="Segoe UI" w:hAnsi="Segoe UI"/>
+                <w:b/>
+                <w:sz w:val="17"/>
+              </w:rPr>
+              <w:t>6</w:t>
+            </w:r>
+          </w:p>
+        </w:tc>
+        <w:tc>
+          <w:tcPr>
+            <w:tcW w:type="dxa" w:w="1680"/>
+            <w:shd w:fill="F8F9FA"/>
+            <w:tcMar>
+              <w:top w:w="70" w:type="dxa"/>
+              <w:bottom w:w="70" w:type="dxa"/>
+              <w:left w:w="90" w:type="dxa"/>
+              <w:right w:w="90" w:type="dxa"/>
+            </w:tcMar>
+          </w:tcPr>
+          <w:p>
+            <w:r>
+              <w:rPr>
+                <w:rFonts w:ascii="Segoe UI" w:hAnsi="Segoe UI"/>
+                <w:sz w:val="17"/>
+              </w:rPr>
+              <w:t>Vegetables &amp; Tubers</w:t>
+            </w:r>
+          </w:p>
+        </w:tc>
+        <w:tc>
+          <w:tcPr>
+            <w:tcW w:type="dxa" w:w="1680"/>
+            <w:shd w:fill="F8F9FA"/>
+            <w:tcMar>
+              <w:top w:w="70" w:type="dxa"/>
+              <w:bottom w:w="70" w:type="dxa"/>
+              <w:left w:w="90" w:type="dxa"/>
+              <w:right w:w="90" w:type="dxa"/>
+            </w:tcMar>
+          </w:tcPr>
+          <w:p>
+            <w:r>
+              <w:rPr>
+                <w:rFonts w:ascii="Segoe UI" w:hAnsi="Segoe UI"/>
+                <w:sz w:val="17"/>
+              </w:rPr>
+              <w:t>Sonipat, Karnal, Kurukshetra, Jhajjar, Palwal, Rohtak</w:t>
+            </w:r>
+          </w:p>
+        </w:tc>
+        <w:tc>
+          <w:tcPr>
+            <w:tcW w:type="dxa" w:w="1680"/>
+            <w:shd w:fill="F8F9FA"/>
+            <w:tcMar>
+              <w:top w:w="70" w:type="dxa"/>
+              <w:bottom w:w="70" w:type="dxa"/>
+              <w:left w:w="90" w:type="dxa"/>
+              <w:right w:w="90" w:type="dxa"/>
+            </w:tcMar>
+          </w:tcPr>
+          <w:p>
+            <w:r>
+              <w:rPr>
+                <w:rFonts w:ascii="Segoe UI" w:hAnsi="Segoe UI"/>
+                <w:sz w:val="17"/>
+              </w:rPr>
+              <w:t>Tomato (10), Potato (3), Pepper Bell (2) (15 classes)</w:t>
+            </w:r>
+          </w:p>
+        </w:tc>
+        <w:tc>
+          <w:tcPr>
+            <w:tcW w:type="dxa" w:w="1680"/>
+            <w:shd w:fill="F8F9FA"/>
+            <w:tcMar>
+              <w:top w:w="70" w:type="dxa"/>
+              <w:bottom w:w="70" w:type="dxa"/>
+              <w:left w:w="90" w:type="dxa"/>
+              <w:right w:w="90" w:type="dxa"/>
+            </w:tcMar>
+          </w:tcPr>
+          <w:p>
+            <w:r>
+              <w:rPr>
+                <w:rFonts w:ascii="Segoe UI" w:hAnsi="Segoe UI"/>
+                <w:sz w:val="17"/>
+              </w:rPr>
+              <w:t>43.1s</w:t>
+            </w:r>
+          </w:p>
+        </w:tc>
+        <w:tc>
+          <w:tcPr>
+            <w:tcW w:type="dxa" w:w="1680"/>
+            <w:shd w:fill="F8F9FA"/>
+            <w:tcMar>
+              <w:top w:w="70" w:type="dxa"/>
+              <w:bottom w:w="70" w:type="dxa"/>
+              <w:left w:w="90" w:type="dxa"/>
+              <w:right w:w="90" w:type="dxa"/>
+            </w:tcMar>
+          </w:tcPr>
+          <w:p>
+            <w:r>
+              <w:rPr>
+                <w:rFonts w:ascii="Segoe UI" w:hAnsi="Segoe UI"/>
+                <w:b/>
+                <w:color w:val="081C15"/>
+                <w:sz w:val="17"/>
+              </w:rPr>
+              <w:t>96.00%</w:t>
+            </w:r>
+          </w:p>
+        </w:tc>
+      </w:tr>
+      <w:tr>
+        <w:tc>
+          <w:tcPr>
+            <w:tcW w:type="dxa" w:w="1680"/>
+            <w:shd w:fill="D8F3DC"/>
+            <w:tcMar>
+              <w:top w:w="70" w:type="dxa"/>
+              <w:bottom w:w="70" w:type="dxa"/>
+              <w:left w:w="90" w:type="dxa"/>
+              <w:right w:w="90" w:type="dxa"/>
+            </w:tcMar>
+          </w:tcPr>
+          <w:p>
+            <w:r>
+              <w:rPr>
+                <w:rFonts w:ascii="Segoe UI" w:hAnsi="Segoe UI"/>
+                <w:b/>
+                <w:sz w:val="17"/>
+              </w:rPr>
+              <w:t>Master</w:t>
+            </w:r>
+          </w:p>
+        </w:tc>
+        <w:tc>
+          <w:tcPr>
+            <w:tcW w:type="dxa" w:w="1680"/>
+            <w:shd w:fill="D8F3DC"/>
+            <w:tcMar>
+              <w:top w:w="70" w:type="dxa"/>
+              <w:bottom w:w="70" w:type="dxa"/>
+              <w:left w:w="90" w:type="dxa"/>
+              <w:right w:w="90" w:type="dxa"/>
+            </w:tcMar>
+          </w:tcPr>
+          <w:p>
+            <w:r>
+              <w:rPr>
+                <w:rFonts w:ascii="Segoe UI" w:hAnsi="Segoe UI"/>
+                <w:b/>
+                <w:sz w:val="17"/>
+              </w:rPr>
+              <w:t>Unified All-Crops</w:t>
+            </w:r>
+          </w:p>
+        </w:tc>
+        <w:tc>
+          <w:tcPr>
+            <w:tcW w:type="dxa" w:w="1680"/>
+            <w:shd w:fill="D8F3DC"/>
+            <w:tcMar>
+              <w:top w:w="70" w:type="dxa"/>
+              <w:bottom w:w="70" w:type="dxa"/>
+              <w:left w:w="90" w:type="dxa"/>
+              <w:right w:w="90" w:type="dxa"/>
+            </w:tcMar>
+          </w:tcPr>
+          <w:p>
+            <w:r>
+              <w:rPr>
+                <w:rFonts w:ascii="Segoe UI" w:hAnsi="Segoe UI"/>
+                <w:b/>
+                <w:sz w:val="17"/>
+              </w:rPr>
+              <w:t>All 22 Haryana Districts Combined</w:t>
+            </w:r>
+          </w:p>
+        </w:tc>
+        <w:tc>
+          <w:tcPr>
+            <w:tcW w:type="dxa" w:w="1680"/>
+            <w:shd w:fill="D8F3DC"/>
+            <w:tcMar>
+              <w:top w:w="70" w:type="dxa"/>
+              <w:bottom w:w="70" w:type="dxa"/>
+              <w:left w:w="90" w:type="dxa"/>
+              <w:right w:w="90" w:type="dxa"/>
+            </w:tcMar>
+          </w:tcPr>
+          <w:p>
+            <w:r>
+              <w:rPr>
+                <w:rFonts w:ascii="Segoe UI" w:hAnsi="Segoe UI"/>
+                <w:b/>
+                <w:sz w:val="17"/>
+              </w:rPr>
+              <w:t>All 33 Pathological &amp; Botanical Conditions Combined</w:t>
+            </w:r>
+          </w:p>
+        </w:tc>
+        <w:tc>
+          <w:tcPr>
+            <w:tcW w:type="dxa" w:w="1680"/>
+            <w:shd w:fill="D8F3DC"/>
+            <w:tcMar>
+              <w:top w:w="70" w:type="dxa"/>
+              <w:bottom w:w="70" w:type="dxa"/>
+              <w:left w:w="90" w:type="dxa"/>
+              <w:right w:w="90" w:type="dxa"/>
+            </w:tcMar>
+          </w:tcPr>
+          <w:p>
+            <w:r>
+              <w:rPr>
+                <w:rFonts w:ascii="Segoe UI" w:hAnsi="Segoe UI"/>
+                <w:b/>
+                <w:sz w:val="17"/>
+              </w:rPr>
+              <w:t>251.2s</w:t>
+            </w:r>
+          </w:p>
+        </w:tc>
+        <w:tc>
+          <w:tcPr>
+            <w:tcW w:type="dxa" w:w="1680"/>
+            <w:shd w:fill="D8F3DC"/>
+            <w:tcMar>
+              <w:top w:w="70" w:type="dxa"/>
+              <w:bottom w:w="70" w:type="dxa"/>
+              <w:left w:w="90" w:type="dxa"/>
+              <w:right w:w="90" w:type="dxa"/>
+            </w:tcMar>
+          </w:tcPr>
+          <w:p>
+            <w:r>
+              <w:rPr>
+                <w:rFonts w:ascii="Segoe UI" w:hAnsi="Segoe UI"/>
+                <w:b/>
+                <w:color w:val="081C15"/>
+                <w:sz w:val="17"/>
+              </w:rPr>
+              <w:t>95.11%</w:t>
             </w:r>
           </w:p>
         </w:tc>

</xml_diff>

<commit_message>
feat(haryana): implement 100% offline-first Haryana block agronomy, micro-dialects, SQLite persistence, and mobile service
</commit_message>
<xml_diff>
--- a/AgriVision_Plant_Disease_Detection_Guide.docx
+++ b/AgriVision_Plant_Disease_Detection_Guide.docx
@@ -10438,6 +10438,382 @@
         </w:tc>
       </w:tr>
     </w:tbl>
+    <w:p>
+      <w:pPr>
+        <w:pStyle w:val="Heading1"/>
+      </w:pPr>
+      <w:r>
+        <w:t>9. Haryana Offline-First Block Agronomy, Micro-Dialects &amp; CCS HAU Prescriptions</w:t>
+      </w:r>
+    </w:p>
+    <w:p>
+      <w:r>
+        <w:t>To empower marginal and smallholder farmers across rural Haryana without requiring continuous cellular connectivity, AgriVision incorporates a dedicated 100% Offline-First Micro-Regional Agronomy Database. This system directly bridges linguistic and diagnostic barriers right at the farm gate.</w:t>
+      </w:r>
+    </w:p>
+    <w:p>
+      <w:pPr>
+        <w:pStyle w:val="Heading2"/>
+      </w:pPr>
+      <w:r>
+        <w:t>A. Technical Architecture &amp; Edge Delivery</w:t>
+      </w:r>
+    </w:p>
+    <w:p>
+      <w:r>
+        <w:t>1. On-Device SQLite Engine (data/agrivision.db):</w:t>
+        <w:br/>
+        <w:t xml:space="preserve">   - Table 'haryana_offline_agronomy' persists 30 representative administrative blocks across all 22 districts.</w:t>
+        <w:br/>
+        <w:t xml:space="preserve">   - Zero network overhead; queries run synchronously in sub-millisecond execution times.</w:t>
+        <w:br/>
+        <w:br/>
+        <w:t>2. Embedded Mobile JSON Bundle (mobile/agrivision_app/assets/haryana_offline_blocks.json):</w:t>
+        <w:br/>
+        <w:t xml:space="preserve">   - Packaged directly within the offline Flutter APK/AAB bundle.</w:t>
+        <w:br/>
+        <w:t xml:space="preserve">   - Read offline via rootBundle through OfflineAgronomyService with in-memory fast indexing.</w:t>
+        <w:br/>
+        <w:br/>
+        <w:t>3. FastAPI Edge Services (app/server.py):</w:t>
+        <w:br/>
+        <w:t xml:space="preserve">   - Endpoints /api/haryana/offline-blocks, /api/haryana/offline-blocks/{district}/{block}, and /api/haryana/offline-triage serve low-latency cached agronomic payloads.</w:t>
+      </w:r>
+    </w:p>
+    <w:p>
+      <w:pPr>
+        <w:pStyle w:val="Heading2"/>
+      </w:pPr>
+      <w:r>
+        <w:t>B. Micro-Regional Linguistic Dialects Mapping</w:t>
+      </w:r>
+    </w:p>
+    <w:tbl>
+      <w:tblPr>
+        <w:tblW w:type="auto" w:w="0"/>
+        <w:tblLayout w:type="fixed"/>
+        <w:tblLook w:firstColumn="1" w:firstRow="1" w:lastColumn="0" w:lastRow="0" w:noHBand="0" w:noVBand="1" w:val="04A0"/>
+      </w:tblPr>
+      <w:tblGrid>
+        <w:gridCol w:w="3360"/>
+        <w:gridCol w:w="3360"/>
+        <w:gridCol w:w="3360"/>
+      </w:tblGrid>
+      <w:tr>
+        <w:tc>
+          <w:tcPr>
+            <w:tcW w:type="dxa" w:w="3360"/>
+            <w:shd w:val="clear" w:color="auto" w:fill="2E7D32"/>
+          </w:tcPr>
+          <w:p>
+            <w:r>
+              <w:rPr>
+                <w:b/>
+                <w:color w:val="FFFFFF"/>
+              </w:rPr>
+              <w:t>Regional Zone</w:t>
+            </w:r>
+          </w:p>
+        </w:tc>
+        <w:tc>
+          <w:tcPr>
+            <w:tcW w:type="dxa" w:w="3360"/>
+            <w:shd w:val="clear" w:color="auto" w:fill="2E7D32"/>
+          </w:tcPr>
+          <w:p>
+            <w:r>
+              <w:rPr>
+                <w:b/>
+                <w:color w:val="FFFFFF"/>
+              </w:rPr>
+              <w:t>Linguistic Dialect</w:t>
+            </w:r>
+          </w:p>
+        </w:tc>
+        <w:tc>
+          <w:tcPr>
+            <w:tcW w:type="dxa" w:w="3360"/>
+            <w:shd w:val="clear" w:color="auto" w:fill="2E7D32"/>
+          </w:tcPr>
+          <w:p>
+            <w:r>
+              <w:rPr>
+                <w:b/>
+                <w:color w:val="FFFFFF"/>
+              </w:rPr>
+              <w:t>Districts &amp; Administrative Blocks Covered</w:t>
+            </w:r>
+          </w:p>
+        </w:tc>
+      </w:tr>
+      <w:tr>
+        <w:tc>
+          <w:tcPr>
+            <w:tcW w:type="dxa" w:w="3360"/>
+            <w:shd w:val="clear" w:color="auto" w:fill="F1F8E9"/>
+          </w:tcPr>
+          <w:p>
+            <w:r>
+              <w:t>North-East Belt</w:t>
+            </w:r>
+          </w:p>
+        </w:tc>
+        <w:tc>
+          <w:tcPr>
+            <w:tcW w:type="dxa" w:w="3360"/>
+            <w:shd w:val="clear" w:color="auto" w:fill="F1F8E9"/>
+          </w:tcPr>
+          <w:p>
+            <w:r>
+              <w:t>Puadhi</w:t>
+            </w:r>
+          </w:p>
+        </w:tc>
+        <w:tc>
+          <w:tcPr>
+            <w:tcW w:type="dxa" w:w="3360"/>
+            <w:shd w:val="clear" w:color="auto" w:fill="F1F8E9"/>
+          </w:tcPr>
+          <w:p>
+            <w:r>
+              <w:t>Ambala (Naraingarh, Barara), Yamunanagar (Bilaspur, Jagadhri), Panchkula (Raipur Rani), Kurukshetra (Shahabad)</w:t>
+            </w:r>
+          </w:p>
+        </w:tc>
+      </w:tr>
+      <w:tr>
+        <w:tc>
+          <w:tcPr>
+            <w:tcW w:type="dxa" w:w="3360"/>
+          </w:tcPr>
+          <w:p>
+            <w:r>
+              <w:t>Khadar / Yamuna Belt</w:t>
+            </w:r>
+          </w:p>
+        </w:tc>
+        <w:tc>
+          <w:tcPr>
+            <w:tcW w:type="dxa" w:w="3360"/>
+          </w:tcPr>
+          <w:p>
+            <w:r>
+              <w:t>Bangru / Khadar Haryanvi</w:t>
+            </w:r>
+          </w:p>
+        </w:tc>
+        <w:tc>
+          <w:tcPr>
+            <w:tcW w:type="dxa" w:w="3360"/>
+          </w:tcPr>
+          <w:p>
+            <w:r>
+              <w:t>Karnal (Gharaunda, Assandh), Panipat (Samalkha), Sonipat (Gohana), Kaithal (Guhla)</w:t>
+            </w:r>
+          </w:p>
+        </w:tc>
+      </w:tr>
+      <w:tr>
+        <w:tc>
+          <w:tcPr>
+            <w:tcW w:type="dxa" w:w="3360"/>
+            <w:shd w:val="clear" w:color="auto" w:fill="F1F8E9"/>
+          </w:tcPr>
+          <w:p>
+            <w:r>
+              <w:t>Central Plains</w:t>
+            </w:r>
+          </w:p>
+        </w:tc>
+        <w:tc>
+          <w:tcPr>
+            <w:tcW w:type="dxa" w:w="3360"/>
+            <w:shd w:val="clear" w:color="auto" w:fill="F1F8E9"/>
+          </w:tcPr>
+          <w:p>
+            <w:r>
+              <w:t>Deshwali Haryanvi</w:t>
+            </w:r>
+          </w:p>
+        </w:tc>
+        <w:tc>
+          <w:tcPr>
+            <w:tcW w:type="dxa" w:w="3360"/>
+            <w:shd w:val="clear" w:color="auto" w:fill="F1F8E9"/>
+          </w:tcPr>
+          <w:p>
+            <w:r>
+              <w:t>Rohtak (Sampla, Meham), Jhajjar (Bahadurgarh, Beri), Jind (Safidon, Narwana)</w:t>
+            </w:r>
+          </w:p>
+        </w:tc>
+      </w:tr>
+      <w:tr>
+        <w:tc>
+          <w:tcPr>
+            <w:tcW w:type="dxa" w:w="3360"/>
+          </w:tcPr>
+          <w:p>
+            <w:r>
+              <w:t>Western Cotton Belt</w:t>
+            </w:r>
+          </w:p>
+        </w:tc>
+        <w:tc>
+          <w:tcPr>
+            <w:tcW w:type="dxa" w:w="3360"/>
+          </w:tcPr>
+          <w:p>
+            <w:r>
+              <w:t>Bagri</w:t>
+            </w:r>
+          </w:p>
+        </w:tc>
+        <w:tc>
+          <w:tcPr>
+            <w:tcW w:type="dxa" w:w="3360"/>
+          </w:tcPr>
+          <w:p>
+            <w:r>
+              <w:t>Sirsa (Sirsa, Ellenabad, Dabwali), Fatehabad (Tohana), Hisar (Adampur, Hansi), Bhiwani (Siwani, Tosham)</w:t>
+            </w:r>
+          </w:p>
+        </w:tc>
+      </w:tr>
+      <w:tr>
+        <w:tc>
+          <w:tcPr>
+            <w:tcW w:type="dxa" w:w="3360"/>
+            <w:shd w:val="clear" w:color="auto" w:fill="F1F8E9"/>
+          </w:tcPr>
+          <w:p>
+            <w:r>
+              <w:t>Southern Ahirwal Belt</w:t>
+            </w:r>
+          </w:p>
+        </w:tc>
+        <w:tc>
+          <w:tcPr>
+            <w:tcW w:type="dxa" w:w="3360"/>
+            <w:shd w:val="clear" w:color="auto" w:fill="F1F8E9"/>
+          </w:tcPr>
+          <w:p>
+            <w:r>
+              <w:t>Ahirwati (Raathi)</w:t>
+            </w:r>
+          </w:p>
+        </w:tc>
+        <w:tc>
+          <w:tcPr>
+            <w:tcW w:type="dxa" w:w="3360"/>
+            <w:shd w:val="clear" w:color="auto" w:fill="F1F8E9"/>
+          </w:tcPr>
+          <w:p>
+            <w:r>
+              <w:t>Mahendragarh (Narnaul), Rewari (Bawal, Kosli), Charkhi Dadri (Badhra), Gurugram (Pataudi)</w:t>
+            </w:r>
+          </w:p>
+        </w:tc>
+      </w:tr>
+      <w:tr>
+        <w:tc>
+          <w:tcPr>
+            <w:tcW w:type="dxa" w:w="3360"/>
+          </w:tcPr>
+          <w:p>
+            <w:r>
+              <w:t>Mewat Micro-Region</w:t>
+            </w:r>
+          </w:p>
+        </w:tc>
+        <w:tc>
+          <w:tcPr>
+            <w:tcW w:type="dxa" w:w="3360"/>
+          </w:tcPr>
+          <w:p>
+            <w:r>
+              <w:t>Mewati</w:t>
+            </w:r>
+          </w:p>
+        </w:tc>
+        <w:tc>
+          <w:tcPr>
+            <w:tcW w:type="dxa" w:w="3360"/>
+          </w:tcPr>
+          <w:p>
+            <w:r>
+              <w:t>Nuh (Nuh, Taoru, Ferozepur Jhirka, Punahana)</w:t>
+            </w:r>
+          </w:p>
+        </w:tc>
+      </w:tr>
+      <w:tr>
+        <w:tc>
+          <w:tcPr>
+            <w:tcW w:type="dxa" w:w="3360"/>
+            <w:shd w:val="clear" w:color="auto" w:fill="F1F8E9"/>
+          </w:tcPr>
+          <w:p>
+            <w:r>
+              <w:t>Braj Fringe</w:t>
+            </w:r>
+          </w:p>
+        </w:tc>
+        <w:tc>
+          <w:tcPr>
+            <w:tcW w:type="dxa" w:w="3360"/>
+            <w:shd w:val="clear" w:color="auto" w:fill="F1F8E9"/>
+          </w:tcPr>
+          <w:p>
+            <w:r>
+              <w:t>Braj</w:t>
+            </w:r>
+          </w:p>
+        </w:tc>
+        <w:tc>
+          <w:tcPr>
+            <w:tcW w:type="dxa" w:w="3360"/>
+            <w:shd w:val="clear" w:color="auto" w:fill="F1F8E9"/>
+          </w:tcPr>
+          <w:p>
+            <w:r>
+              <w:t>Palwal (Hodal, Hathin), Ballabgarh / Faridabad fringe</w:t>
+            </w:r>
+          </w:p>
+        </w:tc>
+      </w:tr>
+    </w:tbl>
+    <w:p/>
+    <w:p>
+      <w:pPr>
+        <w:pStyle w:val="Heading2"/>
+      </w:pPr>
+      <w:r>
+        <w:t>C. Vernacular Crop Taxonomy &amp; Linear Diagnostic Chains</w:t>
+      </w:r>
+    </w:p>
+    <w:p>
+      <w:r>
+        <w:t>Crop profiles utilize authentic local vernacular terms (Dhan, Gehu, Sarson, Gwar, Kapas, Makka, Aloo, Tamatar) alongside scientific botanical taxonomy to support voice readout and mobile audio accessibility.</w:t>
+        <w:br/>
+        <w:br/>
+        <w:t>Each block features a linear diagnostic chain (Step 1 -&gt; Step 2 -&gt; Step 3) allowing farmers to visually self-triage diseases offline:</w:t>
+        <w:br/>
+        <w:t>• Karnal (Rice Bacterial Blight): Leaf tips turn water-soaked -&gt; Lesions turn yellow-white with wavy margins along veins -&gt; Bacterial ooze droplets visible in early morning -&gt; Leaves wilt and dry (Kresek symptom).</w:t>
+        <w:br/>
+        <w:t xml:space="preserve">  - CCS HAU Approved Solution: Copper Oxychloride 50% WP @ 500 g + Streptocycline @ 6 g in 200 L water per acre.</w:t>
+        <w:br/>
+        <w:br/>
+        <w:t>• Sirsa (Cotton Pink Bollworm): Rosetted flowers that fail to open -&gt; Larvae bore into tender bolls -&gt; Bolls open prematurely with stained lint and damaged seeds.</w:t>
+        <w:br/>
+        <w:t xml:space="preserve">  - CCS HAU Approved Solution: Emamectin Benzoate 5% SG @ 100 g or Spinetoram 11.7% SC @ 170 ml in 200 L water per acre at ETL.</w:t>
+        <w:br/>
+        <w:br/>
+        <w:t>• Nuh (Mustard Alternaria Blight): Concentric target-board brown circular spots on leaves -&gt; Black lesions on siliquae (pods) -&gt; Premature pod shattering.</w:t>
+        <w:br/>
+        <w:t xml:space="preserve">  - CCS HAU Approved Solution: Mancozeb 75% WP @ 600-800 g or Iprodione 50% WP @ 400 g in 200 L water per acre.</w:t>
+      </w:r>
+    </w:p>
     <w:sectPr>
       <w:pgSz w:w="12240" w:h="15840"/>
       <w:pgMar w:top="1080" w:right="1080" w:bottom="1080" w:left="1080" w:header="720" w:footer="720" w:gutter="0"/>

</xml_diff>